<commit_message>
Draft_014 revised: QR left alone; Legend+Coding on own page; Full on next
- Original Quick-Reference untouched on its page
- Legend + Combined Example + Coding Sheet Columns moved to a new page and compressed to fit
- Full Codebook starts on the following new page
- Intro updated
</commit_message>
<xml_diff>
--- a/thesis/003_ThesisProposal_Draft_014.docx
+++ b/thesis/003_ThesisProposal_Draft_014.docx
@@ -9998,57 +9998,671 @@
       </w:pPr>
       <w:r>
         <w:rPr/>
-        <w:t xml:space="preserve">This appendix is the full coding protocol used for the study. It opens with a one-page quick-reference (hedge types, functions, core decision rules, color legend, and coding-sheet columns presented together), then continues with the operational layers, decision rules, false-positive categories, and recording conventions on the following page.</w:t>
+        <w:t xml:space="preserve">This appendix is the full coding protocol used for the study. It opens with a one-page quick-reference, then a one-page legend and coding-sheet section, then the operational layers, decision rules, false-positive categories, and recording conventions.</w:t>
+      </w:r>
+    </w:p>
+    <w:p>
+      <w:pPr>
+        <w:keepNext w:val="1"/>
+        <w:spacing w:before="120" w:after="120" w:line="240" w:lineRule="auto"/>
+        <w:ind w:firstLine="720"/>
+        <w:jc w:val="left"/>
+        <w:rPr/>
+      </w:pPr>
+      <w:r>
+        <w:rPr>
+          <w:rFonts w:ascii="Georgia" w:cs="Georgia" w:eastAsia="Georgia" w:hAnsi="Georgia"/>
+          <w:b w:val="1"/>
+          <w:bCs w:val="1"/>
+          <w:sz w:val="24"/>
+          <w:szCs w:val="24"/>
+          <w:rtl w:val="0"/>
+        </w:rPr>
+        <w:t xml:space="preserve">QUICK-REFERENCE</w:t>
+      </w:r>
+      <w:r>
+        <w:rPr>
+          <w:rtl w:val="0"/>
+        </w:rPr>
+      </w:r>
+    </w:p>
+    <w:p>
+      <w:pPr>
+        <w:spacing w:before="0" w:after="0" w:line="240" w:lineRule="auto"/>
+        <w:jc w:val="both"/>
+        <w:rPr/>
+      </w:pPr>
+      <w:r>
+        <w:rPr>
+          <w:rFonts w:ascii="Georgia" w:cs="Georgia" w:eastAsia="Georgia" w:hAnsi="Georgia"/>
+          <w:b w:val="0"/>
+          <w:bCs w:val="0"/>
+          <w:sz w:val="22"/>
+          <w:szCs w:val="22"/>
+          <w:rtl w:val="0"/>
+        </w:rPr>
+        <w:t xml:space="preserve">Coding is context-sensitive. A word is a hedge only when it functions as one in the sentence, not because it appears on a list.</w:t>
+      </w:r>
+      <w:r>
+        <w:rPr>
+          <w:rtl w:val="0"/>
+        </w:rPr>
+      </w:r>
+    </w:p>
+    <w:p>
+      <w:pPr>
+        <w:keepNext w:val="1"/>
+        <w:spacing w:before="120" w:after="0" w:line="240" w:lineRule="auto"/>
+        <w:jc w:val="left"/>
+        <w:rPr/>
+      </w:pPr>
+      <w:r>
+        <w:rPr>
+          <w:rFonts w:ascii="Georgia" w:cs="Georgia" w:eastAsia="Georgia" w:hAnsi="Georgia"/>
+          <w:b w:val="1"/>
+          <w:bCs w:val="1"/>
+          <w:sz w:val="24"/>
+          <w:szCs w:val="24"/>
+          <w:rtl w:val="0"/>
+        </w:rPr>
+        <w:t xml:space="preserve">Hedge types</w:t>
+      </w:r>
+      <w:r>
+        <w:rPr>
+          <w:rtl w:val="0"/>
+        </w:rPr>
+      </w:r>
+    </w:p>
+    <w:p>
+      <w:pPr>
+        <w:spacing w:before="0" w:after="0" w:line="240" w:lineRule="auto"/>
+        <w:ind w:left="240" w:firstLine="0"/>
+        <w:jc w:val="both"/>
+        <w:rPr/>
+      </w:pPr>
+      <w:r>
+        <w:rPr>
+          <w:rFonts w:ascii="Georgia" w:cs="Georgia" w:eastAsia="Georgia" w:hAnsi="Georgia"/>
+          <w:b w:val="0"/>
+          <w:bCs w:val="0"/>
+          <w:sz w:val="22"/>
+          <w:szCs w:val="22"/>
+          <w:rtl w:val="0"/>
+        </w:rPr>
+        <w:t xml:space="preserve">1. Modal verbs: may, might, could, would, should, can (when they mark possibility, not capability or obligation).</w:t>
+      </w:r>
+      <w:r>
+        <w:rPr>
+          <w:rtl w:val="0"/>
+        </w:rPr>
+      </w:r>
+    </w:p>
+    <w:p>
+      <w:pPr>
+        <w:spacing w:before="0" w:after="0" w:line="240" w:lineRule="auto"/>
+        <w:ind w:left="240" w:firstLine="0"/>
+        <w:jc w:val="both"/>
+        <w:rPr/>
+      </w:pPr>
+      <w:r>
+        <w:rPr>
+          <w:rFonts w:ascii="Georgia" w:cs="Georgia" w:eastAsia="Georgia" w:hAnsi="Georgia"/>
+          <w:b w:val="0"/>
+          <w:bCs w:val="0"/>
+          <w:sz w:val="22"/>
+          <w:szCs w:val="22"/>
+          <w:rtl w:val="0"/>
+        </w:rPr>
+        <w:t xml:space="preserve">2. Lexical hedges: suggest, indicate, appear, seem, propose, assume, possible, probable, likely, potential (and similar epistemic adjectives or nouns) when they qualify the certainty of a claim and pass the Working Test.</w:t>
+      </w:r>
+      <w:r>
+        <w:rPr>
+          <w:rtl w:val="0"/>
+        </w:rPr>
+      </w:r>
+    </w:p>
+    <w:p>
+      <w:pPr>
+        <w:spacing w:before="0" w:after="0" w:line="240" w:lineRule="auto"/>
+        <w:ind w:left="240" w:firstLine="0"/>
+        <w:jc w:val="both"/>
+        <w:rPr/>
+      </w:pPr>
+      <w:r>
+        <w:rPr>
+          <w:rFonts w:ascii="Georgia" w:cs="Georgia" w:eastAsia="Georgia" w:hAnsi="Georgia"/>
+          <w:b w:val="0"/>
+          <w:bCs w:val="0"/>
+          <w:sz w:val="22"/>
+          <w:szCs w:val="22"/>
+          <w:rtl w:val="0"/>
+        </w:rPr>
+        <w:t xml:space="preserve">3. Adverbial hedges: generally, typically, possibly, probably, relatively, essentially (when they qualify scope or certainty, not procedural routine).</w:t>
+      </w:r>
+      <w:r>
+        <w:rPr>
+          <w:rtl w:val="0"/>
+        </w:rPr>
+      </w:r>
+    </w:p>
+    <w:p>
+      <w:pPr>
+        <w:spacing w:before="0" w:after="0" w:line="240" w:lineRule="auto"/>
+        <w:ind w:left="240" w:firstLine="0"/>
+        <w:jc w:val="both"/>
+        <w:rPr/>
+      </w:pPr>
+      <w:r>
+        <w:rPr>
+          <w:rFonts w:ascii="Georgia" w:cs="Georgia" w:eastAsia="Georgia" w:hAnsi="Georgia"/>
+          <w:b w:val="0"/>
+          <w:bCs w:val="0"/>
+          <w:sz w:val="22"/>
+          <w:szCs w:val="22"/>
+          <w:rtl w:val="0"/>
+        </w:rPr>
+        <w:t xml:space="preserve">4. Clause-level hedges: it seems that, it is possible that, to some extent, in our view.</w:t>
+      </w:r>
+      <w:r>
+        <w:rPr>
+          <w:rtl w:val="0"/>
+        </w:rPr>
+      </w:r>
+    </w:p>
+    <w:p>
+      <w:pPr>
+        <w:keepNext w:val="1"/>
+        <w:spacing w:before="120" w:after="0" w:line="240" w:lineRule="auto"/>
+        <w:ind w:firstLine="720"/>
+        <w:jc w:val="left"/>
+        <w:rPr/>
+      </w:pPr>
+      <w:r>
+        <w:rPr>
+          <w:rFonts w:ascii="Georgia" w:cs="Georgia" w:eastAsia="Georgia" w:hAnsi="Georgia"/>
+          <w:b w:val="1"/>
+          <w:bCs w:val="1"/>
+          <w:sz w:val="24"/>
+          <w:szCs w:val="24"/>
+          <w:rtl w:val="0"/>
+        </w:rPr>
+        <w:t xml:space="preserve">Hedge functions</w:t>
+      </w:r>
+      <w:r>
+        <w:rPr>
+          <w:rtl w:val="0"/>
+        </w:rPr>
+      </w:r>
+    </w:p>
+    <w:p>
+      <w:pPr>
+        <w:spacing w:before="0" w:after="0" w:line="240" w:lineRule="auto"/>
+        <w:ind w:left="240" w:firstLine="720"/>
+        <w:jc w:val="both"/>
+        <w:rPr/>
+      </w:pPr>
+      <w:r>
+        <w:rPr>
+          <w:rFonts w:ascii="Georgia" w:cs="Georgia" w:eastAsia="Georgia" w:hAnsi="Georgia"/>
+          <w:b w:val="0"/>
+          <w:bCs w:val="0"/>
+          <w:sz w:val="22"/>
+          <w:szCs w:val="22"/>
+          <w:rtl w:val="0"/>
+        </w:rPr>
+        <w:t xml:space="preserve">Epistemic Caution: marks uncertainty about whether a claim is true (e.g., The treatment may reduce infection rates).</w:t>
+      </w:r>
+      <w:r>
+        <w:rPr>
+          <w:rtl w:val="0"/>
+        </w:rPr>
+      </w:r>
+    </w:p>
+    <w:p>
+      <w:pPr>
+        <w:spacing w:before="0" w:after="0" w:line="240" w:lineRule="auto"/>
+        <w:ind w:left="240" w:firstLine="720"/>
+        <w:jc w:val="both"/>
+        <w:rPr/>
+      </w:pPr>
+      <w:r>
+        <w:rPr>
+          <w:rFonts w:ascii="Georgia" w:cs="Georgia" w:eastAsia="Georgia" w:hAnsi="Georgia"/>
+          <w:b w:val="0"/>
+          <w:bCs w:val="0"/>
+          <w:sz w:val="22"/>
+          <w:szCs w:val="22"/>
+          <w:rtl w:val="0"/>
+        </w:rPr>
+        <w:t xml:space="preserve">Politeness / Deference: softens face threat or shows respect rather than genuine doubt (e.g., As suggested by Hyland…).</w:t>
+      </w:r>
+      <w:r>
+        <w:rPr>
+          <w:rtl w:val="0"/>
+        </w:rPr>
+      </w:r>
+    </w:p>
+    <w:p>
+      <w:pPr>
+        <w:spacing w:before="0" w:after="0" w:line="240" w:lineRule="auto"/>
+        <w:ind w:left="240" w:firstLine="0"/>
+        <w:jc w:val="both"/>
+        <w:rPr/>
+      </w:pPr>
+      <w:r>
+        <w:rPr>
+          <w:rFonts w:ascii="Georgia" w:cs="Georgia" w:eastAsia="Georgia" w:hAnsi="Georgia"/>
+          <w:b w:val="0"/>
+          <w:bCs w:val="0"/>
+          <w:sz w:val="22"/>
+          <w:szCs w:val="22"/>
+          <w:rtl w:val="0"/>
+        </w:rPr>
+        <w:t xml:space="preserve">Discourse Organization: manages text structure or reader expectations rather than stance (e.g., It should be noted that…).</w:t>
+      </w:r>
+      <w:r>
+        <w:rPr>
+          <w:rtl w:val="0"/>
+        </w:rPr>
+      </w:r>
+    </w:p>
+    <w:p>
+      <w:pPr>
+        <w:keepNext w:val="1"/>
+        <w:spacing w:before="120" w:after="0" w:line="240" w:lineRule="auto"/>
+        <w:ind w:firstLine="720"/>
+        <w:jc w:val="left"/>
+        <w:rPr/>
+      </w:pPr>
+      <w:r>
+        <w:rPr>
+          <w:rFonts w:ascii="Georgia" w:cs="Georgia" w:eastAsia="Georgia" w:hAnsi="Georgia"/>
+          <w:b w:val="1"/>
+          <w:bCs w:val="1"/>
+          <w:sz w:val="24"/>
+          <w:szCs w:val="24"/>
+          <w:rtl w:val="0"/>
+        </w:rPr>
+        <w:t xml:space="preserve">Core decision rules</w:t>
+      </w:r>
+      <w:r>
+        <w:rPr>
+          <w:rtl w:val="0"/>
+        </w:rPr>
+      </w:r>
+    </w:p>
+    <w:p>
+      <w:pPr>
+        <w:spacing w:before="0" w:after="0" w:line="240" w:lineRule="auto"/>
+        <w:ind w:left="240" w:firstLine="720"/>
+        <w:jc w:val="both"/>
+        <w:rPr/>
+      </w:pPr>
+      <w:r>
+        <w:rPr>
+          <w:rFonts w:ascii="Georgia" w:cs="Cardo" w:eastAsia="Cardo" w:hAnsi="Georgia"/>
+          <w:sz w:val="24"/>
+          <w:szCs w:val="24"/>
+          <w:rtl w:val="0"/>
+          <w:i/>
+          <w:iCs/>
+        </w:rPr>
+        <w:t xml:space="preserve">suggest / indicate → hedge when introducing a finding; not a hedge when introducing a recommendation.</w:t>
+      </w:r>
+      <w:r>
+        <w:rPr>
+          <w:rtl w:val="0"/>
+          <w:rFonts w:ascii="Georgia" w:hAnsi="Georgia"/>
+          <w:sz w:val="24"/>
+          <w:szCs w:val="24"/>
+          <w:i/>
+          <w:iCs/>
+        </w:rPr>
+      </w:r>
+    </w:p>
+    <w:p>
+      <w:pPr>
+        <w:spacing w:before="0" w:after="0" w:line="240" w:lineRule="auto"/>
+        <w:ind w:left="240" w:firstLine="720"/>
+        <w:jc w:val="both"/>
+        <w:rPr/>
+      </w:pPr>
+      <w:r>
+        <w:rPr>
+          <w:rFonts w:ascii="Georgia" w:cs="Cardo" w:eastAsia="Cardo" w:hAnsi="Georgia"/>
+          <w:sz w:val="24"/>
+          <w:szCs w:val="24"/>
+          <w:rtl w:val="0"/>
+          <w:i/>
+          <w:iCs/>
+        </w:rPr>
+        <w:t xml:space="preserve">can / may → hedge when marking possibility; not a hedge when marking capability.</w:t>
+      </w:r>
+      <w:r>
+        <w:rPr>
+          <w:rtl w:val="0"/>
+          <w:rFonts w:ascii="Georgia" w:hAnsi="Georgia"/>
+          <w:sz w:val="24"/>
+          <w:szCs w:val="24"/>
+          <w:i/>
+          <w:iCs/>
+        </w:rPr>
+      </w:r>
+    </w:p>
+    <w:p>
+      <w:pPr>
+        <w:spacing w:before="0" w:after="0" w:line="240" w:lineRule="auto"/>
+        <w:ind w:left="240" w:firstLine="720"/>
+        <w:jc w:val="both"/>
+        <w:rPr/>
+      </w:pPr>
+      <w:r>
+        <w:rPr>
+          <w:rFonts w:ascii="Georgia" w:cs="Cardo" w:eastAsia="Cardo" w:hAnsi="Georgia"/>
+          <w:sz w:val="24"/>
+          <w:szCs w:val="24"/>
+          <w:rtl w:val="0"/>
+          <w:i/>
+          <w:iCs/>
+        </w:rPr>
+        <w:t xml:space="preserve">generally / typically → hedge when limiting the scope of a claim; not a hedge when describing a procedural norm.</w:t>
+      </w:r>
+      <w:r>
+        <w:rPr>
+          <w:rtl w:val="0"/>
+          <w:rFonts w:ascii="Georgia" w:hAnsi="Georgia"/>
+          <w:sz w:val="24"/>
+          <w:szCs w:val="24"/>
+          <w:i/>
+          <w:iCs/>
+        </w:rPr>
+      </w:r>
+    </w:p>
+    <w:p>
+      <w:pPr>
+        <w:spacing w:before="0" w:after="0" w:line="240" w:lineRule="auto"/>
+        <w:ind w:left="240" w:firstLine="0"/>
+        <w:jc w:val="both"/>
+        <w:rPr/>
+      </w:pPr>
+      <w:r>
+        <w:rPr>
+          <w:rFonts w:ascii="Georgia" w:cs="Cardo" w:eastAsia="Cardo" w:hAnsi="Georgia"/>
+          <w:sz w:val="24"/>
+          <w:szCs w:val="24"/>
+          <w:rtl w:val="0"/>
+          <w:i/>
+          <w:iCs/>
+        </w:rPr>
+        <w:t xml:space="preserve">appear / seem → hedge when expressing uncertainty about a result; not a hedge when pointing to location in a table or text.</w:t>
+      </w:r>
+      <w:r>
+        <w:rPr>
+          <w:rtl w:val="0"/>
+          <w:rFonts w:ascii="Georgia" w:hAnsi="Georgia"/>
+          <w:sz w:val="24"/>
+          <w:szCs w:val="24"/>
+          <w:i/>
+          <w:iCs/>
+        </w:rPr>
+      </w:r>
+    </w:p>
+    <w:p>
+      <w:pPr>
+        <w:keepNext w:val="1"/>
+        <w:spacing w:before="120" w:after="0" w:line="240" w:lineRule="auto"/>
+        <w:ind w:firstLine="720"/>
+        <w:jc w:val="left"/>
+        <w:rPr/>
+      </w:pPr>
+      <w:r>
+        <w:rPr>
+          <w:rFonts w:ascii="Georgia" w:cs="Georgia" w:eastAsia="Georgia" w:hAnsi="Georgia"/>
+          <w:b w:val="1"/>
+          <w:bCs w:val="1"/>
+          <w:sz w:val="24"/>
+          <w:szCs w:val="24"/>
+          <w:rtl w:val="0"/>
+        </w:rPr>
+        <w:t xml:space="preserve">Exclusion and Working Test</w:t>
+      </w:r>
+      <w:r>
+        <w:rPr>
+          <w:rtl w:val="0"/>
+        </w:rPr>
+      </w:r>
+    </w:p>
+    <w:p>
+      <w:pPr>
+        <w:spacing w:before="0" w:after="0" w:line="240" w:lineRule="auto"/>
+        <w:jc w:val="both"/>
+        <w:rPr/>
+      </w:pPr>
+      <w:r>
+        <w:rPr>
+          <w:rFonts w:ascii="Georgia" w:cs="Georgia" w:eastAsia="Georgia" w:hAnsi="Georgia"/>
+          <w:b w:val="0"/>
+          <w:bCs w:val="0"/>
+          <w:sz w:val="22"/>
+          <w:szCs w:val="22"/>
+          <w:rtl w:val="0"/>
+        </w:rPr>
+        <w:t xml:space="preserve">Ability, future procedure, and necessity (must / should in procedural contexts) are never hedges. Working Test: if removing the device does not change how certain or tentative the claim is, it is not a hedge.</w:t>
+      </w:r>
+      <w:r>
+        <w:rPr>
+          <w:rtl w:val="0"/>
+        </w:rPr>
+      </w:r>
+    </w:p>
+    <w:p>
+      <w:pPr/>
+      <w:r>
+        <w:br w:type="page"/>
+      </w:r>
+    </w:p>
+    <w:p>
+      <w:pPr>
+        <w:keepNext w:val="1"/>
+        <w:spacing w:before="0" w:after="40" w:line="200" w:lineRule="auto"/>
+        <w:jc w:val="left"/>
+        <w:rPr/>
+      </w:pPr>
+      <w:r>
+        <w:rPr>
+          <w:rFonts w:ascii="Georgia" w:cs="Georgia" w:eastAsia="Georgia" w:hAnsi="Georgia"/>
+          <w:b w:val="1"/>
+          <w:bCs w:val="1"/>
+          <w:i w:val="0"/>
+          <w:iCs w:val="0"/>
+          <w:sz w:val="16"/>
+          <w:szCs w:val="16"/>
+          <w:rtl w:val="0"/>
+        </w:rPr>
+        <w:t xml:space="preserve">QUICK-REFERENCE LEGEND</w:t>
+      </w:r>
+      <w:r>
+        <w:rPr>
+          <w:rtl w:val="0"/>
+          <w:sz w:val="16"/>
+          <w:szCs w:val="16"/>
+        </w:rPr>
+      </w:r>
+    </w:p>
+    <w:p>
+      <w:pPr>
+        <w:keepNext w:val="1"/>
+        <w:keepLines w:val="1"/>
+        <w:spacing w:before="0" w:after="40" w:line="200" w:lineRule="auto"/>
+        <w:ind w:firstLine="720"/>
+        <w:jc w:val="both"/>
+        <w:rPr/>
+      </w:pPr>
+      <w:r>
+        <w:rPr>
+          <w:rFonts w:ascii="Georgia" w:cs="Georgia" w:eastAsia="Georgia" w:hAnsi="Georgia"/>
+          <w:b w:val="0"/>
+          <w:bCs w:val="0"/>
+          <w:i w:val="0"/>
+          <w:iCs w:val="0"/>
+          <w:sz w:val="16"/>
+          <w:szCs w:val="16"/>
+          <w:rtl w:val="0"/>
+        </w:rPr>
+        <w:t xml:space="preserve">Colors are backgrounds applied with a highlighter directly on the abstract text, not font colors.</w:t>
+      </w:r>
+      <w:r>
+        <w:rPr>
+          <w:rtl w:val="0"/>
+          <w:sz w:val="16"/>
+          <w:szCs w:val="16"/>
+        </w:rPr>
       </w:r>
     </w:p>
     <w:tbl>
       <w:tblPr>
-        <w:tblW w:w="5000" w:type="pct"/>
+        <w:tblStyle w:val="Table11"/>
+        <w:tblW w:w="8306.0" w:type="dxa"/>
+        <w:jc w:val="left"/>
+        <w:tblInd w:w="-40.0" w:type="dxa"/>
         <w:tblBorders>
-          <w:top w:val="nil"/>
-          <w:left w:val="nil"/>
-          <w:bottom w:val="nil"/>
-          <w:right w:val="nil"/>
-          <w:insideH w:val="nil"/>
-          <w:insideV w:val="nil"/>
+          <w:top w:color="000000" w:space="0" w:sz="18" w:val="single"/>
+          <w:left w:color="000000" w:space="0" w:sz="0" w:val="nil"/>
+          <w:bottom w:color="000000" w:space="0" w:sz="18" w:val="single"/>
+          <w:right w:color="000000" w:space="0" w:sz="0" w:val="nil"/>
+          <w:insideH w:color="000000" w:space="0" w:sz="0" w:val="nil"/>
+          <w:insideV w:color="000000" w:space="0" w:sz="0" w:val="nil"/>
         </w:tblBorders>
+        <w:tblLayout w:type="fixed"/>
+        <w:tblLook w:val="0400"/>
       </w:tblPr>
       <w:tblGrid>
-        <w:gridCol w:w="2500"/>
-        <w:gridCol w:w="2500"/>
+        <w:gridCol w:w="4153"/>
+        <w:gridCol w:w="4153"/>
+        <w:tblGridChange w:id="0">
+          <w:tblGrid>
+            <w:gridCol w:w="4153"/>
+            <w:gridCol w:w="4153"/>
+          </w:tblGrid>
+        </w:tblGridChange>
       </w:tblGrid>
       <w:tr>
+        <w:trPr>
+          <w:cantSplit w:val="1"/>
+          <w:tblHeader w:val="1"/>
+        </w:trPr>
         <w:tc>
           <w:tcPr>
-            <w:tcW w:w="2500" w:type="pct"/>
+            <w:tcBorders>
+              <w:bottom w:color="000000" w:space="0" w:sz="4" w:val="single"/>
+            </w:tcBorders>
+            <w:shd w:fill="f2f4f6" w:val="clear"/>
           </w:tcPr>
           <w:p>
             <w:pPr>
-              <w:keepNext w:val="1"/>
               <w:spacing w:before="0" w:after="40" w:line="200" w:lineRule="auto"/>
-              <w:ind w:firstLine="720"/>
-              <w:jc w:val="left"/>
-              <w:rPr>
-                <w:sz w:val="16"/>
-                <w:szCs w:val="16"/>
-              </w:rPr>
+              <w:jc w:val="both"/>
+              <w:rPr/>
             </w:pPr>
             <w:r>
               <w:rPr>
                 <w:rFonts w:ascii="Georgia" w:cs="Georgia" w:eastAsia="Georgia" w:hAnsi="Georgia"/>
                 <w:b w:val="1"/>
                 <w:bCs w:val="1"/>
-                <w:sz w:val="16"/>
-                <w:szCs w:val="16"/>
-                <w:rtl w:val="0"/>
-              </w:rPr>
-              <w:t xml:space="preserve">QUICK-REFERENCE</w:t>
-            </w:r>
-            <w:r>
-              <w:rPr>
-                <w:rtl w:val="0"/>
-                <w:sz w:val="16"/>
-                <w:szCs w:val="16"/>
+                <w:sz w:val="14"/>
+                <w:szCs w:val="14"/>
+                <w:rtl w:val="0"/>
+              </w:rPr>
+              <w:t xml:space="preserve">TYPE (Highlight)</w:t>
+            </w:r>
+            <w:r>
+              <w:rPr>
+                <w:rtl w:val="0"/>
+                <w:sz w:val="14"/>
+                <w:szCs w:val="14"/>
+                <w:rFonts w:ascii="Georgia" w:hAnsi="Georgia"/>
+              </w:rPr>
+            </w:r>
+          </w:p>
+        </w:tc>
+        <w:tc>
+          <w:tcPr>
+            <w:tcBorders>
+              <w:bottom w:color="000000" w:space="0" w:sz="4" w:val="single"/>
+            </w:tcBorders>
+            <w:shd w:fill="f2f4f6" w:val="clear"/>
+          </w:tcPr>
+          <w:p>
+            <w:pPr>
+              <w:spacing w:before="0" w:after="40" w:line="200" w:lineRule="auto"/>
+              <w:jc w:val="both"/>
+              <w:rPr/>
+            </w:pPr>
+            <w:r>
+              <w:rPr>
+                <w:rFonts w:ascii="Georgia" w:cs="Georgia" w:eastAsia="Georgia" w:hAnsi="Georgia"/>
+                <w:b w:val="1"/>
+                <w:bCs w:val="1"/>
+                <w:sz w:val="14"/>
+                <w:szCs w:val="14"/>
+                <w:rtl w:val="0"/>
+              </w:rPr>
+              <w:t xml:space="preserve">FUNCTION (Text)</w:t>
+            </w:r>
+            <w:r>
+              <w:rPr>
+                <w:rtl w:val="0"/>
+                <w:sz w:val="14"/>
+                <w:szCs w:val="14"/>
+                <w:rFonts w:ascii="Georgia" w:hAnsi="Georgia"/>
+              </w:rPr>
+            </w:r>
+          </w:p>
+        </w:tc>
+      </w:tr>
+      <w:tr>
+        <w:trPr>
+          <w:cantSplit w:val="1"/>
+          <w:tblHeader w:val="0"/>
+        </w:trPr>
+        <w:tc>
+          <w:tcPr/>
+          <w:p>
+            <w:pPr>
+              <w:spacing w:before="0" w:after="40" w:line="200" w:lineRule="auto"/>
+              <w:jc w:val="both"/>
+              <w:rPr/>
+            </w:pPr>
+            <w:r>
+              <w:rPr>
+                <w:rFonts w:ascii="Georgia" w:cs="Georgia" w:eastAsia="Georgia" w:hAnsi="Georgia"/>
+                <w:sz w:val="14"/>
+                <w:szCs w:val="14"/>
+                <w:shd w:fill="00b0f0" w:val="clear"/>
+                <w:rtl w:val="0"/>
+              </w:rPr>
+              <w:t xml:space="preserve">      </w:t>
+            </w:r>
+            <w:r>
+              <w:rPr>
+                <w:rFonts w:ascii="Georgia" w:cs="Georgia" w:eastAsia="Georgia" w:hAnsi="Georgia"/>
+                <w:b w:val="0"/>
+                <w:bCs w:val="0"/>
+                <w:i w:val="0"/>
+                <w:iCs w:val="0"/>
+                <w:color w:val="000000"/>
+                <w:sz w:val="14"/>
+                <w:szCs w:val="14"/>
+                <w:rtl w:val="0"/>
+              </w:rPr>
+              <w:t xml:space="preserve">  Modal Verbs</w:t>
+            </w:r>
+            <w:r>
+              <w:rPr>
+                <w:rtl w:val="0"/>
+                <w:sz w:val="14"/>
+                <w:szCs w:val="14"/>
+                <w:rFonts w:ascii="Georgia" w:hAnsi="Georgia"/>
               </w:rPr>
             </w:r>
           </w:p>
@@ -10056,477 +10670,38 @@
             <w:pPr>
               <w:spacing w:before="0" w:after="40" w:line="200" w:lineRule="auto"/>
               <w:jc w:val="both"/>
-              <w:rPr>
-                <w:sz w:val="16"/>
-                <w:szCs w:val="16"/>
-              </w:rPr>
+              <w:rPr/>
             </w:pPr>
+            <w:r>
+              <w:rPr>
+                <w:rFonts w:ascii="Georgia" w:cs="Georgia" w:eastAsia="Georgia" w:hAnsi="Georgia"/>
+                <w:sz w:val="14"/>
+                <w:szCs w:val="14"/>
+                <w:highlight w:val="red"/>
+                <w:rtl w:val="0"/>
+              </w:rPr>
+              <w:t xml:space="preserve">      </w:t>
+            </w:r>
             <w:r>
               <w:rPr>
                 <w:rFonts w:ascii="Georgia" w:cs="Georgia" w:eastAsia="Georgia" w:hAnsi="Georgia"/>
                 <w:b w:val="0"/>
                 <w:bCs w:val="0"/>
-                <w:sz w:val="16"/>
-                <w:szCs w:val="16"/>
-                <w:rtl w:val="0"/>
-              </w:rPr>
-              <w:t xml:space="preserve">Coding is context-sensitive. A word is a hedge only when it functions as one in the sentence, not because it appears on a list.</w:t>
-            </w:r>
-            <w:r>
-              <w:rPr>
-                <w:rtl w:val="0"/>
-                <w:sz w:val="16"/>
-                <w:szCs w:val="16"/>
-              </w:rPr>
-            </w:r>
-          </w:p>
-          <w:p>
-            <w:pPr>
-              <w:keepNext w:val="1"/>
-              <w:spacing w:before="0" w:after="40" w:line="200" w:lineRule="auto"/>
-              <w:jc w:val="left"/>
-              <w:rPr>
-                <w:sz w:val="16"/>
-                <w:szCs w:val="16"/>
-              </w:rPr>
-            </w:pPr>
-            <w:r>
-              <w:rPr>
-                <w:rFonts w:ascii="Georgia" w:cs="Georgia" w:eastAsia="Georgia" w:hAnsi="Georgia"/>
-                <w:b w:val="1"/>
-                <w:bCs w:val="1"/>
-                <w:sz w:val="16"/>
-                <w:szCs w:val="16"/>
-                <w:rtl w:val="0"/>
-              </w:rPr>
-              <w:t xml:space="preserve">Hedge types</w:t>
-            </w:r>
-            <w:r>
-              <w:rPr>
-                <w:rtl w:val="0"/>
-                <w:sz w:val="16"/>
-                <w:szCs w:val="16"/>
-              </w:rPr>
-            </w:r>
-          </w:p>
-          <w:p>
-            <w:pPr>
-              <w:spacing w:before="0" w:after="40" w:line="200" w:lineRule="auto"/>
-              <w:ind w:left="240" w:firstLine="0"/>
-              <w:jc w:val="both"/>
-              <w:rPr>
-                <w:sz w:val="16"/>
-                <w:szCs w:val="16"/>
-              </w:rPr>
-            </w:pPr>
-            <w:r>
-              <w:rPr>
-                <w:rFonts w:ascii="Georgia" w:cs="Georgia" w:eastAsia="Georgia" w:hAnsi="Georgia"/>
-                <w:b w:val="0"/>
-                <w:bCs w:val="0"/>
-                <w:sz w:val="16"/>
-                <w:szCs w:val="16"/>
-                <w:rtl w:val="0"/>
-              </w:rPr>
-              <w:t xml:space="preserve">1. Modal verbs: may, might, could, would, should, can (when they mark possibility, not capability or obligation).</w:t>
-            </w:r>
-            <w:r>
-              <w:rPr>
-                <w:rtl w:val="0"/>
-                <w:sz w:val="16"/>
-                <w:szCs w:val="16"/>
-              </w:rPr>
-            </w:r>
-          </w:p>
-          <w:p>
-            <w:pPr>
-              <w:spacing w:before="0" w:after="40" w:line="200" w:lineRule="auto"/>
-              <w:ind w:left="240" w:firstLine="0"/>
-              <w:jc w:val="both"/>
-              <w:rPr>
-                <w:sz w:val="16"/>
-                <w:szCs w:val="16"/>
-              </w:rPr>
-            </w:pPr>
-            <w:r>
-              <w:rPr>
-                <w:rFonts w:ascii="Georgia" w:cs="Georgia" w:eastAsia="Georgia" w:hAnsi="Georgia"/>
-                <w:b w:val="0"/>
-                <w:bCs w:val="0"/>
-                <w:sz w:val="16"/>
-                <w:szCs w:val="16"/>
-                <w:rtl w:val="0"/>
-              </w:rPr>
-              <w:t xml:space="preserve">2. Lexical hedges: suggest, indicate, appear, seem, propose, assume, possible, probable, likely, potential (and similar epistemic adjectives or nouns) when they qualify the certainty of a claim and pass the Working Test.</w:t>
-            </w:r>
-            <w:r>
-              <w:rPr>
-                <w:rtl w:val="0"/>
-                <w:sz w:val="16"/>
-                <w:szCs w:val="16"/>
-              </w:rPr>
-            </w:r>
-          </w:p>
-          <w:p>
-            <w:pPr>
-              <w:spacing w:before="0" w:after="40" w:line="200" w:lineRule="auto"/>
-              <w:ind w:left="240" w:firstLine="0"/>
-              <w:jc w:val="both"/>
-              <w:rPr>
-                <w:sz w:val="16"/>
-                <w:szCs w:val="16"/>
-              </w:rPr>
-            </w:pPr>
-            <w:r>
-              <w:rPr>
-                <w:rFonts w:ascii="Georgia" w:cs="Georgia" w:eastAsia="Georgia" w:hAnsi="Georgia"/>
-                <w:b w:val="0"/>
-                <w:bCs w:val="0"/>
-                <w:sz w:val="16"/>
-                <w:szCs w:val="16"/>
-                <w:rtl w:val="0"/>
-              </w:rPr>
-              <w:t xml:space="preserve">3. Adverbial hedges: generally, typically, possibly, probably, relatively, essentially (when they qualify scope or certainty, not procedural routine).</w:t>
-            </w:r>
-            <w:r>
-              <w:rPr>
-                <w:rtl w:val="0"/>
-                <w:sz w:val="16"/>
-                <w:szCs w:val="16"/>
-              </w:rPr>
-            </w:r>
-          </w:p>
-          <w:p>
-            <w:pPr>
-              <w:spacing w:before="0" w:after="40" w:line="200" w:lineRule="auto"/>
-              <w:ind w:left="240" w:firstLine="0"/>
-              <w:jc w:val="both"/>
-              <w:rPr>
-                <w:sz w:val="16"/>
-                <w:szCs w:val="16"/>
-              </w:rPr>
-            </w:pPr>
-            <w:r>
-              <w:rPr>
-                <w:rFonts w:ascii="Georgia" w:cs="Georgia" w:eastAsia="Georgia" w:hAnsi="Georgia"/>
-                <w:b w:val="0"/>
-                <w:bCs w:val="0"/>
-                <w:sz w:val="16"/>
-                <w:szCs w:val="16"/>
-                <w:rtl w:val="0"/>
-              </w:rPr>
-              <w:t xml:space="preserve">4. Clause-level hedges: it seems that, it is possible that, to some extent, in our view.</w:t>
-            </w:r>
-            <w:r>
-              <w:rPr>
-                <w:rtl w:val="0"/>
-                <w:sz w:val="16"/>
-                <w:szCs w:val="16"/>
-              </w:rPr>
-            </w:r>
-          </w:p>
-          <w:p>
-            <w:pPr>
-              <w:keepNext w:val="1"/>
-              <w:spacing w:before="0" w:after="40" w:line="200" w:lineRule="auto"/>
-              <w:ind w:firstLine="720"/>
-              <w:jc w:val="left"/>
-              <w:rPr>
-                <w:sz w:val="16"/>
-                <w:szCs w:val="16"/>
-              </w:rPr>
-            </w:pPr>
-            <w:r>
-              <w:rPr>
-                <w:rFonts w:ascii="Georgia" w:cs="Georgia" w:eastAsia="Georgia" w:hAnsi="Georgia"/>
-                <w:b w:val="1"/>
-                <w:bCs w:val="1"/>
-                <w:sz w:val="16"/>
-                <w:szCs w:val="16"/>
-                <w:rtl w:val="0"/>
-              </w:rPr>
-              <w:t xml:space="preserve">Hedge functions</w:t>
-            </w:r>
-            <w:r>
-              <w:rPr>
-                <w:rtl w:val="0"/>
-                <w:sz w:val="16"/>
-                <w:szCs w:val="16"/>
-              </w:rPr>
-            </w:r>
-          </w:p>
-          <w:p>
-            <w:pPr>
-              <w:spacing w:before="0" w:after="40" w:line="200" w:lineRule="auto"/>
-              <w:ind w:left="240" w:firstLine="720"/>
-              <w:jc w:val="both"/>
-              <w:rPr>
-                <w:sz w:val="16"/>
-                <w:szCs w:val="16"/>
-              </w:rPr>
-            </w:pPr>
-            <w:r>
-              <w:rPr>
-                <w:rFonts w:ascii="Georgia" w:cs="Georgia" w:eastAsia="Georgia" w:hAnsi="Georgia"/>
-                <w:b w:val="0"/>
-                <w:bCs w:val="0"/>
-                <w:sz w:val="16"/>
-                <w:szCs w:val="16"/>
-                <w:rtl w:val="0"/>
-              </w:rPr>
-              <w:t xml:space="preserve">Epistemic Caution: marks uncertainty about whether a claim is true (e.g., The treatment may reduce infection rates).</w:t>
-            </w:r>
-            <w:r>
-              <w:rPr>
-                <w:rtl w:val="0"/>
-                <w:sz w:val="16"/>
-                <w:szCs w:val="16"/>
-              </w:rPr>
-            </w:r>
-          </w:p>
-          <w:p>
-            <w:pPr>
-              <w:spacing w:before="0" w:after="40" w:line="200" w:lineRule="auto"/>
-              <w:ind w:left="240" w:firstLine="720"/>
-              <w:jc w:val="both"/>
-              <w:rPr>
-                <w:sz w:val="16"/>
-                <w:szCs w:val="16"/>
-              </w:rPr>
-            </w:pPr>
-            <w:r>
-              <w:rPr>
-                <w:rFonts w:ascii="Georgia" w:cs="Georgia" w:eastAsia="Georgia" w:hAnsi="Georgia"/>
-                <w:b w:val="0"/>
-                <w:bCs w:val="0"/>
-                <w:sz w:val="16"/>
-                <w:szCs w:val="16"/>
-                <w:rtl w:val="0"/>
-              </w:rPr>
-              <w:t xml:space="preserve">Politeness / Deference: softens face threat or shows respect rather than genuine doubt (e.g., As suggested by Hyland…).</w:t>
-            </w:r>
-            <w:r>
-              <w:rPr>
-                <w:rtl w:val="0"/>
-                <w:sz w:val="16"/>
-                <w:szCs w:val="16"/>
-              </w:rPr>
-            </w:r>
-          </w:p>
-          <w:p>
-            <w:pPr>
-              <w:spacing w:before="0" w:after="40" w:line="200" w:lineRule="auto"/>
-              <w:ind w:left="240" w:firstLine="0"/>
-              <w:jc w:val="both"/>
-              <w:rPr>
-                <w:sz w:val="16"/>
-                <w:szCs w:val="16"/>
-              </w:rPr>
-            </w:pPr>
-            <w:r>
-              <w:rPr>
-                <w:rFonts w:ascii="Georgia" w:cs="Georgia" w:eastAsia="Georgia" w:hAnsi="Georgia"/>
-                <w:b w:val="0"/>
-                <w:bCs w:val="0"/>
-                <w:sz w:val="16"/>
-                <w:szCs w:val="16"/>
-                <w:rtl w:val="0"/>
-              </w:rPr>
-              <w:t xml:space="preserve">Discourse Organization: manages text structure or reader expectations rather than stance (e.g., It should be noted that…).</w:t>
-            </w:r>
-            <w:r>
-              <w:rPr>
-                <w:rtl w:val="0"/>
-                <w:sz w:val="16"/>
-                <w:szCs w:val="16"/>
-              </w:rPr>
-            </w:r>
-          </w:p>
-          <w:p>
-            <w:pPr>
-              <w:keepNext w:val="1"/>
-              <w:spacing w:before="0" w:after="40" w:line="200" w:lineRule="auto"/>
-              <w:ind w:firstLine="720"/>
-              <w:jc w:val="left"/>
-              <w:rPr>
-                <w:sz w:val="16"/>
-                <w:szCs w:val="16"/>
-              </w:rPr>
-            </w:pPr>
-            <w:r>
-              <w:rPr>
-                <w:rFonts w:ascii="Georgia" w:cs="Georgia" w:eastAsia="Georgia" w:hAnsi="Georgia"/>
-                <w:b w:val="1"/>
-                <w:bCs w:val="1"/>
-                <w:sz w:val="16"/>
-                <w:szCs w:val="16"/>
-                <w:rtl w:val="0"/>
-              </w:rPr>
-              <w:t xml:space="preserve">Core decision rules</w:t>
-            </w:r>
-            <w:r>
-              <w:rPr>
-                <w:rtl w:val="0"/>
-                <w:sz w:val="16"/>
-                <w:szCs w:val="16"/>
-              </w:rPr>
-            </w:r>
-          </w:p>
-          <w:p>
-            <w:pPr>
-              <w:spacing w:before="0" w:after="40" w:line="200" w:lineRule="auto"/>
-              <w:ind w:left="240" w:firstLine="720"/>
-              <w:jc w:val="both"/>
-              <w:rPr>
-                <w:sz w:val="16"/>
-                <w:szCs w:val="16"/>
-              </w:rPr>
-            </w:pPr>
-            <w:r>
-              <w:rPr>
-                <w:rFonts w:ascii="Georgia" w:cs="Cardo" w:eastAsia="Cardo" w:hAnsi="Georgia"/>
-                <w:sz w:val="16"/>
-                <w:szCs w:val="16"/>
-                <w:rtl w:val="0"/>
-                <w:i/>
-                <w:iCs/>
-              </w:rPr>
-              <w:t xml:space="preserve">suggest / indicate → hedge when introducing a finding; not a hedge when introducing a recommendation.</w:t>
-            </w:r>
-            <w:r>
-              <w:rPr>
-                <w:rtl w:val="0"/>
+                <w:i w:val="0"/>
+                <w:iCs w:val="0"/>
+                <w:color w:val="000000"/>
+                <w:sz w:val="14"/>
+                <w:szCs w:val="14"/>
+                <w:rtl w:val="0"/>
+              </w:rPr>
+              <w:t xml:space="preserve">  Lexical Hedges</w:t>
+            </w:r>
+            <w:r>
+              <w:rPr>
+                <w:rtl w:val="0"/>
+                <w:sz w:val="14"/>
+                <w:szCs w:val="14"/>
                 <w:rFonts w:ascii="Georgia" w:hAnsi="Georgia"/>
-                <w:sz w:val="16"/>
-                <w:szCs w:val="16"/>
-                <w:i/>
-                <w:iCs/>
-              </w:rPr>
-            </w:r>
-          </w:p>
-          <w:p>
-            <w:pPr>
-              <w:spacing w:before="0" w:after="40" w:line="200" w:lineRule="auto"/>
-              <w:ind w:left="240" w:firstLine="720"/>
-              <w:jc w:val="both"/>
-              <w:rPr>
-                <w:sz w:val="16"/>
-                <w:szCs w:val="16"/>
-              </w:rPr>
-            </w:pPr>
-            <w:r>
-              <w:rPr>
-                <w:rFonts w:ascii="Georgia" w:cs="Cardo" w:eastAsia="Cardo" w:hAnsi="Georgia"/>
-                <w:sz w:val="16"/>
-                <w:szCs w:val="16"/>
-                <w:rtl w:val="0"/>
-                <w:i/>
-                <w:iCs/>
-              </w:rPr>
-              <w:t xml:space="preserve">can / may → hedge when marking possibility; not a hedge when marking capability.</w:t>
-            </w:r>
-            <w:r>
-              <w:rPr>
-                <w:rtl w:val="0"/>
-                <w:rFonts w:ascii="Georgia" w:hAnsi="Georgia"/>
-                <w:sz w:val="16"/>
-                <w:szCs w:val="16"/>
-                <w:i/>
-                <w:iCs/>
-              </w:rPr>
-            </w:r>
-          </w:p>
-          <w:p>
-            <w:pPr>
-              <w:spacing w:before="0" w:after="40" w:line="200" w:lineRule="auto"/>
-              <w:ind w:left="240" w:firstLine="720"/>
-              <w:jc w:val="both"/>
-              <w:rPr>
-                <w:sz w:val="16"/>
-                <w:szCs w:val="16"/>
-              </w:rPr>
-            </w:pPr>
-            <w:r>
-              <w:rPr>
-                <w:rFonts w:ascii="Georgia" w:cs="Cardo" w:eastAsia="Cardo" w:hAnsi="Georgia"/>
-                <w:sz w:val="16"/>
-                <w:szCs w:val="16"/>
-                <w:rtl w:val="0"/>
-                <w:i/>
-                <w:iCs/>
-              </w:rPr>
-              <w:t xml:space="preserve">generally / typically → hedge when limiting the scope of a claim; not a hedge when describing a procedural norm.</w:t>
-            </w:r>
-            <w:r>
-              <w:rPr>
-                <w:rtl w:val="0"/>
-                <w:rFonts w:ascii="Georgia" w:hAnsi="Georgia"/>
-                <w:sz w:val="16"/>
-                <w:szCs w:val="16"/>
-                <w:i/>
-                <w:iCs/>
-              </w:rPr>
-            </w:r>
-          </w:p>
-          <w:p>
-            <w:pPr>
-              <w:spacing w:before="0" w:after="40" w:line="200" w:lineRule="auto"/>
-              <w:ind w:left="240" w:firstLine="0"/>
-              <w:jc w:val="both"/>
-              <w:rPr>
-                <w:sz w:val="16"/>
-                <w:szCs w:val="16"/>
-              </w:rPr>
-            </w:pPr>
-            <w:r>
-              <w:rPr>
-                <w:rFonts w:ascii="Georgia" w:cs="Cardo" w:eastAsia="Cardo" w:hAnsi="Georgia"/>
-                <w:sz w:val="16"/>
-                <w:szCs w:val="16"/>
-                <w:rtl w:val="0"/>
-                <w:i/>
-                <w:iCs/>
-              </w:rPr>
-              <w:t xml:space="preserve">appear / seem → hedge when expressing uncertainty about a result; not a hedge when pointing to location in a table or text.</w:t>
-            </w:r>
-            <w:r>
-              <w:rPr>
-                <w:rtl w:val="0"/>
-                <w:rFonts w:ascii="Georgia" w:hAnsi="Georgia"/>
-                <w:sz w:val="16"/>
-                <w:szCs w:val="16"/>
-                <w:i/>
-                <w:iCs/>
-              </w:rPr>
-            </w:r>
-          </w:p>
-          <w:p>
-            <w:pPr>
-              <w:keepNext w:val="1"/>
-              <w:spacing w:before="0" w:after="40" w:line="200" w:lineRule="auto"/>
-              <w:ind w:firstLine="720"/>
-              <w:jc w:val="left"/>
-              <w:rPr>
-                <w:sz w:val="16"/>
-                <w:szCs w:val="16"/>
-              </w:rPr>
-            </w:pPr>
-            <w:r>
-              <w:rPr>
-                <w:rFonts w:ascii="Georgia" w:cs="Georgia" w:eastAsia="Georgia" w:hAnsi="Georgia"/>
-                <w:b w:val="1"/>
-                <w:bCs w:val="1"/>
-                <w:sz w:val="16"/>
-                <w:szCs w:val="16"/>
-                <w:rtl w:val="0"/>
-              </w:rPr>
-              <w:t xml:space="preserve">Exclusion and Working Test</w:t>
-            </w:r>
-            <w:r>
-              <w:rPr>
-                <w:rtl w:val="0"/>
-                <w:sz w:val="16"/>
-                <w:szCs w:val="16"/>
               </w:rPr>
             </w:r>
           </w:p>
@@ -10534,44 +10709,88 @@
             <w:pPr>
               <w:spacing w:before="0" w:after="40" w:line="200" w:lineRule="auto"/>
               <w:jc w:val="both"/>
-              <w:rPr>
-                <w:sz w:val="16"/>
-                <w:szCs w:val="16"/>
-              </w:rPr>
+              <w:rPr/>
             </w:pPr>
+            <w:r>
+              <w:rPr>
+                <w:rFonts w:ascii="Georgia" w:cs="Georgia" w:eastAsia="Georgia" w:hAnsi="Georgia"/>
+                <w:sz w:val="14"/>
+                <w:szCs w:val="14"/>
+                <w:highlight w:val="yellow"/>
+                <w:rtl w:val="0"/>
+              </w:rPr>
+              <w:t xml:space="preserve">      </w:t>
+            </w:r>
             <w:r>
               <w:rPr>
                 <w:rFonts w:ascii="Georgia" w:cs="Georgia" w:eastAsia="Georgia" w:hAnsi="Georgia"/>
                 <w:b w:val="0"/>
                 <w:bCs w:val="0"/>
-                <w:sz w:val="16"/>
-                <w:szCs w:val="16"/>
-                <w:rtl w:val="0"/>
-              </w:rPr>
-              <w:t xml:space="preserve">Ability, future procedure, and necessity (must / should in procedural contexts) are never hedges. Working Test: if removing the device does not change how certain or tentative the claim is, it is not a hedge.</w:t>
-            </w:r>
-            <w:r>
-              <w:rPr>
-                <w:rtl w:val="0"/>
-                <w:sz w:val="16"/>
-                <w:szCs w:val="16"/>
+                <w:i w:val="0"/>
+                <w:iCs w:val="0"/>
+                <w:color w:val="000000"/>
+                <w:sz w:val="14"/>
+                <w:szCs w:val="14"/>
+                <w:rtl w:val="0"/>
+              </w:rPr>
+              <w:t xml:space="preserve">  Adverbial Hedges</w:t>
+            </w:r>
+            <w:r>
+              <w:rPr>
+                <w:rtl w:val="0"/>
+                <w:sz w:val="14"/>
+                <w:szCs w:val="14"/>
+                <w:rFonts w:ascii="Georgia" w:hAnsi="Georgia"/>
+              </w:rPr>
+            </w:r>
+          </w:p>
+          <w:p>
+            <w:pPr>
+              <w:spacing w:before="0" w:after="40" w:line="200" w:lineRule="auto"/>
+              <w:jc w:val="both"/>
+              <w:rPr/>
+            </w:pPr>
+            <w:r>
+              <w:rPr>
+                <w:rFonts w:ascii="Georgia" w:cs="Georgia" w:eastAsia="Georgia" w:hAnsi="Georgia"/>
+                <w:sz w:val="14"/>
+                <w:szCs w:val="14"/>
+                <w:shd w:fill="00b050" w:val="clear"/>
+                <w:rtl w:val="0"/>
+              </w:rPr>
+              <w:t xml:space="preserve">      </w:t>
+            </w:r>
+            <w:r>
+              <w:rPr>
+                <w:rFonts w:ascii="Georgia" w:cs="Georgia" w:eastAsia="Georgia" w:hAnsi="Georgia"/>
+                <w:b w:val="0"/>
+                <w:bCs w:val="0"/>
+                <w:i w:val="0"/>
+                <w:iCs w:val="0"/>
+                <w:color w:val="000000"/>
+                <w:sz w:val="14"/>
+                <w:szCs w:val="14"/>
+                <w:rtl w:val="0"/>
+              </w:rPr>
+              <w:t xml:space="preserve">  Clause-Level Hedges</w:t>
+            </w:r>
+            <w:r>
+              <w:rPr>
+                <w:rtl w:val="0"/>
+                <w:sz w:val="14"/>
+                <w:szCs w:val="14"/>
+                <w:rFonts w:ascii="Georgia" w:hAnsi="Georgia"/>
               </w:rPr>
             </w:r>
           </w:p>
         </w:tc>
         <w:tc>
-          <w:tcPr>
-            <w:tcW w:w="2500" w:type="pct"/>
-          </w:tcPr>
+          <w:tcPr/>
           <w:p>
             <w:pPr>
-              <w:keepNext w:val="1"/>
               <w:spacing w:before="0" w:after="40" w:line="200" w:lineRule="auto"/>
-              <w:jc w:val="left"/>
-              <w:rPr>
-                <w:sz w:val="16"/>
-                <w:szCs w:val="16"/>
-              </w:rPr>
+              <w:jc w:val="both"/>
+              <w:rPr/>
             </w:pPr>
             <w:r>
               <w:rPr>
@@ -10580,32 +10799,13 @@
                 <w:bCs w:val="1"/>
                 <w:i w:val="0"/>
                 <w:iCs w:val="0"/>
-                <w:sz w:val="16"/>
-                <w:szCs w:val="16"/>
-                <w:rtl w:val="0"/>
-              </w:rPr>
-              <w:t xml:space="preserve">QUICK-REFERENCE LEGEND</w:t>
-            </w:r>
-            <w:r>
-              <w:rPr>
-                <w:rtl w:val="0"/>
-                <w:sz w:val="16"/>
-                <w:szCs w:val="16"/>
-              </w:rPr>
-            </w:r>
-          </w:p>
-          <w:p>
-            <w:pPr>
-              <w:keepNext w:val="1"/>
-              <w:keepLines w:val="1"/>
-              <w:spacing w:before="0" w:after="40" w:line="200" w:lineRule="auto"/>
-              <w:ind w:firstLine="720"/>
-              <w:jc w:val="both"/>
-              <w:rPr>
-                <w:sz w:val="16"/>
-                <w:szCs w:val="16"/>
-              </w:rPr>
-            </w:pPr>
+                <w:color w:val="ed7d31"/>
+                <w:sz w:val="14"/>
+                <w:szCs w:val="14"/>
+                <w:rtl w:val="0"/>
+              </w:rPr>
+              <w:t xml:space="preserve">EC</w:t>
+            </w:r>
             <w:r>
               <w:rPr>
                 <w:rFonts w:ascii="Georgia" w:cs="Georgia" w:eastAsia="Georgia" w:hAnsi="Georgia"/>
@@ -10613,603 +10813,253 @@
                 <w:bCs w:val="0"/>
                 <w:i w:val="0"/>
                 <w:iCs w:val="0"/>
-                <w:sz w:val="16"/>
-                <w:szCs w:val="16"/>
-                <w:rtl w:val="0"/>
-              </w:rPr>
-              <w:t xml:space="preserve">Colors are backgrounds applied with a highlighter directly on the abstract text, not font colors.</w:t>
-            </w:r>
-            <w:r>
-              <w:rPr>
-                <w:rtl w:val="0"/>
-                <w:sz w:val="16"/>
-                <w:szCs w:val="16"/>
+                <w:color w:val="000000"/>
+                <w:sz w:val="14"/>
+                <w:szCs w:val="14"/>
+                <w:rtl w:val="0"/>
+              </w:rPr>
+              <w:t xml:space="preserve">  Epistemic Caution</w:t>
+            </w:r>
+            <w:r>
+              <w:rPr>
+                <w:rtl w:val="0"/>
+                <w:sz w:val="14"/>
+                <w:szCs w:val="14"/>
+                <w:rFonts w:ascii="Georgia" w:hAnsi="Georgia"/>
               </w:rPr>
             </w:r>
           </w:p>
-          <w:tbl>
-            <w:tblPr>
-              <w:tblStyle w:val="Table11"/>
-              <w:tblW w:w="8306.0" w:type="dxa"/>
-              <w:jc w:val="left"/>
-              <w:tblInd w:w="-40.0" w:type="dxa"/>
-              <w:tblBorders>
-                <w:top w:color="000000" w:space="0" w:sz="18" w:val="single"/>
-                <w:left w:color="000000" w:space="0" w:sz="0" w:val="nil"/>
-                <w:bottom w:color="000000" w:space="0" w:sz="18" w:val="single"/>
-                <w:right w:color="000000" w:space="0" w:sz="0" w:val="nil"/>
-                <w:insideH w:color="000000" w:space="0" w:sz="0" w:val="nil"/>
-                <w:insideV w:color="000000" w:space="0" w:sz="0" w:val="nil"/>
-              </w:tblBorders>
-              <w:tblLayout w:type="fixed"/>
-              <w:tblLook w:val="0400"/>
-            </w:tblPr>
-            <w:tblGrid>
-              <w:gridCol w:w="4153"/>
-              <w:gridCol w:w="4153"/>
-              <w:tblGridChange w:id="0">
-                <w:tblGrid>
-                  <w:gridCol w:w="4153"/>
-                  <w:gridCol w:w="4153"/>
-                </w:tblGrid>
-              </w:tblGridChange>
-            </w:tblGrid>
-            <w:tr>
-              <w:trPr>
-                <w:cantSplit w:val="1"/>
-                <w:tblHeader w:val="1"/>
-              </w:trPr>
-              <w:tc>
-                <w:tcPr>
-                  <w:tcBorders>
-                    <w:bottom w:color="000000" w:space="0" w:sz="4" w:val="single"/>
-                  </w:tcBorders>
-                  <w:shd w:fill="f2f4f6" w:val="clear"/>
-                </w:tcPr>
-                <w:p>
-                  <w:pPr>
-                    <w:spacing w:before="0" w:after="40" w:line="200" w:lineRule="auto"/>
-                    <w:jc w:val="both"/>
-                    <w:rPr>
-                      <w:sz w:val="16"/>
-                      <w:szCs w:val="16"/>
-                    </w:rPr>
-                  </w:pPr>
-                  <w:r>
-                    <w:rPr>
-                      <w:rFonts w:ascii="Georgia" w:cs="Georgia" w:eastAsia="Georgia" w:hAnsi="Georgia"/>
-                      <w:b w:val="1"/>
-                      <w:bCs w:val="1"/>
-                      <w:sz w:val="16"/>
-                      <w:szCs w:val="16"/>
-                      <w:rtl w:val="0"/>
-                    </w:rPr>
-                    <w:t xml:space="preserve">TYPE (Highlight)</w:t>
-                  </w:r>
-                  <w:r>
-                    <w:rPr>
-                      <w:rtl w:val="0"/>
-                      <w:sz w:val="16"/>
-                      <w:szCs w:val="16"/>
-                      <w:rFonts w:ascii="Georgia" w:hAnsi="Georgia"/>
-                    </w:rPr>
-                  </w:r>
-                </w:p>
-              </w:tc>
-              <w:tc>
-                <w:tcPr>
-                  <w:tcBorders>
-                    <w:bottom w:color="000000" w:space="0" w:sz="4" w:val="single"/>
-                  </w:tcBorders>
-                  <w:shd w:fill="f2f4f6" w:val="clear"/>
-                </w:tcPr>
-                <w:p>
-                  <w:pPr>
-                    <w:spacing w:before="0" w:after="40" w:line="200" w:lineRule="auto"/>
-                    <w:jc w:val="both"/>
-                    <w:rPr>
-                      <w:sz w:val="16"/>
-                      <w:szCs w:val="16"/>
-                    </w:rPr>
-                  </w:pPr>
-                  <w:r>
-                    <w:rPr>
-                      <w:rFonts w:ascii="Georgia" w:cs="Georgia" w:eastAsia="Georgia" w:hAnsi="Georgia"/>
-                      <w:b w:val="1"/>
-                      <w:bCs w:val="1"/>
-                      <w:sz w:val="16"/>
-                      <w:szCs w:val="16"/>
-                      <w:rtl w:val="0"/>
-                    </w:rPr>
-                    <w:t xml:space="preserve">FUNCTION (Text)</w:t>
-                  </w:r>
-                  <w:r>
-                    <w:rPr>
-                      <w:rtl w:val="0"/>
-                      <w:sz w:val="16"/>
-                      <w:szCs w:val="16"/>
-                      <w:rFonts w:ascii="Georgia" w:hAnsi="Georgia"/>
-                    </w:rPr>
-                  </w:r>
-                </w:p>
-              </w:tc>
-            </w:tr>
-            <w:tr>
-              <w:trPr>
-                <w:cantSplit w:val="1"/>
-                <w:tblHeader w:val="0"/>
-              </w:trPr>
-              <w:tc>
-                <w:tcPr/>
-                <w:p>
-                  <w:pPr>
-                    <w:spacing w:before="0" w:after="40" w:line="200" w:lineRule="auto"/>
-                    <w:jc w:val="both"/>
-                    <w:rPr>
-                      <w:sz w:val="16"/>
-                      <w:szCs w:val="16"/>
-                    </w:rPr>
-                  </w:pPr>
-                  <w:r>
-                    <w:rPr>
-                      <w:rFonts w:ascii="Georgia" w:cs="Georgia" w:eastAsia="Georgia" w:hAnsi="Georgia"/>
-                      <w:sz w:val="16"/>
-                      <w:szCs w:val="16"/>
-                      <w:shd w:fill="00b0f0" w:val="clear"/>
-                      <w:rtl w:val="0"/>
-                    </w:rPr>
-                    <w:t xml:space="preserve">      </w:t>
-                  </w:r>
-                  <w:r>
-                    <w:rPr>
-                      <w:rFonts w:ascii="Georgia" w:cs="Georgia" w:eastAsia="Georgia" w:hAnsi="Georgia"/>
-                      <w:b w:val="0"/>
-                      <w:bCs w:val="0"/>
-                      <w:i w:val="0"/>
-                      <w:iCs w:val="0"/>
-                      <w:color w:val="000000"/>
-                      <w:sz w:val="16"/>
-                      <w:szCs w:val="16"/>
-                      <w:rtl w:val="0"/>
-                    </w:rPr>
-                    <w:t xml:space="preserve">  Modal Verbs</w:t>
-                  </w:r>
-                  <w:r>
-                    <w:rPr>
-                      <w:rtl w:val="0"/>
-                      <w:sz w:val="16"/>
-                      <w:szCs w:val="16"/>
-                      <w:rFonts w:ascii="Georgia" w:hAnsi="Georgia"/>
-                    </w:rPr>
-                  </w:r>
-                </w:p>
-                <w:p>
-                  <w:pPr>
-                    <w:spacing w:before="0" w:after="40" w:line="200" w:lineRule="auto"/>
-                    <w:jc w:val="both"/>
-                    <w:rPr>
-                      <w:sz w:val="16"/>
-                      <w:szCs w:val="16"/>
-                    </w:rPr>
-                  </w:pPr>
-                  <w:r>
-                    <w:rPr>
-                      <w:rFonts w:ascii="Georgia" w:cs="Georgia" w:eastAsia="Georgia" w:hAnsi="Georgia"/>
-                      <w:sz w:val="16"/>
-                      <w:szCs w:val="16"/>
-                      <w:highlight w:val="red"/>
-                      <w:rtl w:val="0"/>
-                    </w:rPr>
-                    <w:t xml:space="preserve">      </w:t>
-                  </w:r>
-                  <w:r>
-                    <w:rPr>
-                      <w:rFonts w:ascii="Georgia" w:cs="Georgia" w:eastAsia="Georgia" w:hAnsi="Georgia"/>
-                      <w:b w:val="0"/>
-                      <w:bCs w:val="0"/>
-                      <w:i w:val="0"/>
-                      <w:iCs w:val="0"/>
-                      <w:color w:val="000000"/>
-                      <w:sz w:val="16"/>
-                      <w:szCs w:val="16"/>
-                      <w:rtl w:val="0"/>
-                    </w:rPr>
-                    <w:t xml:space="preserve">  Lexical Hedges</w:t>
-                  </w:r>
-                  <w:r>
-                    <w:rPr>
-                      <w:rtl w:val="0"/>
-                      <w:sz w:val="16"/>
-                      <w:szCs w:val="16"/>
-                      <w:rFonts w:ascii="Georgia" w:hAnsi="Georgia"/>
-                    </w:rPr>
-                  </w:r>
-                </w:p>
-                <w:p>
-                  <w:pPr>
-                    <w:spacing w:before="0" w:after="40" w:line="200" w:lineRule="auto"/>
-                    <w:jc w:val="both"/>
-                    <w:rPr>
-                      <w:sz w:val="16"/>
-                      <w:szCs w:val="16"/>
-                    </w:rPr>
-                  </w:pPr>
-                  <w:r>
-                    <w:rPr>
-                      <w:rFonts w:ascii="Georgia" w:cs="Georgia" w:eastAsia="Georgia" w:hAnsi="Georgia"/>
-                      <w:sz w:val="16"/>
-                      <w:szCs w:val="16"/>
-                      <w:highlight w:val="yellow"/>
-                      <w:rtl w:val="0"/>
-                    </w:rPr>
-                    <w:t xml:space="preserve">      </w:t>
-                  </w:r>
-                  <w:r>
-                    <w:rPr>
-                      <w:rFonts w:ascii="Georgia" w:cs="Georgia" w:eastAsia="Georgia" w:hAnsi="Georgia"/>
-                      <w:b w:val="0"/>
-                      <w:bCs w:val="0"/>
-                      <w:i w:val="0"/>
-                      <w:iCs w:val="0"/>
-                      <w:color w:val="000000"/>
-                      <w:sz w:val="16"/>
-                      <w:szCs w:val="16"/>
-                      <w:rtl w:val="0"/>
-                    </w:rPr>
-                    <w:t xml:space="preserve">  Adverbial Hedges</w:t>
-                  </w:r>
-                  <w:r>
-                    <w:rPr>
-                      <w:rtl w:val="0"/>
-                      <w:sz w:val="16"/>
-                      <w:szCs w:val="16"/>
-                      <w:rFonts w:ascii="Georgia" w:hAnsi="Georgia"/>
-                    </w:rPr>
-                  </w:r>
-                </w:p>
-                <w:p>
-                  <w:pPr>
-                    <w:spacing w:before="0" w:after="40" w:line="200" w:lineRule="auto"/>
-                    <w:jc w:val="both"/>
-                    <w:rPr>
-                      <w:sz w:val="16"/>
-                      <w:szCs w:val="16"/>
-                    </w:rPr>
-                  </w:pPr>
-                  <w:r>
-                    <w:rPr>
-                      <w:rFonts w:ascii="Georgia" w:cs="Georgia" w:eastAsia="Georgia" w:hAnsi="Georgia"/>
-                      <w:sz w:val="16"/>
-                      <w:szCs w:val="16"/>
-                      <w:shd w:fill="00b050" w:val="clear"/>
-                      <w:rtl w:val="0"/>
-                    </w:rPr>
-                    <w:t xml:space="preserve">      </w:t>
-                  </w:r>
-                  <w:r>
-                    <w:rPr>
-                      <w:rFonts w:ascii="Georgia" w:cs="Georgia" w:eastAsia="Georgia" w:hAnsi="Georgia"/>
-                      <w:b w:val="0"/>
-                      <w:bCs w:val="0"/>
-                      <w:i w:val="0"/>
-                      <w:iCs w:val="0"/>
-                      <w:color w:val="000000"/>
-                      <w:sz w:val="16"/>
-                      <w:szCs w:val="16"/>
-                      <w:rtl w:val="0"/>
-                    </w:rPr>
-                    <w:t xml:space="preserve">  Clause-Level Hedges</w:t>
-                  </w:r>
-                  <w:r>
-                    <w:rPr>
-                      <w:rtl w:val="0"/>
-                      <w:sz w:val="16"/>
-                      <w:szCs w:val="16"/>
-                      <w:rFonts w:ascii="Georgia" w:hAnsi="Georgia"/>
-                    </w:rPr>
-                  </w:r>
-                </w:p>
-              </w:tc>
-              <w:tc>
-                <w:tcPr/>
-                <w:p>
-                  <w:pPr>
-                    <w:spacing w:before="0" w:after="40" w:line="200" w:lineRule="auto"/>
-                    <w:jc w:val="both"/>
-                    <w:rPr>
-                      <w:sz w:val="16"/>
-                      <w:szCs w:val="16"/>
-                    </w:rPr>
-                  </w:pPr>
-                  <w:r>
-                    <w:rPr>
-                      <w:rFonts w:ascii="Georgia" w:cs="Georgia" w:eastAsia="Georgia" w:hAnsi="Georgia"/>
-                      <w:b w:val="1"/>
-                      <w:bCs w:val="1"/>
-                      <w:i w:val="0"/>
-                      <w:iCs w:val="0"/>
-                      <w:color w:val="ed7d31"/>
-                      <w:sz w:val="16"/>
-                      <w:szCs w:val="16"/>
-                      <w:rtl w:val="0"/>
-                    </w:rPr>
-                    <w:t xml:space="preserve">EC</w:t>
-                  </w:r>
-                  <w:r>
-                    <w:rPr>
-                      <w:rFonts w:ascii="Georgia" w:cs="Georgia" w:eastAsia="Georgia" w:hAnsi="Georgia"/>
-                      <w:b w:val="0"/>
-                      <w:bCs w:val="0"/>
-                      <w:i w:val="0"/>
-                      <w:iCs w:val="0"/>
-                      <w:color w:val="000000"/>
-                      <w:sz w:val="16"/>
-                      <w:szCs w:val="16"/>
-                      <w:rtl w:val="0"/>
-                    </w:rPr>
-                    <w:t xml:space="preserve">  Epistemic Caution</w:t>
-                  </w:r>
-                  <w:r>
-                    <w:rPr>
-                      <w:rtl w:val="0"/>
-                      <w:sz w:val="16"/>
-                      <w:szCs w:val="16"/>
-                      <w:rFonts w:ascii="Georgia" w:hAnsi="Georgia"/>
-                    </w:rPr>
-                  </w:r>
-                </w:p>
-                <w:p>
-                  <w:pPr>
-                    <w:spacing w:before="0" w:after="40" w:line="200" w:lineRule="auto"/>
-                    <w:jc w:val="both"/>
-                    <w:rPr>
-                      <w:sz w:val="16"/>
-                      <w:szCs w:val="16"/>
-                    </w:rPr>
-                  </w:pPr>
-                  <w:r>
-                    <w:rPr>
-                      <w:rFonts w:ascii="Georgia" w:cs="Georgia" w:eastAsia="Georgia" w:hAnsi="Georgia"/>
-                      <w:b w:val="1"/>
-                      <w:bCs w:val="1"/>
-                      <w:i w:val="0"/>
-                      <w:iCs w:val="0"/>
-                      <w:color w:val="7030a0"/>
-                      <w:sz w:val="16"/>
-                      <w:szCs w:val="16"/>
-                      <w:rtl w:val="0"/>
-                    </w:rPr>
-                    <w:t xml:space="preserve">P</w:t>
-                  </w:r>
-                  <w:r>
-                    <w:rPr>
-                      <w:rFonts w:ascii="Georgia" w:cs="Georgia" w:eastAsia="Georgia" w:hAnsi="Georgia"/>
-                      <w:b w:val="0"/>
-                      <w:bCs w:val="0"/>
-                      <w:i w:val="0"/>
-                      <w:iCs w:val="0"/>
-                      <w:color w:val="000000"/>
-                      <w:sz w:val="16"/>
-                      <w:szCs w:val="16"/>
-                      <w:rtl w:val="0"/>
-                    </w:rPr>
-                    <w:t xml:space="preserve">  Politeness / Deference</w:t>
-                  </w:r>
-                  <w:r>
-                    <w:rPr>
-                      <w:rtl w:val="0"/>
-                      <w:sz w:val="16"/>
-                      <w:szCs w:val="16"/>
-                      <w:rFonts w:ascii="Georgia" w:hAnsi="Georgia"/>
-                    </w:rPr>
-                  </w:r>
-                </w:p>
-                <w:p>
-                  <w:pPr>
-                    <w:spacing w:before="0" w:after="40" w:line="200" w:lineRule="auto"/>
-                    <w:jc w:val="both"/>
-                    <w:rPr>
-                      <w:sz w:val="16"/>
-                      <w:szCs w:val="16"/>
-                    </w:rPr>
-                  </w:pPr>
-                  <w:r>
-                    <w:rPr>
-                      <w:rFonts w:ascii="Georgia" w:cs="Georgia" w:eastAsia="Georgia" w:hAnsi="Georgia"/>
-                      <w:b w:val="1"/>
-                      <w:bCs w:val="1"/>
-                      <w:i w:val="0"/>
-                      <w:iCs w:val="0"/>
-                      <w:color w:val="00b0f0"/>
-                      <w:sz w:val="16"/>
-                      <w:szCs w:val="16"/>
-                      <w:rtl w:val="0"/>
-                    </w:rPr>
-                    <w:t xml:space="preserve">DO</w:t>
-                  </w:r>
-                  <w:r>
-                    <w:rPr>
-                      <w:rFonts w:ascii="Georgia" w:cs="Georgia" w:eastAsia="Georgia" w:hAnsi="Georgia"/>
-                      <w:b w:val="0"/>
-                      <w:bCs w:val="0"/>
-                      <w:i w:val="0"/>
-                      <w:iCs w:val="0"/>
-                      <w:color w:val="000000"/>
-                      <w:sz w:val="16"/>
-                      <w:szCs w:val="16"/>
-                      <w:rtl w:val="0"/>
-                    </w:rPr>
-                    <w:t xml:space="preserve">  Discourse Organization</w:t>
-                  </w:r>
-                  <w:r>
-                    <w:rPr>
-                      <w:rtl w:val="0"/>
-                      <w:sz w:val="16"/>
-                      <w:szCs w:val="16"/>
-                      <w:rFonts w:ascii="Georgia" w:hAnsi="Georgia"/>
-                    </w:rPr>
-                  </w:r>
-                </w:p>
-              </w:tc>
-            </w:tr>
-            <w:tr>
-              <w:trPr>
-                <w:cantSplit w:val="1"/>
-                <w:tblHeader w:val="0"/>
-              </w:trPr>
-              <w:tc>
-                <w:tcPr/>
-                <w:p>
-                  <w:pPr>
-                    <w:spacing w:before="0" w:after="40" w:line="200" w:lineRule="auto"/>
-                    <w:jc w:val="both"/>
-                    <w:rPr>
-                      <w:sz w:val="16"/>
-                      <w:szCs w:val="16"/>
-                    </w:rPr>
-                  </w:pPr>
-                  <w:r>
-                    <w:rPr>
-                      <w:rFonts w:ascii="Georgia" w:cs="Georgia" w:eastAsia="Georgia" w:hAnsi="Georgia"/>
-                      <w:b w:val="1"/>
-                      <w:bCs w:val="1"/>
-                      <w:i w:val="0"/>
-                      <w:iCs w:val="0"/>
-                      <w:color w:val="000000"/>
-                      <w:sz w:val="16"/>
-                      <w:szCs w:val="16"/>
-                      <w:rtl w:val="0"/>
-                    </w:rPr>
-                    <w:t xml:space="preserve">UNHEDGED SITES (Grey Highlight, Optional)</w:t>
-                  </w:r>
-                  <w:r>
-                    <w:rPr>
-                      <w:rtl w:val="0"/>
-                      <w:sz w:val="16"/>
-                      <w:szCs w:val="16"/>
-                      <w:rFonts w:ascii="Georgia" w:hAnsi="Georgia"/>
-                    </w:rPr>
-                  </w:r>
-                </w:p>
-                <w:p>
-                  <w:pPr>
-                    <w:spacing w:before="0" w:after="40" w:line="200" w:lineRule="auto"/>
-                    <w:jc w:val="both"/>
-                    <w:rPr>
-                      <w:sz w:val="16"/>
-                      <w:szCs w:val="16"/>
-                    </w:rPr>
-                  </w:pPr>
-                  <w:r>
-                    <w:rPr>
-                      <w:rFonts w:ascii="Georgia" w:cs="Georgia" w:eastAsia="Georgia" w:hAnsi="Georgia"/>
-                      <w:sz w:val="16"/>
-                      <w:szCs w:val="16"/>
-                      <w:shd w:fill="bfbfbf" w:val="clear"/>
-                      <w:rtl w:val="0"/>
-                    </w:rPr>
-                    <w:t xml:space="preserve">      </w:t>
-                  </w:r>
-                  <w:r>
-                    <w:rPr>
-                      <w:rFonts w:ascii="Georgia" w:cs="Georgia" w:eastAsia="Georgia" w:hAnsi="Georgia"/>
-                      <w:b w:val="0"/>
-                      <w:bCs w:val="0"/>
-                      <w:i w:val="0"/>
-                      <w:iCs w:val="0"/>
-                      <w:color w:val="000000"/>
-                      <w:sz w:val="16"/>
-                      <w:szCs w:val="16"/>
-                      <w:rtl w:val="0"/>
-                    </w:rPr>
-                    <w:t xml:space="preserve">  R = Result, G = Generalization, C = Causal. Bracket the subtype beside the mark.</w:t>
-                  </w:r>
-                  <w:r>
-                    <w:rPr>
-                      <w:rtl w:val="0"/>
-                      <w:sz w:val="16"/>
-                      <w:szCs w:val="16"/>
-                      <w:rFonts w:ascii="Georgia" w:hAnsi="Georgia"/>
-                    </w:rPr>
-                  </w:r>
-                </w:p>
-              </w:tc>
-              <w:tc>
-                <w:tcPr/>
-                <w:p>
-                  <w:pPr>
-                    <w:spacing w:before="0" w:after="40" w:line="200" w:lineRule="auto"/>
-                    <w:jc w:val="both"/>
-                    <w:rPr>
-                      <w:sz w:val="16"/>
-                      <w:szCs w:val="16"/>
-                    </w:rPr>
-                  </w:pPr>
-                  <w:r>
-                    <w:rPr>
-                      <w:rFonts w:ascii="Georgia" w:cs="Georgia" w:eastAsia="Georgia" w:hAnsi="Georgia"/>
-                      <w:b w:val="1"/>
-                      <w:bCs w:val="1"/>
-                      <w:i w:val="0"/>
-                      <w:iCs w:val="0"/>
-                      <w:color w:val="000000"/>
-                      <w:sz w:val="16"/>
-                      <w:szCs w:val="16"/>
-                      <w:rtl w:val="0"/>
-                    </w:rPr>
-                    <w:t xml:space="preserve">FALSE POSITIVE (Strikethrough)</w:t>
-                  </w:r>
-                  <w:r>
-                    <w:rPr>
-                      <w:rtl w:val="0"/>
-                      <w:sz w:val="16"/>
-                      <w:szCs w:val="16"/>
-                      <w:rFonts w:ascii="Georgia" w:hAnsi="Georgia"/>
-                    </w:rPr>
-                  </w:r>
-                </w:p>
-                <w:p>
-                  <w:pPr>
-                    <w:spacing w:before="0" w:after="40" w:line="200" w:lineRule="auto"/>
-                    <w:jc w:val="both"/>
-                    <w:rPr>
-                      <w:sz w:val="16"/>
-                      <w:szCs w:val="16"/>
-                    </w:rPr>
-                  </w:pPr>
-                  <w:r>
-                    <w:rPr>
-                      <w:rFonts w:ascii="Georgia" w:cs="Georgia" w:eastAsia="Georgia" w:hAnsi="Georgia"/>
-                      <w:b w:val="0"/>
-                      <w:bCs w:val="0"/>
-                      <w:i w:val="0"/>
-                      <w:iCs w:val="0"/>
-                      <w:color w:val="000000"/>
-                      <w:sz w:val="16"/>
-                      <w:szCs w:val="16"/>
-                      <w:rtl w:val="0"/>
-                    </w:rPr>
-                    <w:t xml:space="preserve">No highlight. Strike through the token and write the reason code in grey text.</w:t>
-                  </w:r>
-                  <w:r>
-                    <w:rPr>
-                      <w:rtl w:val="0"/>
-                      <w:sz w:val="16"/>
-                      <w:szCs w:val="16"/>
-                      <w:rFonts w:ascii="Georgia" w:hAnsi="Georgia"/>
-                    </w:rPr>
-                  </w:r>
-                </w:p>
-              </w:tc>
-            </w:tr>
-          </w:tbl>
+          <w:p>
+            <w:pPr>
+              <w:spacing w:before="0" w:after="40" w:line="200" w:lineRule="auto"/>
+              <w:jc w:val="both"/>
+              <w:rPr/>
+            </w:pPr>
+            <w:r>
+              <w:rPr>
+                <w:rFonts w:ascii="Georgia" w:cs="Georgia" w:eastAsia="Georgia" w:hAnsi="Georgia"/>
+                <w:b w:val="1"/>
+                <w:bCs w:val="1"/>
+                <w:i w:val="0"/>
+                <w:iCs w:val="0"/>
+                <w:color w:val="7030a0"/>
+                <w:sz w:val="14"/>
+                <w:szCs w:val="14"/>
+                <w:rtl w:val="0"/>
+              </w:rPr>
+              <w:t xml:space="preserve">P</w:t>
+            </w:r>
+            <w:r>
+              <w:rPr>
+                <w:rFonts w:ascii="Georgia" w:cs="Georgia" w:eastAsia="Georgia" w:hAnsi="Georgia"/>
+                <w:b w:val="0"/>
+                <w:bCs w:val="0"/>
+                <w:i w:val="0"/>
+                <w:iCs w:val="0"/>
+                <w:color w:val="000000"/>
+                <w:sz w:val="14"/>
+                <w:szCs w:val="14"/>
+                <w:rtl w:val="0"/>
+              </w:rPr>
+              <w:t xml:space="preserve">  Politeness / Deference</w:t>
+            </w:r>
+            <w:r>
+              <w:rPr>
+                <w:rtl w:val="0"/>
+                <w:sz w:val="14"/>
+                <w:szCs w:val="14"/>
+                <w:rFonts w:ascii="Georgia" w:hAnsi="Georgia"/>
+              </w:rPr>
+            </w:r>
+          </w:p>
+          <w:p>
+            <w:pPr>
+              <w:spacing w:before="0" w:after="40" w:line="200" w:lineRule="auto"/>
+              <w:jc w:val="both"/>
+              <w:rPr/>
+            </w:pPr>
+            <w:r>
+              <w:rPr>
+                <w:rFonts w:ascii="Georgia" w:cs="Georgia" w:eastAsia="Georgia" w:hAnsi="Georgia"/>
+                <w:b w:val="1"/>
+                <w:bCs w:val="1"/>
+                <w:i w:val="0"/>
+                <w:iCs w:val="0"/>
+                <w:color w:val="00b0f0"/>
+                <w:sz w:val="14"/>
+                <w:szCs w:val="14"/>
+                <w:rtl w:val="0"/>
+              </w:rPr>
+              <w:t xml:space="preserve">DO</w:t>
+            </w:r>
+            <w:r>
+              <w:rPr>
+                <w:rFonts w:ascii="Georgia" w:cs="Georgia" w:eastAsia="Georgia" w:hAnsi="Georgia"/>
+                <w:b w:val="0"/>
+                <w:bCs w:val="0"/>
+                <w:i w:val="0"/>
+                <w:iCs w:val="0"/>
+                <w:color w:val="000000"/>
+                <w:sz w:val="14"/>
+                <w:szCs w:val="14"/>
+                <w:rtl w:val="0"/>
+              </w:rPr>
+              <w:t xml:space="preserve">  Discourse Organization</w:t>
+            </w:r>
+            <w:r>
+              <w:rPr>
+                <w:rtl w:val="0"/>
+                <w:sz w:val="14"/>
+                <w:szCs w:val="14"/>
+                <w:rFonts w:ascii="Georgia" w:hAnsi="Georgia"/>
+              </w:rPr>
+            </w:r>
+          </w:p>
+        </w:tc>
+      </w:tr>
+      <w:tr>
+        <w:trPr>
+          <w:cantSplit w:val="1"/>
+          <w:tblHeader w:val="0"/>
+        </w:trPr>
+        <w:tc>
+          <w:tcPr/>
+          <w:p>
+            <w:pPr>
+              <w:spacing w:before="0" w:after="40" w:line="200" w:lineRule="auto"/>
+              <w:jc w:val="both"/>
+              <w:rPr/>
+            </w:pPr>
+            <w:r>
+              <w:rPr>
+                <w:rFonts w:ascii="Georgia" w:cs="Georgia" w:eastAsia="Georgia" w:hAnsi="Georgia"/>
+                <w:b w:val="1"/>
+                <w:bCs w:val="1"/>
+                <w:i w:val="0"/>
+                <w:iCs w:val="0"/>
+                <w:color w:val="000000"/>
+                <w:sz w:val="14"/>
+                <w:szCs w:val="14"/>
+                <w:rtl w:val="0"/>
+              </w:rPr>
+              <w:t xml:space="preserve">UNHEDGED SITES (Grey Highlight, Optional)</w:t>
+            </w:r>
+            <w:r>
+              <w:rPr>
+                <w:rtl w:val="0"/>
+                <w:sz w:val="14"/>
+                <w:szCs w:val="14"/>
+                <w:rFonts w:ascii="Georgia" w:hAnsi="Georgia"/>
+              </w:rPr>
+            </w:r>
+          </w:p>
+          <w:p>
+            <w:pPr>
+              <w:spacing w:before="0" w:after="40" w:line="200" w:lineRule="auto"/>
+              <w:jc w:val="both"/>
+              <w:rPr/>
+            </w:pPr>
+            <w:r>
+              <w:rPr>
+                <w:rFonts w:ascii="Georgia" w:cs="Georgia" w:eastAsia="Georgia" w:hAnsi="Georgia"/>
+                <w:sz w:val="14"/>
+                <w:szCs w:val="14"/>
+                <w:shd w:fill="bfbfbf" w:val="clear"/>
+                <w:rtl w:val="0"/>
+              </w:rPr>
+              <w:t xml:space="preserve">      </w:t>
+            </w:r>
+            <w:r>
+              <w:rPr>
+                <w:rFonts w:ascii="Georgia" w:cs="Georgia" w:eastAsia="Georgia" w:hAnsi="Georgia"/>
+                <w:b w:val="0"/>
+                <w:bCs w:val="0"/>
+                <w:i w:val="0"/>
+                <w:iCs w:val="0"/>
+                <w:color w:val="000000"/>
+                <w:sz w:val="14"/>
+                <w:szCs w:val="14"/>
+                <w:rtl w:val="0"/>
+              </w:rPr>
+              <w:t xml:space="preserve">  R = Result, G = Generalization, C = Causal. Bracket the subtype beside the mark.</w:t>
+            </w:r>
+            <w:r>
+              <w:rPr>
+                <w:rtl w:val="0"/>
+                <w:sz w:val="14"/>
+                <w:szCs w:val="14"/>
+                <w:rFonts w:ascii="Georgia" w:hAnsi="Georgia"/>
+              </w:rPr>
+            </w:r>
+          </w:p>
+        </w:tc>
+        <w:tc>
+          <w:tcPr/>
+          <w:p>
+            <w:pPr>
+              <w:spacing w:before="0" w:after="40" w:line="200" w:lineRule="auto"/>
+              <w:jc w:val="both"/>
+              <w:rPr/>
+            </w:pPr>
+            <w:r>
+              <w:rPr>
+                <w:rFonts w:ascii="Georgia" w:cs="Georgia" w:eastAsia="Georgia" w:hAnsi="Georgia"/>
+                <w:b w:val="1"/>
+                <w:bCs w:val="1"/>
+                <w:i w:val="0"/>
+                <w:iCs w:val="0"/>
+                <w:color w:val="000000"/>
+                <w:sz w:val="14"/>
+                <w:szCs w:val="14"/>
+                <w:rtl w:val="0"/>
+              </w:rPr>
+              <w:t xml:space="preserve">FALSE POSITIVE (Strikethrough)</w:t>
+            </w:r>
+            <w:r>
+              <w:rPr>
+                <w:rtl w:val="0"/>
+                <w:sz w:val="14"/>
+                <w:szCs w:val="14"/>
+                <w:rFonts w:ascii="Georgia" w:hAnsi="Georgia"/>
+              </w:rPr>
+            </w:r>
+          </w:p>
+          <w:p>
+            <w:pPr>
+              <w:spacing w:before="0" w:after="40" w:line="200" w:lineRule="auto"/>
+              <w:jc w:val="both"/>
+              <w:rPr/>
+            </w:pPr>
+            <w:r>
+              <w:rPr>
+                <w:rFonts w:ascii="Georgia" w:cs="Georgia" w:eastAsia="Georgia" w:hAnsi="Georgia"/>
+                <w:b w:val="0"/>
+                <w:bCs w:val="0"/>
+                <w:i w:val="0"/>
+                <w:iCs w:val="0"/>
+                <w:color w:val="000000"/>
+                <w:sz w:val="14"/>
+                <w:szCs w:val="14"/>
+                <w:rtl w:val="0"/>
+              </w:rPr>
+              <w:t xml:space="preserve">No highlight. Strike through the token and write the reason code in grey text.</w:t>
+            </w:r>
+            <w:r>
+              <w:rPr>
+                <w:rtl w:val="0"/>
+                <w:sz w:val="14"/>
+                <w:szCs w:val="14"/>
+                <w:rFonts w:ascii="Georgia" w:hAnsi="Georgia"/>
+              </w:rPr>
+            </w:r>
+          </w:p>
         </w:tc>
       </w:tr>
     </w:tbl>
     <w:p>
       <w:pPr>
         <w:keepNext w:val="1"/>
-        <w:spacing w:before="20" w:after="20" w:line="240" w:lineRule="auto"/>
+        <w:spacing w:before="0" w:after="40" w:line="200" w:lineRule="auto"/>
         <w:jc w:val="left"/>
         <w:rPr/>
       </w:pPr>
@@ -11221,21 +11071,22 @@
           <w:i w:val="0"/>
           <w:iCs w:val="0"/>
           <w:sz w:val="16"/>
-          <w:szCs w:val="24"/>
+          <w:szCs w:val="16"/>
           <w:rtl w:val="0"/>
         </w:rPr>
         <w:t xml:space="preserve">COMBINED EXAMPLE</w:t>
       </w:r>
       <w:r>
         <w:rPr>
+          <w:rtl w:val="0"/>
           <w:sz w:val="16"/>
-          <w:rtl w:val="0"/>
-        </w:rPr>
-      </w:r>
-    </w:p>
-    <w:p>
-      <w:pPr>
-        <w:spacing w:before="20" w:after="20" w:line="240" w:lineRule="auto"/>
+          <w:szCs w:val="16"/>
+        </w:rPr>
+      </w:r>
+    </w:p>
+    <w:p>
+      <w:pPr>
+        <w:spacing w:before="0" w:after="40" w:line="200" w:lineRule="auto"/>
         <w:ind w:firstLine="720"/>
         <w:jc w:val="both"/>
         <w:rPr/>
@@ -11249,7 +11100,7 @@
           <w:iCs w:val="1"/>
           <w:color w:val="000000"/>
           <w:sz w:val="16"/>
-          <w:szCs w:val="22"/>
+          <w:szCs w:val="16"/>
           <w:rtl w:val="0"/>
         </w:rPr>
         <w:t xml:space="preserve">Combined example, as marked on a hard copy. </w:t>
@@ -11263,7 +11114,7 @@
           <w:iCs w:val="0"/>
           <w:color w:val="000000"/>
           <w:sz w:val="16"/>
-          <w:szCs w:val="22"/>
+          <w:szCs w:val="16"/>
           <w:rtl w:val="0"/>
         </w:rPr>
         <w:t xml:space="preserve">“The results </w:t>
@@ -11276,7 +11127,7 @@
           <w:strike w:val="0"/>
           <w:color w:val="ffffff"/>
           <w:sz w:val="16"/>
-          <w:szCs w:val="22"/>
+          <w:szCs w:val="16"/>
           <w:highlight w:val="red"/>
           <w:rtl w:val="0"/>
         </w:rPr>
@@ -11291,7 +11142,7 @@
           <w:iCs w:val="0"/>
           <w:color w:val="000000"/>
           <w:sz w:val="16"/>
-          <w:szCs w:val="22"/>
+          <w:szCs w:val="16"/>
           <w:rtl w:val="0"/>
         </w:rPr>
         <w:t xml:space="preserve"> </w:t>
@@ -11305,7 +11156,7 @@
           <w:iCs w:val="0"/>
           <w:color w:val="ed7d31"/>
           <w:sz w:val="16"/>
-          <w:szCs w:val="22"/>
+          <w:szCs w:val="16"/>
           <w:rtl w:val="0"/>
         </w:rPr>
         <w:t xml:space="preserve">(EC)</w:t>
@@ -11319,7 +11170,7 @@
           <w:iCs w:val="0"/>
           <w:color w:val="000000"/>
           <w:sz w:val="16"/>
-          <w:szCs w:val="22"/>
+          <w:szCs w:val="16"/>
           <w:rtl w:val="0"/>
         </w:rPr>
         <w:t xml:space="preserve"> that C. longa extracts are </w:t>
@@ -11332,7 +11183,7 @@
           <w:strike w:val="1"/>
           <w:color w:val="000000"/>
           <w:sz w:val="16"/>
-          <w:szCs w:val="22"/>
+          <w:szCs w:val="16"/>
           <w:rtl w:val="0"/>
         </w:rPr>
         <w:t xml:space="preserve">potential</w:t>
@@ -11346,7 +11197,7 @@
           <w:iCs w:val="0"/>
           <w:color w:val="000000"/>
           <w:sz w:val="16"/>
-          <w:szCs w:val="22"/>
+          <w:szCs w:val="16"/>
           <w:rtl w:val="0"/>
         </w:rPr>
         <w:t xml:space="preserve"> </w:t>
@@ -11360,7 +11211,7 @@
           <w:iCs w:val="0"/>
           <w:color w:val="808080"/>
           <w:sz w:val="16"/>
-          <w:szCs w:val="22"/>
+          <w:szCs w:val="16"/>
           <w:rtl w:val="0"/>
         </w:rPr>
         <w:t xml:space="preserve">(FP-Gen)</w:t>
@@ -11374,7 +11225,7 @@
           <w:iCs w:val="0"/>
           <w:color w:val="000000"/>
           <w:sz w:val="16"/>
-          <w:szCs w:val="22"/>
+          <w:szCs w:val="16"/>
           <w:rtl w:val="0"/>
         </w:rPr>
         <w:t xml:space="preserve"> alternative stains. PCR </w:t>
@@ -11387,7 +11238,7 @@
           <w:strike w:val="1"/>
           <w:color w:val="000000"/>
           <w:sz w:val="16"/>
-          <w:szCs w:val="22"/>
+          <w:szCs w:val="16"/>
           <w:rtl w:val="0"/>
         </w:rPr>
         <w:t xml:space="preserve">can</w:t>
@@ -11401,7 +11252,7 @@
           <w:iCs w:val="0"/>
           <w:color w:val="000000"/>
           <w:sz w:val="16"/>
-          <w:szCs w:val="22"/>
+          <w:szCs w:val="16"/>
           <w:rtl w:val="0"/>
         </w:rPr>
         <w:t xml:space="preserve"> </w:t>
@@ -11415,7 +11266,7 @@
           <w:iCs w:val="0"/>
           <w:color w:val="808080"/>
           <w:sz w:val="16"/>
-          <w:szCs w:val="22"/>
+          <w:szCs w:val="16"/>
           <w:rtl w:val="0"/>
         </w:rPr>
         <w:t xml:space="preserve">(FP-Cap)</w:t>
@@ -11429,7 +11280,7 @@
           <w:iCs w:val="0"/>
           <w:color w:val="000000"/>
           <w:sz w:val="16"/>
-          <w:szCs w:val="22"/>
+          <w:szCs w:val="16"/>
           <w:rtl w:val="0"/>
         </w:rPr>
         <w:t xml:space="preserve"> also detect low concentrations, while a prior line stated flatly that </w:t>
@@ -11442,7 +11293,7 @@
           <w:strike w:val="0"/>
           <w:color w:val="000000"/>
           <w:sz w:val="16"/>
-          <w:szCs w:val="22"/>
+          <w:szCs w:val="16"/>
           <w:shd w:fill="bfbfbf" w:val="clear"/>
           <w:rtl w:val="0"/>
         </w:rPr>
@@ -11457,7 +11308,7 @@
           <w:iCs w:val="0"/>
           <w:color w:val="000000"/>
           <w:sz w:val="16"/>
-          <w:szCs w:val="22"/>
+          <w:szCs w:val="16"/>
           <w:rtl w:val="0"/>
         </w:rPr>
         <w:t xml:space="preserve"> </w:t>
@@ -11471,7 +11322,7 @@
           <w:iCs w:val="0"/>
           <w:color w:val="000000"/>
           <w:sz w:val="16"/>
-          <w:szCs w:val="22"/>
+          <w:szCs w:val="16"/>
           <w:rtl w:val="0"/>
         </w:rPr>
         <w:t xml:space="preserve">[R]</w:t>
@@ -11485,80 +11336,84 @@
           <w:iCs w:val="0"/>
           <w:color w:val="000000"/>
           <w:sz w:val="16"/>
-          <w:szCs w:val="22"/>
+          <w:szCs w:val="16"/>
           <w:rtl w:val="0"/>
         </w:rPr>
         <w:t xml:space="preserve"> no infection.”</w:t>
       </w:r>
       <w:r>
         <w:rPr>
+          <w:rtl w:val="0"/>
           <w:sz w:val="16"/>
-          <w:rtl w:val="0"/>
-        </w:rPr>
-      </w:r>
-    </w:p>
-    <w:p>
-      <w:pPr>
-        <w:spacing w:before="20" w:after="20" w:line="240" w:lineRule="auto"/>
+          <w:szCs w:val="16"/>
+        </w:rPr>
+      </w:r>
+    </w:p>
+    <w:p>
+      <w:pPr>
+        <w:spacing w:before="0" w:after="40" w:line="200" w:lineRule="auto"/>
         <w:ind w:firstLine="720"/>
         <w:jc w:val="both"/>
         <w:rPr/>
       </w:pPr>
       <w:r>
         <w:rPr>
+          <w:i w:val="1"/>
+          <w:iCs w:val="1"/>
+          <w:color w:val="404040"/>
+          <w:rtl w:val="0"/>
+          <w:sz w:val="16"/>
+          <w:szCs w:val="16"/>
+        </w:rPr>
+        <w:t xml:space="preserve">R</w:t>
+      </w:r>
+      <w:r>
+        <w:rPr>
+          <w:rFonts w:ascii="Georgia" w:cs="Georgia" w:eastAsia="Georgia" w:hAnsi="Georgia"/>
+          <w:b w:val="0"/>
+          <w:bCs w:val="0"/>
           <w:i w:val="1"/>
           <w:iCs w:val="1"/>
           <w:color w:val="404040"/>
           <w:sz w:val="16"/>
-          <w:rtl w:val="0"/>
-        </w:rPr>
-        <w:t xml:space="preserve">R</w:t>
-      </w:r>
-      <w:r>
-        <w:rPr>
-          <w:rFonts w:ascii="Georgia" w:cs="Georgia" w:eastAsia="Georgia" w:hAnsi="Georgia"/>
-          <w:b w:val="0"/>
-          <w:bCs w:val="0"/>
-          <w:i w:val="1"/>
-          <w:iCs w:val="1"/>
-          <w:color w:val="404040"/>
+          <w:szCs w:val="16"/>
+          <w:rtl w:val="0"/>
+        </w:rPr>
+        <w:t xml:space="preserve">ed highlights mark type. Orange text marks function. The strikethrough marks a rejected candidate. Grey highlight marks an unhedged site. Here, “potential” is struck because it names a research property, not a hedge on the claim.</w:t>
+      </w:r>
+      <w:r>
+        <w:rPr>
+          <w:rtl w:val="0"/>
           <w:sz w:val="16"/>
-          <w:szCs w:val="22"/>
-          <w:rtl w:val="0"/>
-        </w:rPr>
-        <w:t xml:space="preserve">ed highlights mark type. Orange text marks function. The strikethrough marks a rejected candidate. Grey highlight marks an unhedged site. Here, “potential” is struck because it names a research property, not a hedge on the claim.</w:t>
-      </w:r>
-      <w:r>
-        <w:rPr>
+          <w:szCs w:val="16"/>
+        </w:rPr>
+      </w:r>
+    </w:p>
+    <w:p>
+      <w:pPr>
+        <w:keepNext w:val="1"/>
+        <w:spacing w:before="0" w:after="40" w:line="200" w:lineRule="auto"/>
+        <w:jc w:val="left"/>
+        <w:rPr/>
+      </w:pPr>
+      <w:r>
+        <w:rPr>
+          <w:rFonts w:ascii="Georgia" w:cs="Georgia" w:eastAsia="Georgia" w:hAnsi="Georgia"/>
+          <w:b w:val="1"/>
+          <w:bCs w:val="1"/>
+          <w:i w:val="0"/>
+          <w:iCs w:val="0"/>
           <w:sz w:val="16"/>
-          <w:rtl w:val="0"/>
-        </w:rPr>
-      </w:r>
-    </w:p>
-    <w:p>
-      <w:pPr>
-        <w:keepNext w:val="1"/>
-        <w:spacing w:before="20" w:after="20" w:line="240" w:lineRule="auto"/>
-        <w:jc w:val="left"/>
-        <w:rPr/>
-      </w:pPr>
-      <w:r>
-        <w:rPr>
-          <w:rFonts w:ascii="Georgia" w:cs="Georgia" w:eastAsia="Georgia" w:hAnsi="Georgia"/>
-          <w:b w:val="1"/>
-          <w:bCs w:val="1"/>
-          <w:i w:val="0"/>
-          <w:iCs w:val="0"/>
+          <w:szCs w:val="16"/>
+          <w:rtl w:val="0"/>
+        </w:rPr>
+        <w:t xml:space="preserve">CODING SHEET COLUMNS</w:t>
+      </w:r>
+      <w:r>
+        <w:rPr>
+          <w:rtl w:val="0"/>
           <w:sz w:val="16"/>
-          <w:szCs w:val="24"/>
-          <w:rtl w:val="0"/>
-        </w:rPr>
-        <w:t xml:space="preserve">CODING SHEET COLUMNS</w:t>
-      </w:r>
-      <w:r>
-        <w:rPr>
-          <w:sz w:val="16"/>
-          <w:rtl w:val="0"/>
+          <w:szCs w:val="16"/>
         </w:rPr>
       </w:r>
     </w:p>
@@ -11566,7 +11421,7 @@
       <w:pPr>
         <w:keepNext w:val="1"/>
         <w:keepLines w:val="1"/>
-        <w:spacing w:before="20" w:after="20" w:line="240" w:lineRule="auto"/>
+        <w:spacing w:before="0" w:after="40" w:line="200" w:lineRule="auto"/>
         <w:ind w:firstLine="720"/>
         <w:jc w:val="both"/>
         <w:rPr/>
@@ -11579,15 +11434,16 @@
           <w:i w:val="0"/>
           <w:iCs w:val="0"/>
           <w:sz w:val="16"/>
-          <w:szCs w:val="22"/>
+          <w:szCs w:val="16"/>
           <w:rtl w:val="0"/>
         </w:rPr>
         <w:t xml:space="preserve">The original highlighted abstract is the primary, authoritative coding record. This spreadsheet is for tallying, organization, and analysis only, not a substitute record.</w:t>
       </w:r>
       <w:r>
         <w:rPr>
+          <w:rtl w:val="0"/>
           <w:sz w:val="16"/>
-          <w:rtl w:val="0"/>
+          <w:szCs w:val="16"/>
         </w:rPr>
       </w:r>
     </w:p>
@@ -11644,12 +11500,9 @@
           </w:tcPr>
           <w:p>
             <w:pPr>
-              <w:spacing w:before="0" w:after="0" w:line="180" w:lineRule="auto"/>
+              <w:spacing w:before="0" w:after="40" w:line="200" w:lineRule="auto"/>
               <w:jc w:val="both"/>
-              <w:rPr>
-                <w:sz w:val="14"/>
-                <w:szCs w:val="14"/>
-              </w:rPr>
+              <w:rPr/>
             </w:pPr>
             <w:r>
               <w:rPr>
@@ -11681,12 +11534,9 @@
           </w:tcPr>
           <w:p>
             <w:pPr>
-              <w:spacing w:before="0" w:after="0" w:line="180" w:lineRule="auto"/>
+              <w:spacing w:before="0" w:after="40" w:line="200" w:lineRule="auto"/>
               <w:jc w:val="both"/>
-              <w:rPr>
-                <w:sz w:val="14"/>
-                <w:szCs w:val="14"/>
-              </w:rPr>
+              <w:rPr/>
             </w:pPr>
             <w:r>
               <w:rPr>
@@ -11718,12 +11568,9 @@
           </w:tcPr>
           <w:p>
             <w:pPr>
-              <w:spacing w:before="0" w:after="0" w:line="180" w:lineRule="auto"/>
+              <w:spacing w:before="0" w:after="40" w:line="200" w:lineRule="auto"/>
               <w:jc w:val="both"/>
-              <w:rPr>
-                <w:sz w:val="14"/>
-                <w:szCs w:val="14"/>
-              </w:rPr>
+              <w:rPr/>
             </w:pPr>
             <w:r>
               <w:rPr>
@@ -11755,12 +11602,9 @@
           </w:tcPr>
           <w:p>
             <w:pPr>
-              <w:spacing w:before="0" w:after="0" w:line="180" w:lineRule="auto"/>
+              <w:spacing w:before="0" w:after="40" w:line="200" w:lineRule="auto"/>
               <w:jc w:val="both"/>
-              <w:rPr>
-                <w:sz w:val="14"/>
-                <w:szCs w:val="14"/>
-              </w:rPr>
+              <w:rPr/>
             </w:pPr>
             <w:r>
               <w:rPr>
@@ -11792,12 +11636,9 @@
           </w:tcPr>
           <w:p>
             <w:pPr>
-              <w:spacing w:before="0" w:after="0" w:line="180" w:lineRule="auto"/>
+              <w:spacing w:before="0" w:after="40" w:line="200" w:lineRule="auto"/>
               <w:jc w:val="both"/>
-              <w:rPr>
-                <w:sz w:val="14"/>
-                <w:szCs w:val="14"/>
-              </w:rPr>
+              <w:rPr/>
             </w:pPr>
             <w:r>
               <w:rPr>
@@ -11829,12 +11670,9 @@
           </w:tcPr>
           <w:p>
             <w:pPr>
-              <w:spacing w:before="0" w:after="0" w:line="180" w:lineRule="auto"/>
+              <w:spacing w:before="0" w:after="40" w:line="200" w:lineRule="auto"/>
               <w:jc w:val="both"/>
-              <w:rPr>
-                <w:sz w:val="14"/>
-                <w:szCs w:val="14"/>
-              </w:rPr>
+              <w:rPr/>
             </w:pPr>
             <w:r>
               <w:rPr>
@@ -11866,12 +11704,9 @@
           </w:tcPr>
           <w:p>
             <w:pPr>
-              <w:spacing w:before="0" w:after="0" w:line="180" w:lineRule="auto"/>
+              <w:spacing w:before="0" w:after="40" w:line="200" w:lineRule="auto"/>
               <w:jc w:val="both"/>
-              <w:rPr>
-                <w:sz w:val="14"/>
-                <w:szCs w:val="14"/>
-              </w:rPr>
+              <w:rPr/>
             </w:pPr>
             <w:r>
               <w:rPr>
@@ -11903,12 +11738,9 @@
           </w:tcPr>
           <w:p>
             <w:pPr>
-              <w:spacing w:before="0" w:after="0" w:line="180" w:lineRule="auto"/>
+              <w:spacing w:before="0" w:after="40" w:line="200" w:lineRule="auto"/>
               <w:jc w:val="both"/>
-              <w:rPr>
-                <w:sz w:val="14"/>
-                <w:szCs w:val="14"/>
-              </w:rPr>
+              <w:rPr/>
             </w:pPr>
             <w:r>
               <w:rPr>
@@ -11941,12 +11773,9 @@
           <w:tcPr/>
           <w:p>
             <w:pPr>
-              <w:spacing w:before="0" w:after="0" w:line="180" w:lineRule="auto"/>
+              <w:spacing w:before="0" w:after="40" w:line="200" w:lineRule="auto"/>
               <w:jc w:val="left"/>
-              <w:rPr>
-                <w:sz w:val="14"/>
-                <w:szCs w:val="14"/>
-              </w:rPr>
+              <w:rPr/>
             </w:pPr>
             <w:r>
               <w:rPr>
@@ -11971,12 +11800,9 @@
           <w:tcPr/>
           <w:p>
             <w:pPr>
-              <w:spacing w:before="0" w:after="0" w:line="180" w:lineRule="auto"/>
+              <w:spacing w:before="0" w:after="40" w:line="200" w:lineRule="auto"/>
               <w:jc w:val="left"/>
-              <w:rPr>
-                <w:sz w:val="14"/>
-                <w:szCs w:val="14"/>
-              </w:rPr>
+              <w:rPr/>
             </w:pPr>
             <w:r>
               <w:rPr>
@@ -12001,12 +11827,9 @@
           <w:tcPr/>
           <w:p>
             <w:pPr>
-              <w:spacing w:before="0" w:after="0" w:line="180" w:lineRule="auto"/>
+              <w:spacing w:before="0" w:after="40" w:line="200" w:lineRule="auto"/>
               <w:jc w:val="left"/>
-              <w:rPr>
-                <w:sz w:val="14"/>
-                <w:szCs w:val="14"/>
-              </w:rPr>
+              <w:rPr/>
             </w:pPr>
             <w:r>
               <w:rPr>
@@ -12031,12 +11854,9 @@
           <w:tcPr/>
           <w:p>
             <w:pPr>
-              <w:spacing w:before="0" w:after="0" w:line="180" w:lineRule="auto"/>
+              <w:spacing w:before="0" w:after="40" w:line="200" w:lineRule="auto"/>
               <w:jc w:val="left"/>
-              <w:rPr>
-                <w:sz w:val="14"/>
-                <w:szCs w:val="14"/>
-              </w:rPr>
+              <w:rPr/>
             </w:pPr>
             <w:r>
               <w:rPr>
@@ -12061,12 +11881,9 @@
           <w:tcPr/>
           <w:p>
             <w:pPr>
-              <w:spacing w:before="0" w:after="0" w:line="180" w:lineRule="auto"/>
+              <w:spacing w:before="0" w:after="40" w:line="200" w:lineRule="auto"/>
               <w:jc w:val="left"/>
-              <w:rPr>
-                <w:sz w:val="14"/>
-                <w:szCs w:val="14"/>
-              </w:rPr>
+              <w:rPr/>
             </w:pPr>
             <w:r>
               <w:rPr>
@@ -12091,12 +11908,9 @@
           <w:tcPr/>
           <w:p>
             <w:pPr>
-              <w:spacing w:before="0" w:after="0" w:line="180" w:lineRule="auto"/>
+              <w:spacing w:before="0" w:after="40" w:line="200" w:lineRule="auto"/>
               <w:jc w:val="left"/>
-              <w:rPr>
-                <w:sz w:val="14"/>
-                <w:szCs w:val="14"/>
-              </w:rPr>
+              <w:rPr/>
             </w:pPr>
             <w:r>
               <w:rPr>
@@ -12121,12 +11935,9 @@
           <w:tcPr/>
           <w:p>
             <w:pPr>
-              <w:spacing w:before="0" w:after="0" w:line="180" w:lineRule="auto"/>
+              <w:spacing w:before="0" w:after="40" w:line="200" w:lineRule="auto"/>
               <w:jc w:val="left"/>
-              <w:rPr>
-                <w:sz w:val="14"/>
-                <w:szCs w:val="14"/>
-              </w:rPr>
+              <w:rPr/>
             </w:pPr>
             <w:r>
               <w:rPr>
@@ -12151,12 +11962,9 @@
           <w:tcPr/>
           <w:p>
             <w:pPr>
-              <w:spacing w:before="0" w:after="0" w:line="180" w:lineRule="auto"/>
+              <w:spacing w:before="0" w:after="40" w:line="200" w:lineRule="auto"/>
               <w:jc w:val="left"/>
-              <w:rPr>
-                <w:sz w:val="14"/>
-                <w:szCs w:val="14"/>
-              </w:rPr>
+              <w:rPr/>
             </w:pPr>
             <w:r>
               <w:rPr>
@@ -12181,7 +11989,7 @@
     </w:tbl>
     <w:p>
       <w:pPr>
-        <w:spacing w:before="20" w:after="20" w:line="240" w:lineRule="auto"/>
+        <w:spacing w:before="0" w:after="40" w:line="200" w:lineRule="auto"/>
         <w:ind w:firstLine="720"/>
         <w:jc w:val="both"/>
         <w:rPr/>
@@ -12195,21 +12003,22 @@
           <w:iCs w:val="1"/>
           <w:color w:val="000000"/>
           <w:sz w:val="16"/>
-          <w:szCs w:val="22"/>
+          <w:szCs w:val="16"/>
           <w:rtl w:val="0"/>
         </w:rPr>
         <w:t xml:space="preserve">Discipline codes: Acs1 to A10 and Aas1 to A10 (Agriculture), VM1 to VM20 (Veterinary Medicine), B1 to B20 (Biology).</w:t>
       </w:r>
       <w:r>
         <w:rPr>
+          <w:rtl w:val="0"/>
           <w:sz w:val="16"/>
-          <w:rtl w:val="0"/>
-        </w:rPr>
-      </w:r>
-    </w:p>
-    <w:p>
-      <w:pPr>
-        <w:spacing w:before="20" w:after="20" w:line="240" w:lineRule="auto"/>
+          <w:szCs w:val="16"/>
+        </w:rPr>
+      </w:r>
+    </w:p>
+    <w:p>
+      <w:pPr>
+        <w:spacing w:before="0" w:after="40" w:line="200" w:lineRule="auto"/>
         <w:ind w:firstLine="720"/>
         <w:jc w:val="both"/>
         <w:rPr/>
@@ -12223,15 +12032,16 @@
           <w:iCs w:val="1"/>
           <w:color w:val="000000"/>
           <w:sz w:val="16"/>
-          <w:szCs w:val="22"/>
+          <w:szCs w:val="16"/>
           <w:rtl w:val="0"/>
         </w:rPr>
         <w:t xml:space="preserve">Layer 3 data, tracked separately so it never inflates RQ2 counts.</w:t>
       </w:r>
       <w:r>
         <w:rPr>
+          <w:rtl w:val="0"/>
           <w:sz w:val="16"/>
-          <w:rtl w:val="0"/>
+          <w:szCs w:val="16"/>
         </w:rPr>
       </w:r>
     </w:p>
@@ -12239,7 +12049,7 @@
       <w:pPr>
         <w:keepNext w:val="1"/>
         <w:keepLines w:val="1"/>
-        <w:spacing w:before="20" w:after="20" w:line="240" w:lineRule="auto"/>
+        <w:spacing w:before="0" w:after="40" w:line="200" w:lineRule="auto"/>
         <w:jc w:val="left"/>
         <w:rPr/>
       </w:pPr>
@@ -12251,15 +12061,16 @@
           <w:i w:val="1"/>
           <w:iCs w:val="1"/>
           <w:sz w:val="16"/>
-          <w:szCs w:val="24"/>
+          <w:szCs w:val="16"/>
           <w:rtl w:val="0"/>
         </w:rPr>
         <w:t xml:space="preserve">Optional Tab: Unhedged Assertion Sites</w:t>
       </w:r>
       <w:r>
         <w:rPr>
+          <w:rtl w:val="0"/>
           <w:sz w:val="16"/>
-          <w:rtl w:val="0"/>
+          <w:szCs w:val="16"/>
         </w:rPr>
       </w:r>
     </w:p>
@@ -12312,12 +12123,9 @@
           </w:tcPr>
           <w:p>
             <w:pPr>
-              <w:spacing w:before="0" w:after="0" w:line="180" w:lineRule="auto"/>
+              <w:spacing w:before="0" w:after="40" w:line="200" w:lineRule="auto"/>
               <w:jc w:val="both"/>
-              <w:rPr>
-                <w:sz w:val="14"/>
-                <w:szCs w:val="14"/>
-              </w:rPr>
+              <w:rPr/>
             </w:pPr>
             <w:r>
               <w:rPr>
@@ -12349,12 +12157,9 @@
           </w:tcPr>
           <w:p>
             <w:pPr>
-              <w:spacing w:before="0" w:after="0" w:line="180" w:lineRule="auto"/>
+              <w:spacing w:before="0" w:after="40" w:line="200" w:lineRule="auto"/>
               <w:jc w:val="both"/>
-              <w:rPr>
-                <w:sz w:val="14"/>
-                <w:szCs w:val="14"/>
-              </w:rPr>
+              <w:rPr/>
             </w:pPr>
             <w:r>
               <w:rPr>
@@ -12386,12 +12191,9 @@
           </w:tcPr>
           <w:p>
             <w:pPr>
-              <w:spacing w:before="0" w:after="0" w:line="180" w:lineRule="auto"/>
+              <w:spacing w:before="0" w:after="40" w:line="200" w:lineRule="auto"/>
               <w:jc w:val="both"/>
-              <w:rPr>
-                <w:sz w:val="14"/>
-                <w:szCs w:val="14"/>
-              </w:rPr>
+              <w:rPr/>
             </w:pPr>
             <w:r>
               <w:rPr>
@@ -12423,12 +12225,9 @@
           </w:tcPr>
           <w:p>
             <w:pPr>
-              <w:spacing w:before="0" w:after="0" w:line="180" w:lineRule="auto"/>
+              <w:spacing w:before="0" w:after="40" w:line="200" w:lineRule="auto"/>
               <w:jc w:val="both"/>
-              <w:rPr>
-                <w:sz w:val="14"/>
-                <w:szCs w:val="14"/>
-              </w:rPr>
+              <w:rPr/>
             </w:pPr>
             <w:r>
               <w:rPr>
@@ -12460,12 +12259,9 @@
           </w:tcPr>
           <w:p>
             <w:pPr>
-              <w:spacing w:before="0" w:after="0" w:line="180" w:lineRule="auto"/>
+              <w:spacing w:before="0" w:after="40" w:line="200" w:lineRule="auto"/>
               <w:jc w:val="both"/>
-              <w:rPr>
-                <w:sz w:val="14"/>
-                <w:szCs w:val="14"/>
-              </w:rPr>
+              <w:rPr/>
             </w:pPr>
             <w:r>
               <w:rPr>
@@ -12497,12 +12293,9 @@
           </w:tcPr>
           <w:p>
             <w:pPr>
-              <w:spacing w:before="0" w:after="0" w:line="180" w:lineRule="auto"/>
+              <w:spacing w:before="0" w:after="40" w:line="200" w:lineRule="auto"/>
               <w:jc w:val="both"/>
-              <w:rPr>
-                <w:sz w:val="14"/>
-                <w:szCs w:val="14"/>
-              </w:rPr>
+              <w:rPr/>
             </w:pPr>
             <w:r>
               <w:rPr>
@@ -12535,12 +12328,9 @@
           <w:tcPr/>
           <w:p>
             <w:pPr>
-              <w:spacing w:before="0" w:after="0" w:line="180" w:lineRule="auto"/>
+              <w:spacing w:before="0" w:after="40" w:line="200" w:lineRule="auto"/>
               <w:jc w:val="left"/>
-              <w:rPr>
-                <w:sz w:val="14"/>
-                <w:szCs w:val="14"/>
-              </w:rPr>
+              <w:rPr/>
             </w:pPr>
             <w:r>
               <w:rPr>
@@ -12565,12 +12355,9 @@
           <w:tcPr/>
           <w:p>
             <w:pPr>
-              <w:spacing w:before="0" w:after="0" w:line="180" w:lineRule="auto"/>
+              <w:spacing w:before="0" w:after="40" w:line="200" w:lineRule="auto"/>
               <w:jc w:val="left"/>
-              <w:rPr>
-                <w:sz w:val="14"/>
-                <w:szCs w:val="14"/>
-              </w:rPr>
+              <w:rPr/>
             </w:pPr>
             <w:r>
               <w:rPr>
@@ -12595,12 +12382,9 @@
           <w:tcPr/>
           <w:p>
             <w:pPr>
-              <w:spacing w:before="0" w:after="0" w:line="180" w:lineRule="auto"/>
+              <w:spacing w:before="0" w:after="40" w:line="200" w:lineRule="auto"/>
               <w:jc w:val="left"/>
-              <w:rPr>
-                <w:sz w:val="14"/>
-                <w:szCs w:val="14"/>
-              </w:rPr>
+              <w:rPr/>
             </w:pPr>
             <w:r>
               <w:rPr>
@@ -12625,12 +12409,9 @@
           <w:tcPr/>
           <w:p>
             <w:pPr>
-              <w:spacing w:before="0" w:after="0" w:line="180" w:lineRule="auto"/>
+              <w:spacing w:before="0" w:after="40" w:line="200" w:lineRule="auto"/>
               <w:jc w:val="left"/>
-              <w:rPr>
-                <w:sz w:val="14"/>
-                <w:szCs w:val="14"/>
-              </w:rPr>
+              <w:rPr/>
             </w:pPr>
             <w:r>
               <w:rPr>
@@ -12655,12 +12436,9 @@
           <w:tcPr/>
           <w:p>
             <w:pPr>
-              <w:spacing w:before="0" w:after="0" w:line="180" w:lineRule="auto"/>
+              <w:spacing w:before="0" w:after="40" w:line="200" w:lineRule="auto"/>
               <w:jc w:val="left"/>
-              <w:rPr>
-                <w:sz w:val="14"/>
-                <w:szCs w:val="14"/>
-              </w:rPr>
+              <w:rPr/>
             </w:pPr>
             <w:r>
               <w:rPr>
@@ -12685,12 +12463,9 @@
           <w:tcPr/>
           <w:p>
             <w:pPr>
-              <w:spacing w:before="0" w:after="0" w:line="180" w:lineRule="auto"/>
+              <w:spacing w:before="0" w:after="40" w:line="200" w:lineRule="auto"/>
               <w:jc w:val="left"/>
-              <w:rPr>
-                <w:sz w:val="14"/>
-                <w:szCs w:val="14"/>
-              </w:rPr>
+              <w:rPr/>
             </w:pPr>
             <w:r>
               <w:rPr>
@@ -12716,7 +12491,7 @@
     <w:p>
       <w:pPr>
         <w:keepNext w:val="1"/>
-        <w:spacing w:before="20" w:after="20" w:line="240" w:lineRule="auto"/>
+        <w:spacing w:before="0" w:after="40" w:line="200" w:lineRule="auto"/>
         <w:jc w:val="left"/>
         <w:rPr/>
       </w:pPr>
@@ -12728,15 +12503,16 @@
           <w:i w:val="1"/>
           <w:iCs w:val="1"/>
           <w:sz w:val="16"/>
-          <w:szCs w:val="24"/>
+          <w:szCs w:val="16"/>
           <w:rtl w:val="0"/>
         </w:rPr>
         <w:t xml:space="preserve">Optional Tab: Rejected Hedge Candidates</w:t>
       </w:r>
       <w:r>
         <w:rPr>
+          <w:rtl w:val="0"/>
           <w:sz w:val="16"/>
-          <w:rtl w:val="0"/>
+          <w:szCs w:val="16"/>
         </w:rPr>
       </w:r>
     </w:p>
@@ -12744,7 +12520,7 @@
       <w:pPr>
         <w:keepNext w:val="1"/>
         <w:keepLines w:val="1"/>
-        <w:spacing w:before="20" w:after="20" w:line="240" w:lineRule="auto"/>
+        <w:spacing w:before="0" w:after="40" w:line="200" w:lineRule="auto"/>
         <w:ind w:firstLine="720"/>
         <w:jc w:val="both"/>
         <w:rPr/>
@@ -12757,15 +12533,16 @@
           <w:i w:val="0"/>
           <w:iCs w:val="0"/>
           <w:sz w:val="16"/>
-          <w:szCs w:val="22"/>
+          <w:szCs w:val="16"/>
           <w:rtl w:val="0"/>
         </w:rPr>
         <w:t xml:space="preserve">False positives, logged for traceability during the reliability check.</w:t>
       </w:r>
       <w:r>
         <w:rPr>
+          <w:rtl w:val="0"/>
           <w:sz w:val="16"/>
-          <w:rtl w:val="0"/>
+          <w:szCs w:val="16"/>
         </w:rPr>
       </w:r>
     </w:p>
@@ -12818,12 +12595,9 @@
           </w:tcPr>
           <w:p>
             <w:pPr>
-              <w:spacing w:before="0" w:after="0" w:line="180" w:lineRule="auto"/>
+              <w:spacing w:before="0" w:after="40" w:line="200" w:lineRule="auto"/>
               <w:jc w:val="both"/>
-              <w:rPr>
-                <w:sz w:val="14"/>
-                <w:szCs w:val="14"/>
-              </w:rPr>
+              <w:rPr/>
             </w:pPr>
             <w:r>
               <w:rPr>
@@ -12855,12 +12629,9 @@
           </w:tcPr>
           <w:p>
             <w:pPr>
-              <w:spacing w:before="0" w:after="0" w:line="180" w:lineRule="auto"/>
+              <w:spacing w:before="0" w:after="40" w:line="200" w:lineRule="auto"/>
               <w:jc w:val="both"/>
-              <w:rPr>
-                <w:sz w:val="14"/>
-                <w:szCs w:val="14"/>
-              </w:rPr>
+              <w:rPr/>
             </w:pPr>
             <w:r>
               <w:rPr>
@@ -12892,12 +12663,9 @@
           </w:tcPr>
           <w:p>
             <w:pPr>
-              <w:spacing w:before="0" w:after="0" w:line="180" w:lineRule="auto"/>
+              <w:spacing w:before="0" w:after="40" w:line="200" w:lineRule="auto"/>
               <w:jc w:val="both"/>
-              <w:rPr>
-                <w:sz w:val="14"/>
-                <w:szCs w:val="14"/>
-              </w:rPr>
+              <w:rPr/>
             </w:pPr>
             <w:r>
               <w:rPr>
@@ -12929,12 +12697,9 @@
           </w:tcPr>
           <w:p>
             <w:pPr>
-              <w:spacing w:before="0" w:after="0" w:line="180" w:lineRule="auto"/>
+              <w:spacing w:before="0" w:after="40" w:line="200" w:lineRule="auto"/>
               <w:jc w:val="both"/>
-              <w:rPr>
-                <w:sz w:val="14"/>
-                <w:szCs w:val="14"/>
-              </w:rPr>
+              <w:rPr/>
             </w:pPr>
             <w:r>
               <w:rPr>
@@ -12966,12 +12731,9 @@
           </w:tcPr>
           <w:p>
             <w:pPr>
-              <w:spacing w:before="0" w:after="0" w:line="180" w:lineRule="auto"/>
+              <w:spacing w:before="0" w:after="40" w:line="200" w:lineRule="auto"/>
               <w:jc w:val="both"/>
-              <w:rPr>
-                <w:sz w:val="14"/>
-                <w:szCs w:val="14"/>
-              </w:rPr>
+              <w:rPr/>
             </w:pPr>
             <w:r>
               <w:rPr>
@@ -13003,12 +12765,9 @@
           </w:tcPr>
           <w:p>
             <w:pPr>
-              <w:spacing w:before="0" w:after="0" w:line="180" w:lineRule="auto"/>
+              <w:spacing w:before="0" w:after="40" w:line="200" w:lineRule="auto"/>
               <w:jc w:val="both"/>
-              <w:rPr>
-                <w:sz w:val="14"/>
-                <w:szCs w:val="14"/>
-              </w:rPr>
+              <w:rPr/>
             </w:pPr>
             <w:r>
               <w:rPr>
@@ -13041,12 +12800,9 @@
           <w:tcPr/>
           <w:p>
             <w:pPr>
-              <w:spacing w:before="0" w:after="0" w:line="180" w:lineRule="auto"/>
+              <w:spacing w:before="0" w:after="40" w:line="200" w:lineRule="auto"/>
               <w:jc w:val="left"/>
-              <w:rPr>
-                <w:sz w:val="14"/>
-                <w:szCs w:val="14"/>
-              </w:rPr>
+              <w:rPr/>
             </w:pPr>
             <w:r>
               <w:rPr>
@@ -13071,12 +12827,9 @@
           <w:tcPr/>
           <w:p>
             <w:pPr>
-              <w:spacing w:before="0" w:after="0" w:line="180" w:lineRule="auto"/>
+              <w:spacing w:before="0" w:after="40" w:line="200" w:lineRule="auto"/>
               <w:jc w:val="left"/>
-              <w:rPr>
-                <w:sz w:val="14"/>
-                <w:szCs w:val="14"/>
-              </w:rPr>
+              <w:rPr/>
             </w:pPr>
             <w:r>
               <w:rPr>
@@ -13101,12 +12854,9 @@
           <w:tcPr/>
           <w:p>
             <w:pPr>
-              <w:spacing w:before="0" w:after="0" w:line="180" w:lineRule="auto"/>
+              <w:spacing w:before="0" w:after="40" w:line="200" w:lineRule="auto"/>
               <w:jc w:val="left"/>
-              <w:rPr>
-                <w:sz w:val="14"/>
-                <w:szCs w:val="14"/>
-              </w:rPr>
+              <w:rPr/>
             </w:pPr>
             <w:r>
               <w:rPr>
@@ -13131,12 +12881,9 @@
           <w:tcPr/>
           <w:p>
             <w:pPr>
-              <w:spacing w:before="0" w:after="0" w:line="180" w:lineRule="auto"/>
+              <w:spacing w:before="0" w:after="40" w:line="200" w:lineRule="auto"/>
               <w:jc w:val="left"/>
-              <w:rPr>
-                <w:sz w:val="14"/>
-                <w:szCs w:val="14"/>
-              </w:rPr>
+              <w:rPr/>
             </w:pPr>
             <w:r>
               <w:rPr>
@@ -13161,12 +12908,9 @@
           <w:tcPr/>
           <w:p>
             <w:pPr>
-              <w:spacing w:before="0" w:after="0" w:line="180" w:lineRule="auto"/>
+              <w:spacing w:before="0" w:after="40" w:line="200" w:lineRule="auto"/>
               <w:jc w:val="left"/>
-              <w:rPr>
-                <w:sz w:val="14"/>
-                <w:szCs w:val="14"/>
-              </w:rPr>
+              <w:rPr/>
             </w:pPr>
             <w:r>
               <w:rPr>
@@ -13191,12 +12935,9 @@
           <w:tcPr/>
           <w:p>
             <w:pPr>
-              <w:spacing w:before="0" w:after="0" w:line="180" w:lineRule="auto"/>
+              <w:spacing w:before="0" w:after="40" w:line="200" w:lineRule="auto"/>
               <w:jc w:val="left"/>
-              <w:rPr>
-                <w:sz w:val="14"/>
-                <w:szCs w:val="14"/>
-              </w:rPr>
+              <w:rPr/>
             </w:pPr>
             <w:r>
               <w:rPr>
@@ -13221,11 +12962,12 @@
     </w:tbl>
     <w:p>
       <w:pPr>
-        <w:spacing w:before="20" w:after="20" w:line="240" w:lineRule="auto"/>
+        <w:spacing w:before="0" w:after="40" w:line="200" w:lineRule="auto"/>
       </w:pPr>
       <w:r>
         <w:rPr>
           <w:sz w:val="16"/>
+          <w:szCs w:val="16"/>
         </w:rPr>
         <w:br w:type="page"/>
       </w:r>

</xml_diff>

<commit_message>
Draft_014: preserve original format of moved Legend/Coding block
Legend, Combined Example, and Coding Sheet Columns relocated with
original table colors, cell shading, and inline highlights intact.
Only modest paragraph spacing so the block still fits one page.
QR left alone; Full Codebook on following new page.
</commit_message>
<xml_diff>
--- a/thesis/003_ThesisProposal_Draft_014.docx
+++ b/thesis/003_ThesisProposal_Draft_014.docx
@@ -10464,7 +10464,7 @@
     <w:p>
       <w:pPr>
         <w:keepNext w:val="1"/>
-        <w:spacing w:before="0" w:after="40" w:line="200" w:lineRule="auto"/>
+        <w:spacing w:before="0" w:after="60" w:line="240" w:lineRule="auto"/>
         <w:jc w:val="left"/>
         <w:rPr/>
       </w:pPr>
@@ -10475,8 +10475,8 @@
           <w:bCs w:val="1"/>
           <w:i w:val="0"/>
           <w:iCs w:val="0"/>
-          <w:sz w:val="16"/>
-          <w:szCs w:val="16"/>
+          <w:sz w:val="24"/>
+          <w:szCs w:val="24"/>
           <w:rtl w:val="0"/>
         </w:rPr>
         <w:t xml:space="preserve">QUICK-REFERENCE LEGEND</w:t>
@@ -10484,8 +10484,6 @@
       <w:r>
         <w:rPr>
           <w:rtl w:val="0"/>
-          <w:sz w:val="16"/>
-          <w:szCs w:val="16"/>
         </w:rPr>
       </w:r>
     </w:p>
@@ -10493,7 +10491,7 @@
       <w:pPr>
         <w:keepNext w:val="1"/>
         <w:keepLines w:val="1"/>
-        <w:spacing w:before="0" w:after="40" w:line="200" w:lineRule="auto"/>
+        <w:spacing w:before="0" w:after="60" w:line="240" w:lineRule="auto"/>
         <w:ind w:firstLine="720"/>
         <w:jc w:val="both"/>
         <w:rPr/>
@@ -10505,8 +10503,8 @@
           <w:bCs w:val="0"/>
           <w:i w:val="0"/>
           <w:iCs w:val="0"/>
-          <w:sz w:val="16"/>
-          <w:szCs w:val="16"/>
+          <w:sz w:val="22"/>
+          <w:szCs w:val="22"/>
           <w:rtl w:val="0"/>
         </w:rPr>
         <w:t xml:space="preserve">Colors are backgrounds applied with a highlighter directly on the abstract text, not font colors.</w:t>
@@ -10514,8 +10512,6 @@
       <w:r>
         <w:rPr>
           <w:rtl w:val="0"/>
-          <w:sz w:val="16"/>
-          <w:szCs w:val="16"/>
         </w:rPr>
       </w:r>
     </w:p>
@@ -10560,7 +10556,7 @@
           </w:tcPr>
           <w:p>
             <w:pPr>
-              <w:spacing w:before="0" w:after="40" w:line="200" w:lineRule="auto"/>
+              <w:spacing w:before="0" w:after="0" w:line="240" w:lineRule="auto"/>
               <w:jc w:val="both"/>
               <w:rPr/>
             </w:pPr>
@@ -10569,8 +10565,8 @@
                 <w:rFonts w:ascii="Georgia" w:cs="Georgia" w:eastAsia="Georgia" w:hAnsi="Georgia"/>
                 <w:b w:val="1"/>
                 <w:bCs w:val="1"/>
-                <w:sz w:val="14"/>
-                <w:szCs w:val="14"/>
+                <w:sz w:val="18"/>
+                <w:szCs w:val="18"/>
                 <w:rtl w:val="0"/>
               </w:rPr>
               <w:t xml:space="preserve">TYPE (Highlight)</w:t>
@@ -10578,8 +10574,8 @@
             <w:r>
               <w:rPr>
                 <w:rtl w:val="0"/>
-                <w:sz w:val="14"/>
-                <w:szCs w:val="14"/>
+                <w:sz w:val="18"/>
+                <w:szCs w:val="18"/>
                 <w:rFonts w:ascii="Georgia" w:hAnsi="Georgia"/>
               </w:rPr>
             </w:r>
@@ -10594,7 +10590,7 @@
           </w:tcPr>
           <w:p>
             <w:pPr>
-              <w:spacing w:before="0" w:after="40" w:line="200" w:lineRule="auto"/>
+              <w:spacing w:before="0" w:after="0" w:line="240" w:lineRule="auto"/>
               <w:jc w:val="both"/>
               <w:rPr/>
             </w:pPr>
@@ -10603,8 +10599,8 @@
                 <w:rFonts w:ascii="Georgia" w:cs="Georgia" w:eastAsia="Georgia" w:hAnsi="Georgia"/>
                 <w:b w:val="1"/>
                 <w:bCs w:val="1"/>
-                <w:sz w:val="14"/>
-                <w:szCs w:val="14"/>
+                <w:sz w:val="18"/>
+                <w:szCs w:val="18"/>
                 <w:rtl w:val="0"/>
               </w:rPr>
               <w:t xml:space="preserve">FUNCTION (Text)</w:t>
@@ -10612,8 +10608,8 @@
             <w:r>
               <w:rPr>
                 <w:rtl w:val="0"/>
-                <w:sz w:val="14"/>
-                <w:szCs w:val="14"/>
+                <w:sz w:val="18"/>
+                <w:szCs w:val="18"/>
                 <w:rFonts w:ascii="Georgia" w:hAnsi="Georgia"/>
               </w:rPr>
             </w:r>
@@ -10629,15 +10625,15 @@
           <w:tcPr/>
           <w:p>
             <w:pPr>
-              <w:spacing w:before="0" w:after="40" w:line="200" w:lineRule="auto"/>
+              <w:spacing w:before="0" w:after="0" w:line="240" w:lineRule="auto"/>
               <w:jc w:val="both"/>
               <w:rPr/>
             </w:pPr>
             <w:r>
               <w:rPr>
                 <w:rFonts w:ascii="Georgia" w:cs="Georgia" w:eastAsia="Georgia" w:hAnsi="Georgia"/>
-                <w:sz w:val="14"/>
-                <w:szCs w:val="14"/>
+                <w:sz w:val="18"/>
+                <w:szCs w:val="18"/>
                 <w:shd w:fill="00b0f0" w:val="clear"/>
                 <w:rtl w:val="0"/>
               </w:rPr>
@@ -10651,8 +10647,8 @@
                 <w:i w:val="0"/>
                 <w:iCs w:val="0"/>
                 <w:color w:val="000000"/>
-                <w:sz w:val="14"/>
-                <w:szCs w:val="14"/>
+                <w:sz w:val="18"/>
+                <w:szCs w:val="18"/>
                 <w:rtl w:val="0"/>
               </w:rPr>
               <w:t xml:space="preserve">  Modal Verbs</w:t>
@@ -10660,23 +10656,23 @@
             <w:r>
               <w:rPr>
                 <w:rtl w:val="0"/>
-                <w:sz w:val="14"/>
-                <w:szCs w:val="14"/>
+                <w:sz w:val="18"/>
+                <w:szCs w:val="18"/>
                 <w:rFonts w:ascii="Georgia" w:hAnsi="Georgia"/>
               </w:rPr>
             </w:r>
           </w:p>
           <w:p>
             <w:pPr>
-              <w:spacing w:before="0" w:after="40" w:line="200" w:lineRule="auto"/>
+              <w:spacing w:before="0" w:after="0" w:line="240" w:lineRule="auto"/>
               <w:jc w:val="both"/>
               <w:rPr/>
             </w:pPr>
             <w:r>
               <w:rPr>
                 <w:rFonts w:ascii="Georgia" w:cs="Georgia" w:eastAsia="Georgia" w:hAnsi="Georgia"/>
-                <w:sz w:val="14"/>
-                <w:szCs w:val="14"/>
+                <w:sz w:val="18"/>
+                <w:szCs w:val="18"/>
                 <w:highlight w:val="red"/>
                 <w:rtl w:val="0"/>
               </w:rPr>
@@ -10690,8 +10686,8 @@
                 <w:i w:val="0"/>
                 <w:iCs w:val="0"/>
                 <w:color w:val="000000"/>
-                <w:sz w:val="14"/>
-                <w:szCs w:val="14"/>
+                <w:sz w:val="18"/>
+                <w:szCs w:val="18"/>
                 <w:rtl w:val="0"/>
               </w:rPr>
               <w:t xml:space="preserve">  Lexical Hedges</w:t>
@@ -10699,23 +10695,23 @@
             <w:r>
               <w:rPr>
                 <w:rtl w:val="0"/>
-                <w:sz w:val="14"/>
-                <w:szCs w:val="14"/>
+                <w:sz w:val="18"/>
+                <w:szCs w:val="18"/>
                 <w:rFonts w:ascii="Georgia" w:hAnsi="Georgia"/>
               </w:rPr>
             </w:r>
           </w:p>
           <w:p>
             <w:pPr>
-              <w:spacing w:before="0" w:after="40" w:line="200" w:lineRule="auto"/>
+              <w:spacing w:before="0" w:after="0" w:line="240" w:lineRule="auto"/>
               <w:jc w:val="both"/>
               <w:rPr/>
             </w:pPr>
             <w:r>
               <w:rPr>
                 <w:rFonts w:ascii="Georgia" w:cs="Georgia" w:eastAsia="Georgia" w:hAnsi="Georgia"/>
-                <w:sz w:val="14"/>
-                <w:szCs w:val="14"/>
+                <w:sz w:val="18"/>
+                <w:szCs w:val="18"/>
                 <w:highlight w:val="yellow"/>
                 <w:rtl w:val="0"/>
               </w:rPr>
@@ -10729,8 +10725,8 @@
                 <w:i w:val="0"/>
                 <w:iCs w:val="0"/>
                 <w:color w:val="000000"/>
-                <w:sz w:val="14"/>
-                <w:szCs w:val="14"/>
+                <w:sz w:val="18"/>
+                <w:szCs w:val="18"/>
                 <w:rtl w:val="0"/>
               </w:rPr>
               <w:t xml:space="preserve">  Adverbial Hedges</w:t>
@@ -10738,23 +10734,23 @@
             <w:r>
               <w:rPr>
                 <w:rtl w:val="0"/>
-                <w:sz w:val="14"/>
-                <w:szCs w:val="14"/>
+                <w:sz w:val="18"/>
+                <w:szCs w:val="18"/>
                 <w:rFonts w:ascii="Georgia" w:hAnsi="Georgia"/>
               </w:rPr>
             </w:r>
           </w:p>
           <w:p>
             <w:pPr>
-              <w:spacing w:before="0" w:after="40" w:line="200" w:lineRule="auto"/>
+              <w:spacing w:before="0" w:after="0" w:line="240" w:lineRule="auto"/>
               <w:jc w:val="both"/>
               <w:rPr/>
             </w:pPr>
             <w:r>
               <w:rPr>
                 <w:rFonts w:ascii="Georgia" w:cs="Georgia" w:eastAsia="Georgia" w:hAnsi="Georgia"/>
-                <w:sz w:val="14"/>
-                <w:szCs w:val="14"/>
+                <w:sz w:val="18"/>
+                <w:szCs w:val="18"/>
                 <w:shd w:fill="00b050" w:val="clear"/>
                 <w:rtl w:val="0"/>
               </w:rPr>
@@ -10768,8 +10764,8 @@
                 <w:i w:val="0"/>
                 <w:iCs w:val="0"/>
                 <w:color w:val="000000"/>
-                <w:sz w:val="14"/>
-                <w:szCs w:val="14"/>
+                <w:sz w:val="18"/>
+                <w:szCs w:val="18"/>
                 <w:rtl w:val="0"/>
               </w:rPr>
               <w:t xml:space="preserve">  Clause-Level Hedges</w:t>
@@ -10777,8 +10773,8 @@
             <w:r>
               <w:rPr>
                 <w:rtl w:val="0"/>
-                <w:sz w:val="14"/>
-                <w:szCs w:val="14"/>
+                <w:sz w:val="18"/>
+                <w:szCs w:val="18"/>
                 <w:rFonts w:ascii="Georgia" w:hAnsi="Georgia"/>
               </w:rPr>
             </w:r>
@@ -10788,7 +10784,7 @@
           <w:tcPr/>
           <w:p>
             <w:pPr>
-              <w:spacing w:before="0" w:after="40" w:line="200" w:lineRule="auto"/>
+              <w:spacing w:before="0" w:after="0" w:line="240" w:lineRule="auto"/>
               <w:jc w:val="both"/>
               <w:rPr/>
             </w:pPr>
@@ -10800,8 +10796,8 @@
                 <w:i w:val="0"/>
                 <w:iCs w:val="0"/>
                 <w:color w:val="ed7d31"/>
-                <w:sz w:val="14"/>
-                <w:szCs w:val="14"/>
+                <w:sz w:val="18"/>
+                <w:szCs w:val="18"/>
                 <w:rtl w:val="0"/>
               </w:rPr>
               <w:t xml:space="preserve">EC</w:t>
@@ -10814,8 +10810,8 @@
                 <w:i w:val="0"/>
                 <w:iCs w:val="0"/>
                 <w:color w:val="000000"/>
-                <w:sz w:val="14"/>
-                <w:szCs w:val="14"/>
+                <w:sz w:val="18"/>
+                <w:szCs w:val="18"/>
                 <w:rtl w:val="0"/>
               </w:rPr>
               <w:t xml:space="preserve">  Epistemic Caution</w:t>
@@ -10823,15 +10819,15 @@
             <w:r>
               <w:rPr>
                 <w:rtl w:val="0"/>
-                <w:sz w:val="14"/>
-                <w:szCs w:val="14"/>
+                <w:sz w:val="18"/>
+                <w:szCs w:val="18"/>
                 <w:rFonts w:ascii="Georgia" w:hAnsi="Georgia"/>
               </w:rPr>
             </w:r>
           </w:p>
           <w:p>
             <w:pPr>
-              <w:spacing w:before="0" w:after="40" w:line="200" w:lineRule="auto"/>
+              <w:spacing w:before="0" w:after="0" w:line="240" w:lineRule="auto"/>
               <w:jc w:val="both"/>
               <w:rPr/>
             </w:pPr>
@@ -10843,8 +10839,8 @@
                 <w:i w:val="0"/>
                 <w:iCs w:val="0"/>
                 <w:color w:val="7030a0"/>
-                <w:sz w:val="14"/>
-                <w:szCs w:val="14"/>
+                <w:sz w:val="18"/>
+                <w:szCs w:val="18"/>
                 <w:rtl w:val="0"/>
               </w:rPr>
               <w:t xml:space="preserve">P</w:t>
@@ -10857,8 +10853,8 @@
                 <w:i w:val="0"/>
                 <w:iCs w:val="0"/>
                 <w:color w:val="000000"/>
-                <w:sz w:val="14"/>
-                <w:szCs w:val="14"/>
+                <w:sz w:val="18"/>
+                <w:szCs w:val="18"/>
                 <w:rtl w:val="0"/>
               </w:rPr>
               <w:t xml:space="preserve">  Politeness / Deference</w:t>
@@ -10866,15 +10862,15 @@
             <w:r>
               <w:rPr>
                 <w:rtl w:val="0"/>
-                <w:sz w:val="14"/>
-                <w:szCs w:val="14"/>
+                <w:sz w:val="18"/>
+                <w:szCs w:val="18"/>
                 <w:rFonts w:ascii="Georgia" w:hAnsi="Georgia"/>
               </w:rPr>
             </w:r>
           </w:p>
           <w:p>
             <w:pPr>
-              <w:spacing w:before="0" w:after="40" w:line="200" w:lineRule="auto"/>
+              <w:spacing w:before="0" w:after="0" w:line="240" w:lineRule="auto"/>
               <w:jc w:val="both"/>
               <w:rPr/>
             </w:pPr>
@@ -10886,8 +10882,8 @@
                 <w:i w:val="0"/>
                 <w:iCs w:val="0"/>
                 <w:color w:val="00b0f0"/>
-                <w:sz w:val="14"/>
-                <w:szCs w:val="14"/>
+                <w:sz w:val="18"/>
+                <w:szCs w:val="18"/>
                 <w:rtl w:val="0"/>
               </w:rPr>
               <w:t xml:space="preserve">DO</w:t>
@@ -10900,8 +10896,8 @@
                 <w:i w:val="0"/>
                 <w:iCs w:val="0"/>
                 <w:color w:val="000000"/>
-                <w:sz w:val="14"/>
-                <w:szCs w:val="14"/>
+                <w:sz w:val="18"/>
+                <w:szCs w:val="18"/>
                 <w:rtl w:val="0"/>
               </w:rPr>
               <w:t xml:space="preserve">  Discourse Organization</w:t>
@@ -10909,8 +10905,8 @@
             <w:r>
               <w:rPr>
                 <w:rtl w:val="0"/>
-                <w:sz w:val="14"/>
-                <w:szCs w:val="14"/>
+                <w:sz w:val="18"/>
+                <w:szCs w:val="18"/>
                 <w:rFonts w:ascii="Georgia" w:hAnsi="Georgia"/>
               </w:rPr>
             </w:r>
@@ -10926,7 +10922,7 @@
           <w:tcPr/>
           <w:p>
             <w:pPr>
-              <w:spacing w:before="0" w:after="40" w:line="200" w:lineRule="auto"/>
+              <w:spacing w:before="0" w:after="0" w:line="240" w:lineRule="auto"/>
               <w:jc w:val="both"/>
               <w:rPr/>
             </w:pPr>
@@ -10938,8 +10934,8 @@
                 <w:i w:val="0"/>
                 <w:iCs w:val="0"/>
                 <w:color w:val="000000"/>
-                <w:sz w:val="14"/>
-                <w:szCs w:val="14"/>
+                <w:sz w:val="18"/>
+                <w:szCs w:val="18"/>
                 <w:rtl w:val="0"/>
               </w:rPr>
               <w:t xml:space="preserve">UNHEDGED SITES (Grey Highlight, Optional)</w:t>
@@ -10947,23 +10943,23 @@
             <w:r>
               <w:rPr>
                 <w:rtl w:val="0"/>
-                <w:sz w:val="14"/>
-                <w:szCs w:val="14"/>
+                <w:sz w:val="18"/>
+                <w:szCs w:val="18"/>
                 <w:rFonts w:ascii="Georgia" w:hAnsi="Georgia"/>
               </w:rPr>
             </w:r>
           </w:p>
           <w:p>
             <w:pPr>
-              <w:spacing w:before="0" w:after="40" w:line="200" w:lineRule="auto"/>
+              <w:spacing w:before="0" w:after="0" w:line="240" w:lineRule="auto"/>
               <w:jc w:val="both"/>
               <w:rPr/>
             </w:pPr>
             <w:r>
               <w:rPr>
                 <w:rFonts w:ascii="Georgia" w:cs="Georgia" w:eastAsia="Georgia" w:hAnsi="Georgia"/>
-                <w:sz w:val="14"/>
-                <w:szCs w:val="14"/>
+                <w:sz w:val="18"/>
+                <w:szCs w:val="18"/>
                 <w:shd w:fill="bfbfbf" w:val="clear"/>
                 <w:rtl w:val="0"/>
               </w:rPr>
@@ -10977,8 +10973,8 @@
                 <w:i w:val="0"/>
                 <w:iCs w:val="0"/>
                 <w:color w:val="000000"/>
-                <w:sz w:val="14"/>
-                <w:szCs w:val="14"/>
+                <w:sz w:val="18"/>
+                <w:szCs w:val="18"/>
                 <w:rtl w:val="0"/>
               </w:rPr>
               <w:t xml:space="preserve">  R = Result, G = Generalization, C = Causal. Bracket the subtype beside the mark.</w:t>
@@ -10986,8 +10982,8 @@
             <w:r>
               <w:rPr>
                 <w:rtl w:val="0"/>
-                <w:sz w:val="14"/>
-                <w:szCs w:val="14"/>
+                <w:sz w:val="18"/>
+                <w:szCs w:val="18"/>
                 <w:rFonts w:ascii="Georgia" w:hAnsi="Georgia"/>
               </w:rPr>
             </w:r>
@@ -10997,7 +10993,7 @@
           <w:tcPr/>
           <w:p>
             <w:pPr>
-              <w:spacing w:before="0" w:after="40" w:line="200" w:lineRule="auto"/>
+              <w:spacing w:before="0" w:after="0" w:line="240" w:lineRule="auto"/>
               <w:jc w:val="both"/>
               <w:rPr/>
             </w:pPr>
@@ -11009,8 +11005,8 @@
                 <w:i w:val="0"/>
                 <w:iCs w:val="0"/>
                 <w:color w:val="000000"/>
-                <w:sz w:val="14"/>
-                <w:szCs w:val="14"/>
+                <w:sz w:val="18"/>
+                <w:szCs w:val="18"/>
                 <w:rtl w:val="0"/>
               </w:rPr>
               <w:t xml:space="preserve">FALSE POSITIVE (Strikethrough)</w:t>
@@ -11018,15 +11014,15 @@
             <w:r>
               <w:rPr>
                 <w:rtl w:val="0"/>
-                <w:sz w:val="14"/>
-                <w:szCs w:val="14"/>
+                <w:sz w:val="18"/>
+                <w:szCs w:val="18"/>
                 <w:rFonts w:ascii="Georgia" w:hAnsi="Georgia"/>
               </w:rPr>
             </w:r>
           </w:p>
           <w:p>
             <w:pPr>
-              <w:spacing w:before="0" w:after="40" w:line="200" w:lineRule="auto"/>
+              <w:spacing w:before="0" w:after="0" w:line="240" w:lineRule="auto"/>
               <w:jc w:val="both"/>
               <w:rPr/>
             </w:pPr>
@@ -11038,8 +11034,8 @@
                 <w:i w:val="0"/>
                 <w:iCs w:val="0"/>
                 <w:color w:val="000000"/>
-                <w:sz w:val="14"/>
-                <w:szCs w:val="14"/>
+                <w:sz w:val="18"/>
+                <w:szCs w:val="18"/>
                 <w:rtl w:val="0"/>
               </w:rPr>
               <w:t xml:space="preserve">No highlight. Strike through the token and write the reason code in grey text.</w:t>
@@ -11047,8 +11043,8 @@
             <w:r>
               <w:rPr>
                 <w:rtl w:val="0"/>
-                <w:sz w:val="14"/>
-                <w:szCs w:val="14"/>
+                <w:sz w:val="18"/>
+                <w:szCs w:val="18"/>
                 <w:rFonts w:ascii="Georgia" w:hAnsi="Georgia"/>
               </w:rPr>
             </w:r>
@@ -11059,7 +11055,7 @@
     <w:p>
       <w:pPr>
         <w:keepNext w:val="1"/>
-        <w:spacing w:before="0" w:after="40" w:line="200" w:lineRule="auto"/>
+        <w:spacing w:before="0" w:after="60" w:line="240" w:lineRule="auto"/>
         <w:jc w:val="left"/>
         <w:rPr/>
       </w:pPr>
@@ -11070,8 +11066,8 @@
           <w:bCs w:val="1"/>
           <w:i w:val="0"/>
           <w:iCs w:val="0"/>
-          <w:sz w:val="16"/>
-          <w:szCs w:val="16"/>
+          <w:sz w:val="24"/>
+          <w:szCs w:val="24"/>
           <w:rtl w:val="0"/>
         </w:rPr>
         <w:t xml:space="preserve">COMBINED EXAMPLE</w:t>
@@ -11079,14 +11075,12 @@
       <w:r>
         <w:rPr>
           <w:rtl w:val="0"/>
-          <w:sz w:val="16"/>
-          <w:szCs w:val="16"/>
-        </w:rPr>
-      </w:r>
-    </w:p>
-    <w:p>
-      <w:pPr>
-        <w:spacing w:before="0" w:after="40" w:line="200" w:lineRule="auto"/>
+        </w:rPr>
+      </w:r>
+    </w:p>
+    <w:p>
+      <w:pPr>
+        <w:spacing w:before="0" w:after="60" w:line="240" w:lineRule="auto"/>
         <w:ind w:firstLine="720"/>
         <w:jc w:val="both"/>
         <w:rPr/>
@@ -11099,8 +11093,8 @@
           <w:i w:val="1"/>
           <w:iCs w:val="1"/>
           <w:color w:val="000000"/>
-          <w:sz w:val="16"/>
-          <w:szCs w:val="16"/>
+          <w:sz w:val="22"/>
+          <w:szCs w:val="22"/>
           <w:rtl w:val="0"/>
         </w:rPr>
         <w:t xml:space="preserve">Combined example, as marked on a hard copy. </w:t>
@@ -11113,8 +11107,8 @@
           <w:i w:val="0"/>
           <w:iCs w:val="0"/>
           <w:color w:val="000000"/>
-          <w:sz w:val="16"/>
-          <w:szCs w:val="16"/>
+          <w:sz w:val="22"/>
+          <w:szCs w:val="22"/>
           <w:rtl w:val="0"/>
         </w:rPr>
         <w:t xml:space="preserve">“The results </w:t>
@@ -11126,8 +11120,8 @@
           <w:bCs w:val="1"/>
           <w:strike w:val="0"/>
           <w:color w:val="ffffff"/>
-          <w:sz w:val="16"/>
-          <w:szCs w:val="16"/>
+          <w:sz w:val="22"/>
+          <w:szCs w:val="22"/>
           <w:highlight w:val="red"/>
           <w:rtl w:val="0"/>
         </w:rPr>
@@ -11141,8 +11135,8 @@
           <w:i w:val="0"/>
           <w:iCs w:val="0"/>
           <w:color w:val="000000"/>
-          <w:sz w:val="16"/>
-          <w:szCs w:val="16"/>
+          <w:sz w:val="22"/>
+          <w:szCs w:val="22"/>
           <w:rtl w:val="0"/>
         </w:rPr>
         <w:t xml:space="preserve"> </w:t>
@@ -11155,8 +11149,8 @@
           <w:i w:val="0"/>
           <w:iCs w:val="0"/>
           <w:color w:val="ed7d31"/>
-          <w:sz w:val="16"/>
-          <w:szCs w:val="16"/>
+          <w:sz w:val="22"/>
+          <w:szCs w:val="22"/>
           <w:rtl w:val="0"/>
         </w:rPr>
         <w:t xml:space="preserve">(EC)</w:t>
@@ -11169,8 +11163,8 @@
           <w:i w:val="0"/>
           <w:iCs w:val="0"/>
           <w:color w:val="000000"/>
-          <w:sz w:val="16"/>
-          <w:szCs w:val="16"/>
+          <w:sz w:val="22"/>
+          <w:szCs w:val="22"/>
           <w:rtl w:val="0"/>
         </w:rPr>
         <w:t xml:space="preserve"> that C. longa extracts are </w:t>
@@ -11182,8 +11176,8 @@
           <w:bCs w:val="1"/>
           <w:strike w:val="1"/>
           <w:color w:val="000000"/>
-          <w:sz w:val="16"/>
-          <w:szCs w:val="16"/>
+          <w:sz w:val="22"/>
+          <w:szCs w:val="22"/>
           <w:rtl w:val="0"/>
         </w:rPr>
         <w:t xml:space="preserve">potential</w:t>
@@ -11196,8 +11190,8 @@
           <w:i w:val="0"/>
           <w:iCs w:val="0"/>
           <w:color w:val="000000"/>
-          <w:sz w:val="16"/>
-          <w:szCs w:val="16"/>
+          <w:sz w:val="22"/>
+          <w:szCs w:val="22"/>
           <w:rtl w:val="0"/>
         </w:rPr>
         <w:t xml:space="preserve"> </w:t>
@@ -11210,8 +11204,8 @@
           <w:i w:val="0"/>
           <w:iCs w:val="0"/>
           <w:color w:val="808080"/>
-          <w:sz w:val="16"/>
-          <w:szCs w:val="16"/>
+          <w:sz w:val="22"/>
+          <w:szCs w:val="22"/>
           <w:rtl w:val="0"/>
         </w:rPr>
         <w:t xml:space="preserve">(FP-Gen)</w:t>
@@ -11224,8 +11218,8 @@
           <w:i w:val="0"/>
           <w:iCs w:val="0"/>
           <w:color w:val="000000"/>
-          <w:sz w:val="16"/>
-          <w:szCs w:val="16"/>
+          <w:sz w:val="22"/>
+          <w:szCs w:val="22"/>
           <w:rtl w:val="0"/>
         </w:rPr>
         <w:t xml:space="preserve"> alternative stains. PCR </w:t>
@@ -11237,8 +11231,8 @@
           <w:bCs w:val="1"/>
           <w:strike w:val="1"/>
           <w:color w:val="000000"/>
-          <w:sz w:val="16"/>
-          <w:szCs w:val="16"/>
+          <w:sz w:val="22"/>
+          <w:szCs w:val="22"/>
           <w:rtl w:val="0"/>
         </w:rPr>
         <w:t xml:space="preserve">can</w:t>
@@ -11251,8 +11245,8 @@
           <w:i w:val="0"/>
           <w:iCs w:val="0"/>
           <w:color w:val="000000"/>
-          <w:sz w:val="16"/>
-          <w:szCs w:val="16"/>
+          <w:sz w:val="22"/>
+          <w:szCs w:val="22"/>
           <w:rtl w:val="0"/>
         </w:rPr>
         <w:t xml:space="preserve"> </w:t>
@@ -11265,8 +11259,8 @@
           <w:i w:val="0"/>
           <w:iCs w:val="0"/>
           <w:color w:val="808080"/>
-          <w:sz w:val="16"/>
-          <w:szCs w:val="16"/>
+          <w:sz w:val="22"/>
+          <w:szCs w:val="22"/>
           <w:rtl w:val="0"/>
         </w:rPr>
         <w:t xml:space="preserve">(FP-Cap)</w:t>
@@ -11279,8 +11273,8 @@
           <w:i w:val="0"/>
           <w:iCs w:val="0"/>
           <w:color w:val="000000"/>
-          <w:sz w:val="16"/>
-          <w:szCs w:val="16"/>
+          <w:sz w:val="22"/>
+          <w:szCs w:val="22"/>
           <w:rtl w:val="0"/>
         </w:rPr>
         <w:t xml:space="preserve"> also detect low concentrations, while a prior line stated flatly that </w:t>
@@ -11292,8 +11286,8 @@
           <w:bCs w:val="1"/>
           <w:strike w:val="0"/>
           <w:color w:val="000000"/>
-          <w:sz w:val="16"/>
-          <w:szCs w:val="16"/>
+          <w:sz w:val="22"/>
+          <w:szCs w:val="22"/>
           <w:shd w:fill="bfbfbf" w:val="clear"/>
           <w:rtl w:val="0"/>
         </w:rPr>
@@ -11307,8 +11301,8 @@
           <w:i w:val="0"/>
           <w:iCs w:val="0"/>
           <w:color w:val="000000"/>
-          <w:sz w:val="16"/>
-          <w:szCs w:val="16"/>
+          <w:sz w:val="22"/>
+          <w:szCs w:val="22"/>
           <w:rtl w:val="0"/>
         </w:rPr>
         <w:t xml:space="preserve"> </w:t>
@@ -11321,8 +11315,8 @@
           <w:i w:val="0"/>
           <w:iCs w:val="0"/>
           <w:color w:val="000000"/>
-          <w:sz w:val="16"/>
-          <w:szCs w:val="16"/>
+          <w:sz w:val="22"/>
+          <w:szCs w:val="22"/>
           <w:rtl w:val="0"/>
         </w:rPr>
         <w:t xml:space="preserve">[R]</w:t>
@@ -11335,8 +11329,8 @@
           <w:i w:val="0"/>
           <w:iCs w:val="0"/>
           <w:color w:val="000000"/>
-          <w:sz w:val="16"/>
-          <w:szCs w:val="16"/>
+          <w:sz w:val="22"/>
+          <w:szCs w:val="22"/>
           <w:rtl w:val="0"/>
         </w:rPr>
         <w:t xml:space="preserve"> no infection.”</w:t>
@@ -11344,14 +11338,12 @@
       <w:r>
         <w:rPr>
           <w:rtl w:val="0"/>
-          <w:sz w:val="16"/>
-          <w:szCs w:val="16"/>
-        </w:rPr>
-      </w:r>
-    </w:p>
-    <w:p>
-      <w:pPr>
-        <w:spacing w:before="0" w:after="40" w:line="200" w:lineRule="auto"/>
+        </w:rPr>
+      </w:r>
+    </w:p>
+    <w:p>
+      <w:pPr>
+        <w:spacing w:before="0" w:after="60" w:line="240" w:lineRule="auto"/>
         <w:ind w:firstLine="720"/>
         <w:jc w:val="both"/>
         <w:rPr/>
@@ -11362,8 +11354,6 @@
           <w:iCs w:val="1"/>
           <w:color w:val="404040"/>
           <w:rtl w:val="0"/>
-          <w:sz w:val="16"/>
-          <w:szCs w:val="16"/>
         </w:rPr>
         <w:t xml:space="preserve">R</w:t>
       </w:r>
@@ -11375,8 +11365,8 @@
           <w:i w:val="1"/>
           <w:iCs w:val="1"/>
           <w:color w:val="404040"/>
-          <w:sz w:val="16"/>
-          <w:szCs w:val="16"/>
+          <w:sz w:val="22"/>
+          <w:szCs w:val="22"/>
           <w:rtl w:val="0"/>
         </w:rPr>
         <w:t xml:space="preserve">ed highlights mark type. Orange text marks function. The strikethrough marks a rejected candidate. Grey highlight marks an unhedged site. Here, “potential” is struck because it names a research property, not a hedge on the claim.</w:t>
@@ -11384,15 +11374,13 @@
       <w:r>
         <w:rPr>
           <w:rtl w:val="0"/>
-          <w:sz w:val="16"/>
-          <w:szCs w:val="16"/>
         </w:rPr>
       </w:r>
     </w:p>
     <w:p>
       <w:pPr>
         <w:keepNext w:val="1"/>
-        <w:spacing w:before="0" w:after="40" w:line="200" w:lineRule="auto"/>
+        <w:spacing w:before="0" w:after="60" w:line="240" w:lineRule="auto"/>
         <w:jc w:val="left"/>
         <w:rPr/>
       </w:pPr>
@@ -11403,8 +11391,8 @@
           <w:bCs w:val="1"/>
           <w:i w:val="0"/>
           <w:iCs w:val="0"/>
-          <w:sz w:val="16"/>
-          <w:szCs w:val="16"/>
+          <w:sz w:val="24"/>
+          <w:szCs w:val="24"/>
           <w:rtl w:val="0"/>
         </w:rPr>
         <w:t xml:space="preserve">CODING SHEET COLUMNS</w:t>
@@ -11412,8 +11400,6 @@
       <w:r>
         <w:rPr>
           <w:rtl w:val="0"/>
-          <w:sz w:val="16"/>
-          <w:szCs w:val="16"/>
         </w:rPr>
       </w:r>
     </w:p>
@@ -11421,7 +11407,7 @@
       <w:pPr>
         <w:keepNext w:val="1"/>
         <w:keepLines w:val="1"/>
-        <w:spacing w:before="0" w:after="40" w:line="200" w:lineRule="auto"/>
+        <w:spacing w:before="0" w:after="60" w:line="240" w:lineRule="auto"/>
         <w:ind w:firstLine="720"/>
         <w:jc w:val="both"/>
         <w:rPr/>
@@ -11433,8 +11419,8 @@
           <w:bCs w:val="0"/>
           <w:i w:val="0"/>
           <w:iCs w:val="0"/>
-          <w:sz w:val="16"/>
-          <w:szCs w:val="16"/>
+          <w:sz w:val="22"/>
+          <w:szCs w:val="22"/>
           <w:rtl w:val="0"/>
         </w:rPr>
         <w:t xml:space="preserve">The original highlighted abstract is the primary, authoritative coding record. This spreadsheet is for tallying, organization, and analysis only, not a substitute record.</w:t>
@@ -11442,8 +11428,6 @@
       <w:r>
         <w:rPr>
           <w:rtl w:val="0"/>
-          <w:sz w:val="16"/>
-          <w:szCs w:val="16"/>
         </w:rPr>
       </w:r>
     </w:p>
@@ -11500,7 +11484,7 @@
           </w:tcPr>
           <w:p>
             <w:pPr>
-              <w:spacing w:before="0" w:after="40" w:line="200" w:lineRule="auto"/>
+              <w:spacing w:before="0" w:after="0" w:line="240" w:lineRule="auto"/>
               <w:jc w:val="both"/>
               <w:rPr/>
             </w:pPr>
@@ -11509,8 +11493,8 @@
                 <w:rFonts w:ascii="Georgia" w:cs="Georgia" w:eastAsia="Georgia" w:hAnsi="Georgia"/>
                 <w:b w:val="1"/>
                 <w:bCs w:val="1"/>
-                <w:sz w:val="14"/>
-                <w:szCs w:val="14"/>
+                <w:sz w:val="18"/>
+                <w:szCs w:val="18"/>
                 <w:rtl w:val="0"/>
               </w:rPr>
               <w:t xml:space="preserve">Abstract ID</w:t>
@@ -11518,8 +11502,8 @@
             <w:r>
               <w:rPr>
                 <w:rtl w:val="0"/>
-                <w:sz w:val="14"/>
-                <w:szCs w:val="14"/>
+                <w:sz w:val="18"/>
+                <w:szCs w:val="18"/>
                 <w:rFonts w:ascii="Georgia" w:hAnsi="Georgia"/>
               </w:rPr>
             </w:r>
@@ -11534,7 +11518,7 @@
           </w:tcPr>
           <w:p>
             <w:pPr>
-              <w:spacing w:before="0" w:after="40" w:line="200" w:lineRule="auto"/>
+              <w:spacing w:before="0" w:after="0" w:line="240" w:lineRule="auto"/>
               <w:jc w:val="both"/>
               <w:rPr/>
             </w:pPr>
@@ -11543,8 +11527,8 @@
                 <w:rFonts w:ascii="Georgia" w:cs="Georgia" w:eastAsia="Georgia" w:hAnsi="Georgia"/>
                 <w:b w:val="1"/>
                 <w:bCs w:val="1"/>
-                <w:sz w:val="14"/>
-                <w:szCs w:val="14"/>
+                <w:sz w:val="18"/>
+                <w:szCs w:val="18"/>
                 <w:rtl w:val="0"/>
               </w:rPr>
               <w:t xml:space="preserve">Sentence #</w:t>
@@ -11552,8 +11536,8 @@
             <w:r>
               <w:rPr>
                 <w:rtl w:val="0"/>
-                <w:sz w:val="14"/>
-                <w:szCs w:val="14"/>
+                <w:sz w:val="18"/>
+                <w:szCs w:val="18"/>
                 <w:rFonts w:ascii="Georgia" w:hAnsi="Georgia"/>
               </w:rPr>
             </w:r>
@@ -11568,7 +11552,7 @@
           </w:tcPr>
           <w:p>
             <w:pPr>
-              <w:spacing w:before="0" w:after="40" w:line="200" w:lineRule="auto"/>
+              <w:spacing w:before="0" w:after="0" w:line="240" w:lineRule="auto"/>
               <w:jc w:val="both"/>
               <w:rPr/>
             </w:pPr>
@@ -11577,8 +11561,8 @@
                 <w:rFonts w:ascii="Georgia" w:cs="Georgia" w:eastAsia="Georgia" w:hAnsi="Georgia"/>
                 <w:b w:val="1"/>
                 <w:bCs w:val="1"/>
-                <w:sz w:val="14"/>
-                <w:szCs w:val="14"/>
+                <w:sz w:val="18"/>
+                <w:szCs w:val="18"/>
                 <w:rtl w:val="0"/>
               </w:rPr>
               <w:t xml:space="preserve">Clause</w:t>
@@ -11586,8 +11570,8 @@
             <w:r>
               <w:rPr>
                 <w:rtl w:val="0"/>
-                <w:sz w:val="14"/>
-                <w:szCs w:val="14"/>
+                <w:sz w:val="18"/>
+                <w:szCs w:val="18"/>
                 <w:rFonts w:ascii="Georgia" w:hAnsi="Georgia"/>
               </w:rPr>
             </w:r>
@@ -11602,7 +11586,7 @@
           </w:tcPr>
           <w:p>
             <w:pPr>
-              <w:spacing w:before="0" w:after="40" w:line="200" w:lineRule="auto"/>
+              <w:spacing w:before="0" w:after="0" w:line="240" w:lineRule="auto"/>
               <w:jc w:val="both"/>
               <w:rPr/>
             </w:pPr>
@@ -11611,8 +11595,8 @@
                 <w:rFonts w:ascii="Georgia" w:cs="Georgia" w:eastAsia="Georgia" w:hAnsi="Georgia"/>
                 <w:b w:val="1"/>
                 <w:bCs w:val="1"/>
-                <w:sz w:val="14"/>
-                <w:szCs w:val="14"/>
+                <w:sz w:val="18"/>
+                <w:szCs w:val="18"/>
                 <w:rtl w:val="0"/>
               </w:rPr>
               <w:t xml:space="preserve">Hedge Token</w:t>
@@ -11620,8 +11604,8 @@
             <w:r>
               <w:rPr>
                 <w:rtl w:val="0"/>
-                <w:sz w:val="14"/>
-                <w:szCs w:val="14"/>
+                <w:sz w:val="18"/>
+                <w:szCs w:val="18"/>
                 <w:rFonts w:ascii="Georgia" w:hAnsi="Georgia"/>
               </w:rPr>
             </w:r>
@@ -11636,7 +11620,7 @@
           </w:tcPr>
           <w:p>
             <w:pPr>
-              <w:spacing w:before="0" w:after="40" w:line="200" w:lineRule="auto"/>
+              <w:spacing w:before="0" w:after="0" w:line="240" w:lineRule="auto"/>
               <w:jc w:val="both"/>
               <w:rPr/>
             </w:pPr>
@@ -11645,8 +11629,8 @@
                 <w:rFonts w:ascii="Georgia" w:cs="Georgia" w:eastAsia="Georgia" w:hAnsi="Georgia"/>
                 <w:b w:val="1"/>
                 <w:bCs w:val="1"/>
-                <w:sz w:val="14"/>
-                <w:szCs w:val="14"/>
+                <w:sz w:val="18"/>
+                <w:szCs w:val="18"/>
                 <w:rtl w:val="0"/>
               </w:rPr>
               <w:t xml:space="preserve">Type</w:t>
@@ -11654,8 +11638,8 @@
             <w:r>
               <w:rPr>
                 <w:rtl w:val="0"/>
-                <w:sz w:val="14"/>
-                <w:szCs w:val="14"/>
+                <w:sz w:val="18"/>
+                <w:szCs w:val="18"/>
                 <w:rFonts w:ascii="Georgia" w:hAnsi="Georgia"/>
               </w:rPr>
             </w:r>
@@ -11670,7 +11654,7 @@
           </w:tcPr>
           <w:p>
             <w:pPr>
-              <w:spacing w:before="0" w:after="40" w:line="200" w:lineRule="auto"/>
+              <w:spacing w:before="0" w:after="0" w:line="240" w:lineRule="auto"/>
               <w:jc w:val="both"/>
               <w:rPr/>
             </w:pPr>
@@ -11679,8 +11663,8 @@
                 <w:rFonts w:ascii="Georgia" w:cs="Georgia" w:eastAsia="Georgia" w:hAnsi="Georgia"/>
                 <w:b w:val="1"/>
                 <w:bCs w:val="1"/>
-                <w:sz w:val="14"/>
-                <w:szCs w:val="14"/>
+                <w:sz w:val="18"/>
+                <w:szCs w:val="18"/>
                 <w:rtl w:val="0"/>
               </w:rPr>
               <w:t xml:space="preserve">Function</w:t>
@@ -11688,8 +11672,8 @@
             <w:r>
               <w:rPr>
                 <w:rtl w:val="0"/>
-                <w:sz w:val="14"/>
-                <w:szCs w:val="14"/>
+                <w:sz w:val="18"/>
+                <w:szCs w:val="18"/>
                 <w:rFonts w:ascii="Georgia" w:hAnsi="Georgia"/>
               </w:rPr>
             </w:r>
@@ -11704,7 +11688,7 @@
           </w:tcPr>
           <w:p>
             <w:pPr>
-              <w:spacing w:before="0" w:after="40" w:line="200" w:lineRule="auto"/>
+              <w:spacing w:before="0" w:after="0" w:line="240" w:lineRule="auto"/>
               <w:jc w:val="both"/>
               <w:rPr/>
             </w:pPr>
@@ -11713,8 +11697,8 @@
                 <w:rFonts w:ascii="Georgia" w:cs="Georgia" w:eastAsia="Georgia" w:hAnsi="Georgia"/>
                 <w:b w:val="1"/>
                 <w:bCs w:val="1"/>
-                <w:sz w:val="14"/>
-                <w:szCs w:val="14"/>
+                <w:sz w:val="18"/>
+                <w:szCs w:val="18"/>
                 <w:rtl w:val="0"/>
               </w:rPr>
               <w:t xml:space="preserve">Word Count</w:t>
@@ -11722,8 +11706,8 @@
             <w:r>
               <w:rPr>
                 <w:rtl w:val="0"/>
-                <w:sz w:val="14"/>
-                <w:szCs w:val="14"/>
+                <w:sz w:val="18"/>
+                <w:szCs w:val="18"/>
                 <w:rFonts w:ascii="Georgia" w:hAnsi="Georgia"/>
               </w:rPr>
             </w:r>
@@ -11738,7 +11722,7 @@
           </w:tcPr>
           <w:p>
             <w:pPr>
-              <w:spacing w:before="0" w:after="40" w:line="200" w:lineRule="auto"/>
+              <w:spacing w:before="0" w:after="0" w:line="240" w:lineRule="auto"/>
               <w:jc w:val="both"/>
               <w:rPr/>
             </w:pPr>
@@ -11747,8 +11731,8 @@
                 <w:rFonts w:ascii="Georgia" w:cs="Georgia" w:eastAsia="Georgia" w:hAnsi="Georgia"/>
                 <w:b w:val="1"/>
                 <w:bCs w:val="1"/>
-                <w:sz w:val="14"/>
-                <w:szCs w:val="14"/>
+                <w:sz w:val="18"/>
+                <w:szCs w:val="18"/>
                 <w:rtl w:val="0"/>
               </w:rPr>
               <w:t xml:space="preserve">Coder Notes</w:t>
@@ -11756,8 +11740,8 @@
             <w:r>
               <w:rPr>
                 <w:rtl w:val="0"/>
-                <w:sz w:val="14"/>
-                <w:szCs w:val="14"/>
+                <w:sz w:val="18"/>
+                <w:szCs w:val="18"/>
                 <w:rFonts w:ascii="Georgia" w:hAnsi="Georgia"/>
               </w:rPr>
             </w:r>
@@ -11773,15 +11757,15 @@
           <w:tcPr/>
           <w:p>
             <w:pPr>
-              <w:spacing w:before="0" w:after="40" w:line="200" w:lineRule="auto"/>
+              <w:spacing w:before="0" w:after="0" w:line="240" w:lineRule="auto"/>
               <w:jc w:val="left"/>
               <w:rPr/>
             </w:pPr>
             <w:r>
               <w:rPr>
                 <w:rFonts w:ascii="Georgia" w:cs="Georgia" w:eastAsia="Georgia" w:hAnsi="Georgia"/>
-                <w:sz w:val="14"/>
-                <w:szCs w:val="14"/>
+                <w:sz w:val="18"/>
+                <w:szCs w:val="18"/>
                 <w:rtl w:val="0"/>
               </w:rPr>
               <w:t xml:space="preserve"> </w:t>
@@ -11789,8 +11773,8 @@
             <w:r>
               <w:rPr>
                 <w:rtl w:val="0"/>
-                <w:sz w:val="14"/>
-                <w:szCs w:val="14"/>
+                <w:sz w:val="18"/>
+                <w:szCs w:val="18"/>
                 <w:rFonts w:ascii="Georgia" w:hAnsi="Georgia"/>
               </w:rPr>
             </w:r>
@@ -11800,15 +11784,15 @@
           <w:tcPr/>
           <w:p>
             <w:pPr>
-              <w:spacing w:before="0" w:after="40" w:line="200" w:lineRule="auto"/>
+              <w:spacing w:before="0" w:after="0" w:line="240" w:lineRule="auto"/>
               <w:jc w:val="left"/>
               <w:rPr/>
             </w:pPr>
             <w:r>
               <w:rPr>
                 <w:rFonts w:ascii="Georgia" w:cs="Georgia" w:eastAsia="Georgia" w:hAnsi="Georgia"/>
-                <w:sz w:val="14"/>
-                <w:szCs w:val="14"/>
+                <w:sz w:val="18"/>
+                <w:szCs w:val="18"/>
                 <w:rtl w:val="0"/>
               </w:rPr>
               <w:t xml:space="preserve"> </w:t>
@@ -11816,8 +11800,8 @@
             <w:r>
               <w:rPr>
                 <w:rtl w:val="0"/>
-                <w:sz w:val="14"/>
-                <w:szCs w:val="14"/>
+                <w:sz w:val="18"/>
+                <w:szCs w:val="18"/>
                 <w:rFonts w:ascii="Georgia" w:hAnsi="Georgia"/>
               </w:rPr>
             </w:r>
@@ -11827,15 +11811,15 @@
           <w:tcPr/>
           <w:p>
             <w:pPr>
-              <w:spacing w:before="0" w:after="40" w:line="200" w:lineRule="auto"/>
+              <w:spacing w:before="0" w:after="0" w:line="240" w:lineRule="auto"/>
               <w:jc w:val="left"/>
               <w:rPr/>
             </w:pPr>
             <w:r>
               <w:rPr>
                 <w:rFonts w:ascii="Georgia" w:cs="Georgia" w:eastAsia="Georgia" w:hAnsi="Georgia"/>
-                <w:sz w:val="14"/>
-                <w:szCs w:val="14"/>
+                <w:sz w:val="18"/>
+                <w:szCs w:val="18"/>
                 <w:rtl w:val="0"/>
               </w:rPr>
               <w:t xml:space="preserve"> </w:t>
@@ -11843,8 +11827,8 @@
             <w:r>
               <w:rPr>
                 <w:rtl w:val="0"/>
-                <w:sz w:val="14"/>
-                <w:szCs w:val="14"/>
+                <w:sz w:val="18"/>
+                <w:szCs w:val="18"/>
                 <w:rFonts w:ascii="Georgia" w:hAnsi="Georgia"/>
               </w:rPr>
             </w:r>
@@ -11854,15 +11838,15 @@
           <w:tcPr/>
           <w:p>
             <w:pPr>
-              <w:spacing w:before="0" w:after="40" w:line="200" w:lineRule="auto"/>
+              <w:spacing w:before="0" w:after="0" w:line="240" w:lineRule="auto"/>
               <w:jc w:val="left"/>
               <w:rPr/>
             </w:pPr>
             <w:r>
               <w:rPr>
                 <w:rFonts w:ascii="Georgia" w:cs="Georgia" w:eastAsia="Georgia" w:hAnsi="Georgia"/>
-                <w:sz w:val="14"/>
-                <w:szCs w:val="14"/>
+                <w:sz w:val="18"/>
+                <w:szCs w:val="18"/>
                 <w:rtl w:val="0"/>
               </w:rPr>
               <w:t xml:space="preserve"> </w:t>
@@ -11870,8 +11854,8 @@
             <w:r>
               <w:rPr>
                 <w:rtl w:val="0"/>
-                <w:sz w:val="14"/>
-                <w:szCs w:val="14"/>
+                <w:sz w:val="18"/>
+                <w:szCs w:val="18"/>
                 <w:rFonts w:ascii="Georgia" w:hAnsi="Georgia"/>
               </w:rPr>
             </w:r>
@@ -11881,15 +11865,15 @@
           <w:tcPr/>
           <w:p>
             <w:pPr>
-              <w:spacing w:before="0" w:after="40" w:line="200" w:lineRule="auto"/>
+              <w:spacing w:before="0" w:after="0" w:line="240" w:lineRule="auto"/>
               <w:jc w:val="left"/>
               <w:rPr/>
             </w:pPr>
             <w:r>
               <w:rPr>
                 <w:rFonts w:ascii="Georgia" w:cs="Georgia" w:eastAsia="Georgia" w:hAnsi="Georgia"/>
-                <w:sz w:val="14"/>
-                <w:szCs w:val="14"/>
+                <w:sz w:val="18"/>
+                <w:szCs w:val="18"/>
                 <w:rtl w:val="0"/>
               </w:rPr>
               <w:t xml:space="preserve"> </w:t>
@@ -11897,8 +11881,8 @@
             <w:r>
               <w:rPr>
                 <w:rtl w:val="0"/>
-                <w:sz w:val="14"/>
-                <w:szCs w:val="14"/>
+                <w:sz w:val="18"/>
+                <w:szCs w:val="18"/>
                 <w:rFonts w:ascii="Georgia" w:hAnsi="Georgia"/>
               </w:rPr>
             </w:r>
@@ -11908,15 +11892,15 @@
           <w:tcPr/>
           <w:p>
             <w:pPr>
-              <w:spacing w:before="0" w:after="40" w:line="200" w:lineRule="auto"/>
+              <w:spacing w:before="0" w:after="0" w:line="240" w:lineRule="auto"/>
               <w:jc w:val="left"/>
               <w:rPr/>
             </w:pPr>
             <w:r>
               <w:rPr>
                 <w:rFonts w:ascii="Georgia" w:cs="Georgia" w:eastAsia="Georgia" w:hAnsi="Georgia"/>
-                <w:sz w:val="14"/>
-                <w:szCs w:val="14"/>
+                <w:sz w:val="18"/>
+                <w:szCs w:val="18"/>
                 <w:rtl w:val="0"/>
               </w:rPr>
               <w:t xml:space="preserve"> </w:t>
@@ -11924,8 +11908,8 @@
             <w:r>
               <w:rPr>
                 <w:rtl w:val="0"/>
-                <w:sz w:val="14"/>
-                <w:szCs w:val="14"/>
+                <w:sz w:val="18"/>
+                <w:szCs w:val="18"/>
                 <w:rFonts w:ascii="Georgia" w:hAnsi="Georgia"/>
               </w:rPr>
             </w:r>
@@ -11935,15 +11919,15 @@
           <w:tcPr/>
           <w:p>
             <w:pPr>
-              <w:spacing w:before="0" w:after="40" w:line="200" w:lineRule="auto"/>
+              <w:spacing w:before="0" w:after="0" w:line="240" w:lineRule="auto"/>
               <w:jc w:val="left"/>
               <w:rPr/>
             </w:pPr>
             <w:r>
               <w:rPr>
                 <w:rFonts w:ascii="Georgia" w:cs="Georgia" w:eastAsia="Georgia" w:hAnsi="Georgia"/>
-                <w:sz w:val="14"/>
-                <w:szCs w:val="14"/>
+                <w:sz w:val="18"/>
+                <w:szCs w:val="18"/>
                 <w:rtl w:val="0"/>
               </w:rPr>
               <w:t xml:space="preserve"> </w:t>
@@ -11951,8 +11935,8 @@
             <w:r>
               <w:rPr>
                 <w:rtl w:val="0"/>
-                <w:sz w:val="14"/>
-                <w:szCs w:val="14"/>
+                <w:sz w:val="18"/>
+                <w:szCs w:val="18"/>
                 <w:rFonts w:ascii="Georgia" w:hAnsi="Georgia"/>
               </w:rPr>
             </w:r>
@@ -11962,15 +11946,15 @@
           <w:tcPr/>
           <w:p>
             <w:pPr>
-              <w:spacing w:before="0" w:after="40" w:line="200" w:lineRule="auto"/>
+              <w:spacing w:before="0" w:after="0" w:line="240" w:lineRule="auto"/>
               <w:jc w:val="left"/>
               <w:rPr/>
             </w:pPr>
             <w:r>
               <w:rPr>
                 <w:rFonts w:ascii="Georgia" w:cs="Georgia" w:eastAsia="Georgia" w:hAnsi="Georgia"/>
-                <w:sz w:val="14"/>
-                <w:szCs w:val="14"/>
+                <w:sz w:val="18"/>
+                <w:szCs w:val="18"/>
                 <w:rtl w:val="0"/>
               </w:rPr>
               <w:t xml:space="preserve"> </w:t>
@@ -11978,8 +11962,8 @@
             <w:r>
               <w:rPr>
                 <w:rtl w:val="0"/>
-                <w:sz w:val="14"/>
-                <w:szCs w:val="14"/>
+                <w:sz w:val="18"/>
+                <w:szCs w:val="18"/>
                 <w:rFonts w:ascii="Georgia" w:hAnsi="Georgia"/>
               </w:rPr>
             </w:r>
@@ -11989,7 +11973,7 @@
     </w:tbl>
     <w:p>
       <w:pPr>
-        <w:spacing w:before="0" w:after="40" w:line="200" w:lineRule="auto"/>
+        <w:spacing w:before="0" w:after="60" w:line="240" w:lineRule="auto"/>
         <w:ind w:firstLine="720"/>
         <w:jc w:val="both"/>
         <w:rPr/>
@@ -12002,8 +11986,8 @@
           <w:i w:val="1"/>
           <w:iCs w:val="1"/>
           <w:color w:val="000000"/>
-          <w:sz w:val="16"/>
-          <w:szCs w:val="16"/>
+          <w:sz w:val="22"/>
+          <w:szCs w:val="22"/>
           <w:rtl w:val="0"/>
         </w:rPr>
         <w:t xml:space="preserve">Discipline codes: Acs1 to A10 and Aas1 to A10 (Agriculture), VM1 to VM20 (Veterinary Medicine), B1 to B20 (Biology).</w:t>
@@ -12011,14 +11995,12 @@
       <w:r>
         <w:rPr>
           <w:rtl w:val="0"/>
-          <w:sz w:val="16"/>
-          <w:szCs w:val="16"/>
-        </w:rPr>
-      </w:r>
-    </w:p>
-    <w:p>
-      <w:pPr>
-        <w:spacing w:before="0" w:after="40" w:line="200" w:lineRule="auto"/>
+        </w:rPr>
+      </w:r>
+    </w:p>
+    <w:p>
+      <w:pPr>
+        <w:spacing w:before="0" w:after="60" w:line="240" w:lineRule="auto"/>
         <w:ind w:firstLine="720"/>
         <w:jc w:val="both"/>
         <w:rPr/>
@@ -12031,8 +12013,8 @@
           <w:i w:val="1"/>
           <w:iCs w:val="1"/>
           <w:color w:val="000000"/>
-          <w:sz w:val="16"/>
-          <w:szCs w:val="16"/>
+          <w:sz w:val="22"/>
+          <w:szCs w:val="22"/>
           <w:rtl w:val="0"/>
         </w:rPr>
         <w:t xml:space="preserve">Layer 3 data, tracked separately so it never inflates RQ2 counts.</w:t>
@@ -12040,8 +12022,6 @@
       <w:r>
         <w:rPr>
           <w:rtl w:val="0"/>
-          <w:sz w:val="16"/>
-          <w:szCs w:val="16"/>
         </w:rPr>
       </w:r>
     </w:p>
@@ -12049,7 +12029,7 @@
       <w:pPr>
         <w:keepNext w:val="1"/>
         <w:keepLines w:val="1"/>
-        <w:spacing w:before="0" w:after="40" w:line="200" w:lineRule="auto"/>
+        <w:spacing w:before="0" w:after="60" w:line="240" w:lineRule="auto"/>
         <w:jc w:val="left"/>
         <w:rPr/>
       </w:pPr>
@@ -12060,8 +12040,8 @@
           <w:bCs w:val="0"/>
           <w:i w:val="1"/>
           <w:iCs w:val="1"/>
-          <w:sz w:val="16"/>
-          <w:szCs w:val="16"/>
+          <w:sz w:val="24"/>
+          <w:szCs w:val="24"/>
           <w:rtl w:val="0"/>
         </w:rPr>
         <w:t xml:space="preserve">Optional Tab: Unhedged Assertion Sites</w:t>
@@ -12069,8 +12049,6 @@
       <w:r>
         <w:rPr>
           <w:rtl w:val="0"/>
-          <w:sz w:val="16"/>
-          <w:szCs w:val="16"/>
         </w:rPr>
       </w:r>
     </w:p>
@@ -12123,7 +12101,7 @@
           </w:tcPr>
           <w:p>
             <w:pPr>
-              <w:spacing w:before="0" w:after="40" w:line="200" w:lineRule="auto"/>
+              <w:spacing w:before="0" w:after="0" w:line="240" w:lineRule="auto"/>
               <w:jc w:val="both"/>
               <w:rPr/>
             </w:pPr>
@@ -12132,8 +12110,8 @@
                 <w:rFonts w:ascii="Georgia" w:cs="Georgia" w:eastAsia="Georgia" w:hAnsi="Georgia"/>
                 <w:b w:val="1"/>
                 <w:bCs w:val="1"/>
-                <w:sz w:val="14"/>
-                <w:szCs w:val="14"/>
+                <w:sz w:val="18"/>
+                <w:szCs w:val="18"/>
                 <w:rtl w:val="0"/>
               </w:rPr>
               <w:t xml:space="preserve">Abstract ID</w:t>
@@ -12141,8 +12119,8 @@
             <w:r>
               <w:rPr>
                 <w:rtl w:val="0"/>
-                <w:sz w:val="14"/>
-                <w:szCs w:val="14"/>
+                <w:sz w:val="18"/>
+                <w:szCs w:val="18"/>
                 <w:rFonts w:ascii="Georgia" w:hAnsi="Georgia"/>
               </w:rPr>
             </w:r>
@@ -12157,7 +12135,7 @@
           </w:tcPr>
           <w:p>
             <w:pPr>
-              <w:spacing w:before="0" w:after="40" w:line="200" w:lineRule="auto"/>
+              <w:spacing w:before="0" w:after="0" w:line="240" w:lineRule="auto"/>
               <w:jc w:val="both"/>
               <w:rPr/>
             </w:pPr>
@@ -12166,8 +12144,8 @@
                 <w:rFonts w:ascii="Georgia" w:cs="Georgia" w:eastAsia="Georgia" w:hAnsi="Georgia"/>
                 <w:b w:val="1"/>
                 <w:bCs w:val="1"/>
-                <w:sz w:val="14"/>
-                <w:szCs w:val="14"/>
+                <w:sz w:val="18"/>
+                <w:szCs w:val="18"/>
                 <w:rtl w:val="0"/>
               </w:rPr>
               <w:t xml:space="preserve">Sentence #</w:t>
@@ -12175,8 +12153,8 @@
             <w:r>
               <w:rPr>
                 <w:rtl w:val="0"/>
-                <w:sz w:val="14"/>
-                <w:szCs w:val="14"/>
+                <w:sz w:val="18"/>
+                <w:szCs w:val="18"/>
                 <w:rFonts w:ascii="Georgia" w:hAnsi="Georgia"/>
               </w:rPr>
             </w:r>
@@ -12191,7 +12169,7 @@
           </w:tcPr>
           <w:p>
             <w:pPr>
-              <w:spacing w:before="0" w:after="40" w:line="200" w:lineRule="auto"/>
+              <w:spacing w:before="0" w:after="0" w:line="240" w:lineRule="auto"/>
               <w:jc w:val="both"/>
               <w:rPr/>
             </w:pPr>
@@ -12200,8 +12178,8 @@
                 <w:rFonts w:ascii="Georgia" w:cs="Georgia" w:eastAsia="Georgia" w:hAnsi="Georgia"/>
                 <w:b w:val="1"/>
                 <w:bCs w:val="1"/>
-                <w:sz w:val="14"/>
-                <w:szCs w:val="14"/>
+                <w:sz w:val="18"/>
+                <w:szCs w:val="18"/>
                 <w:rtl w:val="0"/>
               </w:rPr>
               <w:t xml:space="preserve">Clause</w:t>
@@ -12209,8 +12187,8 @@
             <w:r>
               <w:rPr>
                 <w:rtl w:val="0"/>
-                <w:sz w:val="14"/>
-                <w:szCs w:val="14"/>
+                <w:sz w:val="18"/>
+                <w:szCs w:val="18"/>
                 <w:rFonts w:ascii="Georgia" w:hAnsi="Georgia"/>
               </w:rPr>
             </w:r>
@@ -12225,7 +12203,7 @@
           </w:tcPr>
           <w:p>
             <w:pPr>
-              <w:spacing w:before="0" w:after="40" w:line="200" w:lineRule="auto"/>
+              <w:spacing w:before="0" w:after="0" w:line="240" w:lineRule="auto"/>
               <w:jc w:val="both"/>
               <w:rPr/>
             </w:pPr>
@@ -12234,8 +12212,8 @@
                 <w:rFonts w:ascii="Georgia" w:cs="Georgia" w:eastAsia="Georgia" w:hAnsi="Georgia"/>
                 <w:b w:val="1"/>
                 <w:bCs w:val="1"/>
-                <w:sz w:val="14"/>
-                <w:szCs w:val="14"/>
+                <w:sz w:val="18"/>
+                <w:szCs w:val="18"/>
                 <w:rtl w:val="0"/>
               </w:rPr>
               <w:t xml:space="preserve">Subtype</w:t>
@@ -12243,8 +12221,8 @@
             <w:r>
               <w:rPr>
                 <w:rtl w:val="0"/>
-                <w:sz w:val="14"/>
-                <w:szCs w:val="14"/>
+                <w:sz w:val="18"/>
+                <w:szCs w:val="18"/>
                 <w:rFonts w:ascii="Georgia" w:hAnsi="Georgia"/>
               </w:rPr>
             </w:r>
@@ -12259,7 +12237,7 @@
           </w:tcPr>
           <w:p>
             <w:pPr>
-              <w:spacing w:before="0" w:after="40" w:line="200" w:lineRule="auto"/>
+              <w:spacing w:before="0" w:after="0" w:line="240" w:lineRule="auto"/>
               <w:jc w:val="both"/>
               <w:rPr/>
             </w:pPr>
@@ -12268,8 +12246,8 @@
                 <w:rFonts w:ascii="Georgia" w:cs="Georgia" w:eastAsia="Georgia" w:hAnsi="Georgia"/>
                 <w:b w:val="1"/>
                 <w:bCs w:val="1"/>
-                <w:sz w:val="14"/>
-                <w:szCs w:val="14"/>
+                <w:sz w:val="18"/>
+                <w:szCs w:val="18"/>
                 <w:rtl w:val="0"/>
               </w:rPr>
               <w:t xml:space="preserve">Reverse Test (Y/N)</w:t>
@@ -12277,8 +12255,8 @@
             <w:r>
               <w:rPr>
                 <w:rtl w:val="0"/>
-                <w:sz w:val="14"/>
-                <w:szCs w:val="14"/>
+                <w:sz w:val="18"/>
+                <w:szCs w:val="18"/>
                 <w:rFonts w:ascii="Georgia" w:hAnsi="Georgia"/>
               </w:rPr>
             </w:r>
@@ -12293,7 +12271,7 @@
           </w:tcPr>
           <w:p>
             <w:pPr>
-              <w:spacing w:before="0" w:after="40" w:line="200" w:lineRule="auto"/>
+              <w:spacing w:before="0" w:after="0" w:line="240" w:lineRule="auto"/>
               <w:jc w:val="both"/>
               <w:rPr/>
             </w:pPr>
@@ -12302,8 +12280,8 @@
                 <w:rFonts w:ascii="Georgia" w:cs="Georgia" w:eastAsia="Georgia" w:hAnsi="Georgia"/>
                 <w:b w:val="1"/>
                 <w:bCs w:val="1"/>
-                <w:sz w:val="14"/>
-                <w:szCs w:val="14"/>
+                <w:sz w:val="18"/>
+                <w:szCs w:val="18"/>
                 <w:rtl w:val="0"/>
               </w:rPr>
               <w:t xml:space="preserve">Coder Notes</w:t>
@@ -12311,8 +12289,8 @@
             <w:r>
               <w:rPr>
                 <w:rtl w:val="0"/>
-                <w:sz w:val="14"/>
-                <w:szCs w:val="14"/>
+                <w:sz w:val="18"/>
+                <w:szCs w:val="18"/>
                 <w:rFonts w:ascii="Georgia" w:hAnsi="Georgia"/>
               </w:rPr>
             </w:r>
@@ -12328,15 +12306,15 @@
           <w:tcPr/>
           <w:p>
             <w:pPr>
-              <w:spacing w:before="0" w:after="40" w:line="200" w:lineRule="auto"/>
+              <w:spacing w:before="0" w:after="0" w:line="240" w:lineRule="auto"/>
               <w:jc w:val="left"/>
               <w:rPr/>
             </w:pPr>
             <w:r>
               <w:rPr>
                 <w:rFonts w:ascii="Georgia" w:cs="Georgia" w:eastAsia="Georgia" w:hAnsi="Georgia"/>
-                <w:sz w:val="14"/>
-                <w:szCs w:val="14"/>
+                <w:sz w:val="18"/>
+                <w:szCs w:val="18"/>
                 <w:rtl w:val="0"/>
               </w:rPr>
               <w:t xml:space="preserve"> </w:t>
@@ -12344,8 +12322,8 @@
             <w:r>
               <w:rPr>
                 <w:rtl w:val="0"/>
-                <w:sz w:val="14"/>
-                <w:szCs w:val="14"/>
+                <w:sz w:val="18"/>
+                <w:szCs w:val="18"/>
                 <w:rFonts w:ascii="Georgia" w:hAnsi="Georgia"/>
               </w:rPr>
             </w:r>
@@ -12355,15 +12333,15 @@
           <w:tcPr/>
           <w:p>
             <w:pPr>
-              <w:spacing w:before="0" w:after="40" w:line="200" w:lineRule="auto"/>
+              <w:spacing w:before="0" w:after="0" w:line="240" w:lineRule="auto"/>
               <w:jc w:val="left"/>
               <w:rPr/>
             </w:pPr>
             <w:r>
               <w:rPr>
                 <w:rFonts w:ascii="Georgia" w:cs="Georgia" w:eastAsia="Georgia" w:hAnsi="Georgia"/>
-                <w:sz w:val="14"/>
-                <w:szCs w:val="14"/>
+                <w:sz w:val="18"/>
+                <w:szCs w:val="18"/>
                 <w:rtl w:val="0"/>
               </w:rPr>
               <w:t xml:space="preserve"> </w:t>
@@ -12371,8 +12349,8 @@
             <w:r>
               <w:rPr>
                 <w:rtl w:val="0"/>
-                <w:sz w:val="14"/>
-                <w:szCs w:val="14"/>
+                <w:sz w:val="18"/>
+                <w:szCs w:val="18"/>
                 <w:rFonts w:ascii="Georgia" w:hAnsi="Georgia"/>
               </w:rPr>
             </w:r>
@@ -12382,15 +12360,15 @@
           <w:tcPr/>
           <w:p>
             <w:pPr>
-              <w:spacing w:before="0" w:after="40" w:line="200" w:lineRule="auto"/>
+              <w:spacing w:before="0" w:after="0" w:line="240" w:lineRule="auto"/>
               <w:jc w:val="left"/>
               <w:rPr/>
             </w:pPr>
             <w:r>
               <w:rPr>
                 <w:rFonts w:ascii="Georgia" w:cs="Georgia" w:eastAsia="Georgia" w:hAnsi="Georgia"/>
-                <w:sz w:val="14"/>
-                <w:szCs w:val="14"/>
+                <w:sz w:val="18"/>
+                <w:szCs w:val="18"/>
                 <w:rtl w:val="0"/>
               </w:rPr>
               <w:t xml:space="preserve"> </w:t>
@@ -12398,8 +12376,8 @@
             <w:r>
               <w:rPr>
                 <w:rtl w:val="0"/>
-                <w:sz w:val="14"/>
-                <w:szCs w:val="14"/>
+                <w:sz w:val="18"/>
+                <w:szCs w:val="18"/>
                 <w:rFonts w:ascii="Georgia" w:hAnsi="Georgia"/>
               </w:rPr>
             </w:r>
@@ -12409,15 +12387,15 @@
           <w:tcPr/>
           <w:p>
             <w:pPr>
-              <w:spacing w:before="0" w:after="40" w:line="200" w:lineRule="auto"/>
+              <w:spacing w:before="0" w:after="0" w:line="240" w:lineRule="auto"/>
               <w:jc w:val="left"/>
               <w:rPr/>
             </w:pPr>
             <w:r>
               <w:rPr>
                 <w:rFonts w:ascii="Georgia" w:cs="Georgia" w:eastAsia="Georgia" w:hAnsi="Georgia"/>
-                <w:sz w:val="14"/>
-                <w:szCs w:val="14"/>
+                <w:sz w:val="18"/>
+                <w:szCs w:val="18"/>
                 <w:rtl w:val="0"/>
               </w:rPr>
               <w:t xml:space="preserve"> </w:t>
@@ -12425,8 +12403,8 @@
             <w:r>
               <w:rPr>
                 <w:rtl w:val="0"/>
-                <w:sz w:val="14"/>
-                <w:szCs w:val="14"/>
+                <w:sz w:val="18"/>
+                <w:szCs w:val="18"/>
                 <w:rFonts w:ascii="Georgia" w:hAnsi="Georgia"/>
               </w:rPr>
             </w:r>
@@ -12436,15 +12414,15 @@
           <w:tcPr/>
           <w:p>
             <w:pPr>
-              <w:spacing w:before="0" w:after="40" w:line="200" w:lineRule="auto"/>
+              <w:spacing w:before="0" w:after="0" w:line="240" w:lineRule="auto"/>
               <w:jc w:val="left"/>
               <w:rPr/>
             </w:pPr>
             <w:r>
               <w:rPr>
                 <w:rFonts w:ascii="Georgia" w:cs="Georgia" w:eastAsia="Georgia" w:hAnsi="Georgia"/>
-                <w:sz w:val="14"/>
-                <w:szCs w:val="14"/>
+                <w:sz w:val="18"/>
+                <w:szCs w:val="18"/>
                 <w:rtl w:val="0"/>
               </w:rPr>
               <w:t xml:space="preserve"> </w:t>
@@ -12452,8 +12430,8 @@
             <w:r>
               <w:rPr>
                 <w:rtl w:val="0"/>
-                <w:sz w:val="14"/>
-                <w:szCs w:val="14"/>
+                <w:sz w:val="18"/>
+                <w:szCs w:val="18"/>
                 <w:rFonts w:ascii="Georgia" w:hAnsi="Georgia"/>
               </w:rPr>
             </w:r>
@@ -12463,15 +12441,15 @@
           <w:tcPr/>
           <w:p>
             <w:pPr>
-              <w:spacing w:before="0" w:after="40" w:line="200" w:lineRule="auto"/>
+              <w:spacing w:before="0" w:after="0" w:line="240" w:lineRule="auto"/>
               <w:jc w:val="left"/>
               <w:rPr/>
             </w:pPr>
             <w:r>
               <w:rPr>
                 <w:rFonts w:ascii="Georgia" w:cs="Georgia" w:eastAsia="Georgia" w:hAnsi="Georgia"/>
-                <w:sz w:val="14"/>
-                <w:szCs w:val="14"/>
+                <w:sz w:val="18"/>
+                <w:szCs w:val="18"/>
                 <w:rtl w:val="0"/>
               </w:rPr>
               <w:t xml:space="preserve"> </w:t>
@@ -12479,8 +12457,8 @@
             <w:r>
               <w:rPr>
                 <w:rtl w:val="0"/>
-                <w:sz w:val="14"/>
-                <w:szCs w:val="14"/>
+                <w:sz w:val="18"/>
+                <w:szCs w:val="18"/>
                 <w:rFonts w:ascii="Georgia" w:hAnsi="Georgia"/>
               </w:rPr>
             </w:r>
@@ -12491,7 +12469,7 @@
     <w:p>
       <w:pPr>
         <w:keepNext w:val="1"/>
-        <w:spacing w:before="0" w:after="40" w:line="200" w:lineRule="auto"/>
+        <w:spacing w:before="0" w:after="60" w:line="240" w:lineRule="auto"/>
         <w:jc w:val="left"/>
         <w:rPr/>
       </w:pPr>
@@ -12502,8 +12480,8 @@
           <w:bCs w:val="0"/>
           <w:i w:val="1"/>
           <w:iCs w:val="1"/>
-          <w:sz w:val="16"/>
-          <w:szCs w:val="16"/>
+          <w:sz w:val="24"/>
+          <w:szCs w:val="24"/>
           <w:rtl w:val="0"/>
         </w:rPr>
         <w:t xml:space="preserve">Optional Tab: Rejected Hedge Candidates</w:t>
@@ -12511,8 +12489,6 @@
       <w:r>
         <w:rPr>
           <w:rtl w:val="0"/>
-          <w:sz w:val="16"/>
-          <w:szCs w:val="16"/>
         </w:rPr>
       </w:r>
     </w:p>
@@ -12520,7 +12496,7 @@
       <w:pPr>
         <w:keepNext w:val="1"/>
         <w:keepLines w:val="1"/>
-        <w:spacing w:before="0" w:after="40" w:line="200" w:lineRule="auto"/>
+        <w:spacing w:before="0" w:after="60" w:line="240" w:lineRule="auto"/>
         <w:ind w:firstLine="720"/>
         <w:jc w:val="both"/>
         <w:rPr/>
@@ -12532,8 +12508,8 @@
           <w:bCs w:val="0"/>
           <w:i w:val="0"/>
           <w:iCs w:val="0"/>
-          <w:sz w:val="16"/>
-          <w:szCs w:val="16"/>
+          <w:sz w:val="22"/>
+          <w:szCs w:val="22"/>
           <w:rtl w:val="0"/>
         </w:rPr>
         <w:t xml:space="preserve">False positives, logged for traceability during the reliability check.</w:t>
@@ -12541,8 +12517,6 @@
       <w:r>
         <w:rPr>
           <w:rtl w:val="0"/>
-          <w:sz w:val="16"/>
-          <w:szCs w:val="16"/>
         </w:rPr>
       </w:r>
     </w:p>
@@ -12595,7 +12569,7 @@
           </w:tcPr>
           <w:p>
             <w:pPr>
-              <w:spacing w:before="0" w:after="40" w:line="200" w:lineRule="auto"/>
+              <w:spacing w:before="0" w:after="0" w:line="240" w:lineRule="auto"/>
               <w:jc w:val="both"/>
               <w:rPr/>
             </w:pPr>
@@ -12604,8 +12578,8 @@
                 <w:rFonts w:ascii="Georgia" w:cs="Georgia" w:eastAsia="Georgia" w:hAnsi="Georgia"/>
                 <w:b w:val="1"/>
                 <w:bCs w:val="1"/>
-                <w:sz w:val="14"/>
-                <w:szCs w:val="14"/>
+                <w:sz w:val="18"/>
+                <w:szCs w:val="18"/>
                 <w:rtl w:val="0"/>
               </w:rPr>
               <w:t xml:space="preserve">Abstract ID</w:t>
@@ -12613,8 +12587,8 @@
             <w:r>
               <w:rPr>
                 <w:rtl w:val="0"/>
-                <w:sz w:val="14"/>
-                <w:szCs w:val="14"/>
+                <w:sz w:val="18"/>
+                <w:szCs w:val="18"/>
                 <w:rFonts w:ascii="Georgia" w:hAnsi="Georgia"/>
               </w:rPr>
             </w:r>
@@ -12629,7 +12603,7 @@
           </w:tcPr>
           <w:p>
             <w:pPr>
-              <w:spacing w:before="0" w:after="40" w:line="200" w:lineRule="auto"/>
+              <w:spacing w:before="0" w:after="0" w:line="240" w:lineRule="auto"/>
               <w:jc w:val="both"/>
               <w:rPr/>
             </w:pPr>
@@ -12638,8 +12612,8 @@
                 <w:rFonts w:ascii="Georgia" w:cs="Georgia" w:eastAsia="Georgia" w:hAnsi="Georgia"/>
                 <w:b w:val="1"/>
                 <w:bCs w:val="1"/>
-                <w:sz w:val="14"/>
-                <w:szCs w:val="14"/>
+                <w:sz w:val="18"/>
+                <w:szCs w:val="18"/>
                 <w:rtl w:val="0"/>
               </w:rPr>
               <w:t xml:space="preserve">Sentence #</w:t>
@@ -12647,8 +12621,8 @@
             <w:r>
               <w:rPr>
                 <w:rtl w:val="0"/>
-                <w:sz w:val="14"/>
-                <w:szCs w:val="14"/>
+                <w:sz w:val="18"/>
+                <w:szCs w:val="18"/>
                 <w:rFonts w:ascii="Georgia" w:hAnsi="Georgia"/>
               </w:rPr>
             </w:r>
@@ -12663,7 +12637,7 @@
           </w:tcPr>
           <w:p>
             <w:pPr>
-              <w:spacing w:before="0" w:after="40" w:line="200" w:lineRule="auto"/>
+              <w:spacing w:before="0" w:after="0" w:line="240" w:lineRule="auto"/>
               <w:jc w:val="both"/>
               <w:rPr/>
             </w:pPr>
@@ -12672,8 +12646,8 @@
                 <w:rFonts w:ascii="Georgia" w:cs="Georgia" w:eastAsia="Georgia" w:hAnsi="Georgia"/>
                 <w:b w:val="1"/>
                 <w:bCs w:val="1"/>
-                <w:sz w:val="14"/>
-                <w:szCs w:val="14"/>
+                <w:sz w:val="18"/>
+                <w:szCs w:val="18"/>
                 <w:rtl w:val="0"/>
               </w:rPr>
               <w:t xml:space="preserve">Clause</w:t>
@@ -12681,8 +12655,8 @@
             <w:r>
               <w:rPr>
                 <w:rtl w:val="0"/>
-                <w:sz w:val="14"/>
-                <w:szCs w:val="14"/>
+                <w:sz w:val="18"/>
+                <w:szCs w:val="18"/>
                 <w:rFonts w:ascii="Georgia" w:hAnsi="Georgia"/>
               </w:rPr>
             </w:r>
@@ -12697,7 +12671,7 @@
           </w:tcPr>
           <w:p>
             <w:pPr>
-              <w:spacing w:before="0" w:after="40" w:line="200" w:lineRule="auto"/>
+              <w:spacing w:before="0" w:after="0" w:line="240" w:lineRule="auto"/>
               <w:jc w:val="both"/>
               <w:rPr/>
             </w:pPr>
@@ -12706,8 +12680,8 @@
                 <w:rFonts w:ascii="Georgia" w:cs="Georgia" w:eastAsia="Georgia" w:hAnsi="Georgia"/>
                 <w:b w:val="1"/>
                 <w:bCs w:val="1"/>
-                <w:sz w:val="14"/>
-                <w:szCs w:val="14"/>
+                <w:sz w:val="18"/>
+                <w:szCs w:val="18"/>
                 <w:rtl w:val="0"/>
               </w:rPr>
               <w:t xml:space="preserve">Token</w:t>
@@ -12715,8 +12689,8 @@
             <w:r>
               <w:rPr>
                 <w:rtl w:val="0"/>
-                <w:sz w:val="14"/>
-                <w:szCs w:val="14"/>
+                <w:sz w:val="18"/>
+                <w:szCs w:val="18"/>
                 <w:rFonts w:ascii="Georgia" w:hAnsi="Georgia"/>
               </w:rPr>
             </w:r>
@@ -12731,7 +12705,7 @@
           </w:tcPr>
           <w:p>
             <w:pPr>
-              <w:spacing w:before="0" w:after="40" w:line="200" w:lineRule="auto"/>
+              <w:spacing w:before="0" w:after="0" w:line="240" w:lineRule="auto"/>
               <w:jc w:val="both"/>
               <w:rPr/>
             </w:pPr>
@@ -12740,8 +12714,8 @@
                 <w:rFonts w:ascii="Georgia" w:cs="Georgia" w:eastAsia="Georgia" w:hAnsi="Georgia"/>
                 <w:b w:val="1"/>
                 <w:bCs w:val="1"/>
-                <w:sz w:val="14"/>
-                <w:szCs w:val="14"/>
+                <w:sz w:val="18"/>
+                <w:szCs w:val="18"/>
                 <w:rtl w:val="0"/>
               </w:rPr>
               <w:t xml:space="preserve">Reason Code</w:t>
@@ -12749,8 +12723,8 @@
             <w:r>
               <w:rPr>
                 <w:rtl w:val="0"/>
-                <w:sz w:val="14"/>
-                <w:szCs w:val="14"/>
+                <w:sz w:val="18"/>
+                <w:szCs w:val="18"/>
                 <w:rFonts w:ascii="Georgia" w:hAnsi="Georgia"/>
               </w:rPr>
             </w:r>
@@ -12765,7 +12739,7 @@
           </w:tcPr>
           <w:p>
             <w:pPr>
-              <w:spacing w:before="0" w:after="40" w:line="200" w:lineRule="auto"/>
+              <w:spacing w:before="0" w:after="0" w:line="240" w:lineRule="auto"/>
               <w:jc w:val="both"/>
               <w:rPr/>
             </w:pPr>
@@ -12774,8 +12748,8 @@
                 <w:rFonts w:ascii="Georgia" w:cs="Georgia" w:eastAsia="Georgia" w:hAnsi="Georgia"/>
                 <w:b w:val="1"/>
                 <w:bCs w:val="1"/>
-                <w:sz w:val="14"/>
-                <w:szCs w:val="14"/>
+                <w:sz w:val="18"/>
+                <w:szCs w:val="18"/>
                 <w:rtl w:val="0"/>
               </w:rPr>
               <w:t xml:space="preserve">Coder Notes</w:t>
@@ -12783,8 +12757,8 @@
             <w:r>
               <w:rPr>
                 <w:rtl w:val="0"/>
-                <w:sz w:val="14"/>
-                <w:szCs w:val="14"/>
+                <w:sz w:val="18"/>
+                <w:szCs w:val="18"/>
                 <w:rFonts w:ascii="Georgia" w:hAnsi="Georgia"/>
               </w:rPr>
             </w:r>
@@ -12800,15 +12774,15 @@
           <w:tcPr/>
           <w:p>
             <w:pPr>
-              <w:spacing w:before="0" w:after="40" w:line="200" w:lineRule="auto"/>
+              <w:spacing w:before="0" w:after="0" w:line="240" w:lineRule="auto"/>
               <w:jc w:val="left"/>
               <w:rPr/>
             </w:pPr>
             <w:r>
               <w:rPr>
                 <w:rFonts w:ascii="Georgia" w:cs="Georgia" w:eastAsia="Georgia" w:hAnsi="Georgia"/>
-                <w:sz w:val="14"/>
-                <w:szCs w:val="14"/>
+                <w:sz w:val="18"/>
+                <w:szCs w:val="18"/>
                 <w:rtl w:val="0"/>
               </w:rPr>
               <w:t xml:space="preserve"> </w:t>
@@ -12816,8 +12790,8 @@
             <w:r>
               <w:rPr>
                 <w:rtl w:val="0"/>
-                <w:sz w:val="14"/>
-                <w:szCs w:val="14"/>
+                <w:sz w:val="18"/>
+                <w:szCs w:val="18"/>
                 <w:rFonts w:ascii="Georgia" w:hAnsi="Georgia"/>
               </w:rPr>
             </w:r>
@@ -12827,15 +12801,15 @@
           <w:tcPr/>
           <w:p>
             <w:pPr>
-              <w:spacing w:before="0" w:after="40" w:line="200" w:lineRule="auto"/>
+              <w:spacing w:before="0" w:after="0" w:line="240" w:lineRule="auto"/>
               <w:jc w:val="left"/>
               <w:rPr/>
             </w:pPr>
             <w:r>
               <w:rPr>
                 <w:rFonts w:ascii="Georgia" w:cs="Georgia" w:eastAsia="Georgia" w:hAnsi="Georgia"/>
-                <w:sz w:val="14"/>
-                <w:szCs w:val="14"/>
+                <w:sz w:val="18"/>
+                <w:szCs w:val="18"/>
                 <w:rtl w:val="0"/>
               </w:rPr>
               <w:t xml:space="preserve"> </w:t>
@@ -12843,8 +12817,8 @@
             <w:r>
               <w:rPr>
                 <w:rtl w:val="0"/>
-                <w:sz w:val="14"/>
-                <w:szCs w:val="14"/>
+                <w:sz w:val="18"/>
+                <w:szCs w:val="18"/>
                 <w:rFonts w:ascii="Georgia" w:hAnsi="Georgia"/>
               </w:rPr>
             </w:r>
@@ -12854,15 +12828,15 @@
           <w:tcPr/>
           <w:p>
             <w:pPr>
-              <w:spacing w:before="0" w:after="40" w:line="200" w:lineRule="auto"/>
+              <w:spacing w:before="0" w:after="0" w:line="240" w:lineRule="auto"/>
               <w:jc w:val="left"/>
               <w:rPr/>
             </w:pPr>
             <w:r>
               <w:rPr>
                 <w:rFonts w:ascii="Georgia" w:cs="Georgia" w:eastAsia="Georgia" w:hAnsi="Georgia"/>
-                <w:sz w:val="14"/>
-                <w:szCs w:val="14"/>
+                <w:sz w:val="18"/>
+                <w:szCs w:val="18"/>
                 <w:rtl w:val="0"/>
               </w:rPr>
               <w:t xml:space="preserve"> </w:t>
@@ -12870,8 +12844,8 @@
             <w:r>
               <w:rPr>
                 <w:rtl w:val="0"/>
-                <w:sz w:val="14"/>
-                <w:szCs w:val="14"/>
+                <w:sz w:val="18"/>
+                <w:szCs w:val="18"/>
                 <w:rFonts w:ascii="Georgia" w:hAnsi="Georgia"/>
               </w:rPr>
             </w:r>
@@ -12881,15 +12855,15 @@
           <w:tcPr/>
           <w:p>
             <w:pPr>
-              <w:spacing w:before="0" w:after="40" w:line="200" w:lineRule="auto"/>
+              <w:spacing w:before="0" w:after="0" w:line="240" w:lineRule="auto"/>
               <w:jc w:val="left"/>
               <w:rPr/>
             </w:pPr>
             <w:r>
               <w:rPr>
                 <w:rFonts w:ascii="Georgia" w:cs="Georgia" w:eastAsia="Georgia" w:hAnsi="Georgia"/>
-                <w:sz w:val="14"/>
-                <w:szCs w:val="14"/>
+                <w:sz w:val="18"/>
+                <w:szCs w:val="18"/>
                 <w:rtl w:val="0"/>
               </w:rPr>
               <w:t xml:space="preserve"> </w:t>
@@ -12897,8 +12871,8 @@
             <w:r>
               <w:rPr>
                 <w:rtl w:val="0"/>
-                <w:sz w:val="14"/>
-                <w:szCs w:val="14"/>
+                <w:sz w:val="18"/>
+                <w:szCs w:val="18"/>
                 <w:rFonts w:ascii="Georgia" w:hAnsi="Georgia"/>
               </w:rPr>
             </w:r>
@@ -12908,15 +12882,15 @@
           <w:tcPr/>
           <w:p>
             <w:pPr>
-              <w:spacing w:before="0" w:after="40" w:line="200" w:lineRule="auto"/>
+              <w:spacing w:before="0" w:after="0" w:line="240" w:lineRule="auto"/>
               <w:jc w:val="left"/>
               <w:rPr/>
             </w:pPr>
             <w:r>
               <w:rPr>
                 <w:rFonts w:ascii="Georgia" w:cs="Georgia" w:eastAsia="Georgia" w:hAnsi="Georgia"/>
-                <w:sz w:val="14"/>
-                <w:szCs w:val="14"/>
+                <w:sz w:val="18"/>
+                <w:szCs w:val="18"/>
                 <w:rtl w:val="0"/>
               </w:rPr>
               <w:t xml:space="preserve"> </w:t>
@@ -12924,8 +12898,8 @@
             <w:r>
               <w:rPr>
                 <w:rtl w:val="0"/>
-                <w:sz w:val="14"/>
-                <w:szCs w:val="14"/>
+                <w:sz w:val="18"/>
+                <w:szCs w:val="18"/>
                 <w:rFonts w:ascii="Georgia" w:hAnsi="Georgia"/>
               </w:rPr>
             </w:r>
@@ -12935,15 +12909,15 @@
           <w:tcPr/>
           <w:p>
             <w:pPr>
-              <w:spacing w:before="0" w:after="40" w:line="200" w:lineRule="auto"/>
+              <w:spacing w:before="0" w:after="0" w:line="240" w:lineRule="auto"/>
               <w:jc w:val="left"/>
               <w:rPr/>
             </w:pPr>
             <w:r>
               <w:rPr>
                 <w:rFonts w:ascii="Georgia" w:cs="Georgia" w:eastAsia="Georgia" w:hAnsi="Georgia"/>
-                <w:sz w:val="14"/>
-                <w:szCs w:val="14"/>
+                <w:sz w:val="18"/>
+                <w:szCs w:val="18"/>
                 <w:rtl w:val="0"/>
               </w:rPr>
               <w:t xml:space="preserve"> </w:t>
@@ -12951,8 +12925,8 @@
             <w:r>
               <w:rPr>
                 <w:rtl w:val="0"/>
-                <w:sz w:val="14"/>
-                <w:szCs w:val="14"/>
+                <w:sz w:val="18"/>
+                <w:szCs w:val="18"/>
                 <w:rFonts w:ascii="Georgia" w:hAnsi="Georgia"/>
               </w:rPr>
             </w:r>
@@ -12961,14 +12935,8 @@
       </w:tr>
     </w:tbl>
     <w:p>
-      <w:pPr>
-        <w:spacing w:before="0" w:after="40" w:line="200" w:lineRule="auto"/>
-      </w:pPr>
-      <w:r>
-        <w:rPr>
-          <w:sz w:val="16"/>
-          <w:szCs w:val="16"/>
-        </w:rPr>
+      <w:pPr/>
+      <w:r>
         <w:br w:type="page"/>
       </w:r>
     </w:p>

</xml_diff>

<commit_message>
Draft_014: pure position move of Legend/Coding — zero format changes
QR left alone. Legend + Combined + Coding Sheet moved after QR with
page breaks. No spacing, font, or style changes on moved content.
Last optional table spills to following page by ~1 table height.
</commit_message>
<xml_diff>
--- a/thesis/003_ThesisProposal_Draft_014.docx
+++ b/thesis/003_ThesisProposal_Draft_014.docx
@@ -10464,7 +10464,7 @@
     <w:p>
       <w:pPr>
         <w:keepNext w:val="1"/>
-        <w:spacing w:before="0" w:after="60" w:line="240" w:lineRule="auto"/>
+        <w:spacing w:before="240" w:after="0" w:line="480" w:lineRule="auto"/>
         <w:jc w:val="left"/>
         <w:rPr/>
       </w:pPr>
@@ -10491,7 +10491,7 @@
       <w:pPr>
         <w:keepNext w:val="1"/>
         <w:keepLines w:val="1"/>
-        <w:spacing w:before="0" w:after="60" w:line="240" w:lineRule="auto"/>
+        <w:spacing w:before="0" w:after="0" w:line="360" w:lineRule="auto"/>
         <w:ind w:firstLine="720"/>
         <w:jc w:val="both"/>
         <w:rPr/>
@@ -11055,7 +11055,7 @@
     <w:p>
       <w:pPr>
         <w:keepNext w:val="1"/>
-        <w:spacing w:before="0" w:after="60" w:line="240" w:lineRule="auto"/>
+        <w:spacing w:before="240" w:after="0" w:line="480" w:lineRule="auto"/>
         <w:jc w:val="left"/>
         <w:rPr/>
       </w:pPr>
@@ -11080,7 +11080,7 @@
     </w:p>
     <w:p>
       <w:pPr>
-        <w:spacing w:before="0" w:after="60" w:line="240" w:lineRule="auto"/>
+        <w:spacing w:before="0" w:after="0" w:line="360" w:lineRule="auto"/>
         <w:ind w:firstLine="720"/>
         <w:jc w:val="both"/>
         <w:rPr/>
@@ -11343,7 +11343,7 @@
     </w:p>
     <w:p>
       <w:pPr>
-        <w:spacing w:before="0" w:after="60" w:line="240" w:lineRule="auto"/>
+        <w:spacing w:before="0" w:after="0" w:line="360" w:lineRule="auto"/>
         <w:ind w:firstLine="720"/>
         <w:jc w:val="both"/>
         <w:rPr/>
@@ -11380,7 +11380,7 @@
     <w:p>
       <w:pPr>
         <w:keepNext w:val="1"/>
-        <w:spacing w:before="0" w:after="60" w:line="240" w:lineRule="auto"/>
+        <w:spacing w:before="120" w:after="0" w:line="360" w:lineRule="auto"/>
         <w:jc w:val="left"/>
         <w:rPr/>
       </w:pPr>
@@ -11407,7 +11407,7 @@
       <w:pPr>
         <w:keepNext w:val="1"/>
         <w:keepLines w:val="1"/>
-        <w:spacing w:before="0" w:after="60" w:line="240" w:lineRule="auto"/>
+        <w:spacing w:before="0" w:after="0" w:line="360" w:lineRule="auto"/>
         <w:ind w:firstLine="720"/>
         <w:jc w:val="both"/>
         <w:rPr/>
@@ -11973,7 +11973,7 @@
     </w:tbl>
     <w:p>
       <w:pPr>
-        <w:spacing w:before="0" w:after="60" w:line="240" w:lineRule="auto"/>
+        <w:spacing w:before="240" w:after="0" w:line="480" w:lineRule="auto"/>
         <w:ind w:firstLine="720"/>
         <w:jc w:val="both"/>
         <w:rPr/>
@@ -12000,7 +12000,7 @@
     </w:p>
     <w:p>
       <w:pPr>
-        <w:spacing w:before="0" w:after="60" w:line="240" w:lineRule="auto"/>
+        <w:spacing w:before="0" w:after="0" w:line="360" w:lineRule="auto"/>
         <w:ind w:firstLine="720"/>
         <w:jc w:val="both"/>
         <w:rPr/>
@@ -12029,7 +12029,7 @@
       <w:pPr>
         <w:keepNext w:val="1"/>
         <w:keepLines w:val="1"/>
-        <w:spacing w:before="0" w:after="60" w:line="240" w:lineRule="auto"/>
+        <w:spacing w:before="120" w:after="0" w:line="360" w:lineRule="auto"/>
         <w:jc w:val="left"/>
         <w:rPr/>
       </w:pPr>
@@ -12469,7 +12469,7 @@
     <w:p>
       <w:pPr>
         <w:keepNext w:val="1"/>
-        <w:spacing w:before="0" w:after="60" w:line="240" w:lineRule="auto"/>
+        <w:spacing w:before="240" w:after="0" w:line="480" w:lineRule="auto"/>
         <w:jc w:val="left"/>
         <w:rPr/>
       </w:pPr>
@@ -12496,7 +12496,7 @@
       <w:pPr>
         <w:keepNext w:val="1"/>
         <w:keepLines w:val="1"/>
-        <w:spacing w:before="0" w:after="60" w:line="240" w:lineRule="auto"/>
+        <w:spacing w:before="0" w:after="0" w:line="360" w:lineRule="auto"/>
         <w:ind w:firstLine="720"/>
         <w:jc w:val="both"/>
         <w:rPr/>

</xml_diff>

<commit_message>
Draft_014: Legend/Coding block line spacing 1.2 so it fits one page
Only change on the moved block: line spacing set to 1.2.
Colors, highlights, tables unchanged. Full Codebook on next page.
</commit_message>
<xml_diff>
--- a/thesis/003_ThesisProposal_Draft_014.docx
+++ b/thesis/003_ThesisProposal_Draft_014.docx
@@ -10464,7 +10464,7 @@
     <w:p>
       <w:pPr>
         <w:keepNext w:val="1"/>
-        <w:spacing w:before="240" w:after="0" w:line="480" w:lineRule="auto"/>
+        <w:spacing w:before="60" w:after="0" w:line="288" w:lineRule="auto"/>
         <w:jc w:val="left"/>
         <w:rPr/>
       </w:pPr>
@@ -10491,7 +10491,7 @@
       <w:pPr>
         <w:keepNext w:val="1"/>
         <w:keepLines w:val="1"/>
-        <w:spacing w:before="0" w:after="0" w:line="360" w:lineRule="auto"/>
+        <w:spacing w:before="0" w:after="0" w:line="288" w:lineRule="auto"/>
         <w:ind w:firstLine="720"/>
         <w:jc w:val="both"/>
         <w:rPr/>
@@ -10556,7 +10556,7 @@
           </w:tcPr>
           <w:p>
             <w:pPr>
-              <w:spacing w:before="0" w:after="0" w:line="240" w:lineRule="auto"/>
+              <w:spacing w:before="0" w:after="0" w:line="288" w:lineRule="auto"/>
               <w:jc w:val="both"/>
               <w:rPr/>
             </w:pPr>
@@ -10590,7 +10590,7 @@
           </w:tcPr>
           <w:p>
             <w:pPr>
-              <w:spacing w:before="0" w:after="0" w:line="240" w:lineRule="auto"/>
+              <w:spacing w:before="0" w:after="0" w:line="288" w:lineRule="auto"/>
               <w:jc w:val="both"/>
               <w:rPr/>
             </w:pPr>
@@ -10625,7 +10625,7 @@
           <w:tcPr/>
           <w:p>
             <w:pPr>
-              <w:spacing w:before="0" w:after="0" w:line="240" w:lineRule="auto"/>
+              <w:spacing w:before="0" w:after="0" w:line="288" w:lineRule="auto"/>
               <w:jc w:val="both"/>
               <w:rPr/>
             </w:pPr>
@@ -10664,7 +10664,7 @@
           </w:p>
           <w:p>
             <w:pPr>
-              <w:spacing w:before="0" w:after="0" w:line="240" w:lineRule="auto"/>
+              <w:spacing w:before="0" w:after="0" w:line="288" w:lineRule="auto"/>
               <w:jc w:val="both"/>
               <w:rPr/>
             </w:pPr>
@@ -10703,7 +10703,7 @@
           </w:p>
           <w:p>
             <w:pPr>
-              <w:spacing w:before="0" w:after="0" w:line="240" w:lineRule="auto"/>
+              <w:spacing w:before="0" w:after="0" w:line="288" w:lineRule="auto"/>
               <w:jc w:val="both"/>
               <w:rPr/>
             </w:pPr>
@@ -10742,7 +10742,7 @@
           </w:p>
           <w:p>
             <w:pPr>
-              <w:spacing w:before="0" w:after="0" w:line="240" w:lineRule="auto"/>
+              <w:spacing w:before="0" w:after="0" w:line="288" w:lineRule="auto"/>
               <w:jc w:val="both"/>
               <w:rPr/>
             </w:pPr>
@@ -10784,7 +10784,7 @@
           <w:tcPr/>
           <w:p>
             <w:pPr>
-              <w:spacing w:before="0" w:after="0" w:line="240" w:lineRule="auto"/>
+              <w:spacing w:before="0" w:after="0" w:line="288" w:lineRule="auto"/>
               <w:jc w:val="both"/>
               <w:rPr/>
             </w:pPr>
@@ -10827,7 +10827,7 @@
           </w:p>
           <w:p>
             <w:pPr>
-              <w:spacing w:before="0" w:after="0" w:line="240" w:lineRule="auto"/>
+              <w:spacing w:before="0" w:after="0" w:line="288" w:lineRule="auto"/>
               <w:jc w:val="both"/>
               <w:rPr/>
             </w:pPr>
@@ -10870,7 +10870,7 @@
           </w:p>
           <w:p>
             <w:pPr>
-              <w:spacing w:before="0" w:after="0" w:line="240" w:lineRule="auto"/>
+              <w:spacing w:before="0" w:after="0" w:line="288" w:lineRule="auto"/>
               <w:jc w:val="both"/>
               <w:rPr/>
             </w:pPr>
@@ -10922,7 +10922,7 @@
           <w:tcPr/>
           <w:p>
             <w:pPr>
-              <w:spacing w:before="0" w:after="0" w:line="240" w:lineRule="auto"/>
+              <w:spacing w:before="0" w:after="0" w:line="288" w:lineRule="auto"/>
               <w:jc w:val="both"/>
               <w:rPr/>
             </w:pPr>
@@ -10951,7 +10951,7 @@
           </w:p>
           <w:p>
             <w:pPr>
-              <w:spacing w:before="0" w:after="0" w:line="240" w:lineRule="auto"/>
+              <w:spacing w:before="0" w:after="0" w:line="288" w:lineRule="auto"/>
               <w:jc w:val="both"/>
               <w:rPr/>
             </w:pPr>
@@ -10993,7 +10993,7 @@
           <w:tcPr/>
           <w:p>
             <w:pPr>
-              <w:spacing w:before="0" w:after="0" w:line="240" w:lineRule="auto"/>
+              <w:spacing w:before="0" w:after="0" w:line="288" w:lineRule="auto"/>
               <w:jc w:val="both"/>
               <w:rPr/>
             </w:pPr>
@@ -11022,7 +11022,7 @@
           </w:p>
           <w:p>
             <w:pPr>
-              <w:spacing w:before="0" w:after="0" w:line="240" w:lineRule="auto"/>
+              <w:spacing w:before="0" w:after="0" w:line="288" w:lineRule="auto"/>
               <w:jc w:val="both"/>
               <w:rPr/>
             </w:pPr>
@@ -11055,7 +11055,7 @@
     <w:p>
       <w:pPr>
         <w:keepNext w:val="1"/>
-        <w:spacing w:before="240" w:after="0" w:line="480" w:lineRule="auto"/>
+        <w:spacing w:before="60" w:after="0" w:line="288" w:lineRule="auto"/>
         <w:jc w:val="left"/>
         <w:rPr/>
       </w:pPr>
@@ -11080,7 +11080,7 @@
     </w:p>
     <w:p>
       <w:pPr>
-        <w:spacing w:before="0" w:after="0" w:line="360" w:lineRule="auto"/>
+        <w:spacing w:before="0" w:after="0" w:line="288" w:lineRule="auto"/>
         <w:ind w:firstLine="720"/>
         <w:jc w:val="both"/>
         <w:rPr/>
@@ -11343,7 +11343,7 @@
     </w:p>
     <w:p>
       <w:pPr>
-        <w:spacing w:before="0" w:after="0" w:line="360" w:lineRule="auto"/>
+        <w:spacing w:before="0" w:after="0" w:line="288" w:lineRule="auto"/>
         <w:ind w:firstLine="720"/>
         <w:jc w:val="both"/>
         <w:rPr/>
@@ -11380,7 +11380,7 @@
     <w:p>
       <w:pPr>
         <w:keepNext w:val="1"/>
-        <w:spacing w:before="120" w:after="0" w:line="360" w:lineRule="auto"/>
+        <w:spacing w:before="120" w:after="0" w:line="288" w:lineRule="auto"/>
         <w:jc w:val="left"/>
         <w:rPr/>
       </w:pPr>
@@ -11407,7 +11407,7 @@
       <w:pPr>
         <w:keepNext w:val="1"/>
         <w:keepLines w:val="1"/>
-        <w:spacing w:before="0" w:after="0" w:line="360" w:lineRule="auto"/>
+        <w:spacing w:before="0" w:after="0" w:line="288" w:lineRule="auto"/>
         <w:ind w:firstLine="720"/>
         <w:jc w:val="both"/>
         <w:rPr/>
@@ -11484,7 +11484,7 @@
           </w:tcPr>
           <w:p>
             <w:pPr>
-              <w:spacing w:before="0" w:after="0" w:line="240" w:lineRule="auto"/>
+              <w:spacing w:before="0" w:after="0" w:line="288" w:lineRule="auto"/>
               <w:jc w:val="both"/>
               <w:rPr/>
             </w:pPr>
@@ -11518,7 +11518,7 @@
           </w:tcPr>
           <w:p>
             <w:pPr>
-              <w:spacing w:before="0" w:after="0" w:line="240" w:lineRule="auto"/>
+              <w:spacing w:before="0" w:after="0" w:line="288" w:lineRule="auto"/>
               <w:jc w:val="both"/>
               <w:rPr/>
             </w:pPr>
@@ -11552,7 +11552,7 @@
           </w:tcPr>
           <w:p>
             <w:pPr>
-              <w:spacing w:before="0" w:after="0" w:line="240" w:lineRule="auto"/>
+              <w:spacing w:before="0" w:after="0" w:line="288" w:lineRule="auto"/>
               <w:jc w:val="both"/>
               <w:rPr/>
             </w:pPr>
@@ -11586,7 +11586,7 @@
           </w:tcPr>
           <w:p>
             <w:pPr>
-              <w:spacing w:before="0" w:after="0" w:line="240" w:lineRule="auto"/>
+              <w:spacing w:before="0" w:after="0" w:line="288" w:lineRule="auto"/>
               <w:jc w:val="both"/>
               <w:rPr/>
             </w:pPr>
@@ -11620,7 +11620,7 @@
           </w:tcPr>
           <w:p>
             <w:pPr>
-              <w:spacing w:before="0" w:after="0" w:line="240" w:lineRule="auto"/>
+              <w:spacing w:before="0" w:after="0" w:line="288" w:lineRule="auto"/>
               <w:jc w:val="both"/>
               <w:rPr/>
             </w:pPr>
@@ -11654,7 +11654,7 @@
           </w:tcPr>
           <w:p>
             <w:pPr>
-              <w:spacing w:before="0" w:after="0" w:line="240" w:lineRule="auto"/>
+              <w:spacing w:before="0" w:after="0" w:line="288" w:lineRule="auto"/>
               <w:jc w:val="both"/>
               <w:rPr/>
             </w:pPr>
@@ -11688,7 +11688,7 @@
           </w:tcPr>
           <w:p>
             <w:pPr>
-              <w:spacing w:before="0" w:after="0" w:line="240" w:lineRule="auto"/>
+              <w:spacing w:before="0" w:after="0" w:line="288" w:lineRule="auto"/>
               <w:jc w:val="both"/>
               <w:rPr/>
             </w:pPr>
@@ -11722,7 +11722,7 @@
           </w:tcPr>
           <w:p>
             <w:pPr>
-              <w:spacing w:before="0" w:after="0" w:line="240" w:lineRule="auto"/>
+              <w:spacing w:before="0" w:after="0" w:line="288" w:lineRule="auto"/>
               <w:jc w:val="both"/>
               <w:rPr/>
             </w:pPr>
@@ -11757,7 +11757,7 @@
           <w:tcPr/>
           <w:p>
             <w:pPr>
-              <w:spacing w:before="0" w:after="0" w:line="240" w:lineRule="auto"/>
+              <w:spacing w:before="0" w:after="0" w:line="288" w:lineRule="auto"/>
               <w:jc w:val="left"/>
               <w:rPr/>
             </w:pPr>
@@ -11784,7 +11784,7 @@
           <w:tcPr/>
           <w:p>
             <w:pPr>
-              <w:spacing w:before="0" w:after="0" w:line="240" w:lineRule="auto"/>
+              <w:spacing w:before="0" w:after="0" w:line="288" w:lineRule="auto"/>
               <w:jc w:val="left"/>
               <w:rPr/>
             </w:pPr>
@@ -11811,7 +11811,7 @@
           <w:tcPr/>
           <w:p>
             <w:pPr>
-              <w:spacing w:before="0" w:after="0" w:line="240" w:lineRule="auto"/>
+              <w:spacing w:before="0" w:after="0" w:line="288" w:lineRule="auto"/>
               <w:jc w:val="left"/>
               <w:rPr/>
             </w:pPr>
@@ -11838,7 +11838,7 @@
           <w:tcPr/>
           <w:p>
             <w:pPr>
-              <w:spacing w:before="0" w:after="0" w:line="240" w:lineRule="auto"/>
+              <w:spacing w:before="0" w:after="0" w:line="288" w:lineRule="auto"/>
               <w:jc w:val="left"/>
               <w:rPr/>
             </w:pPr>
@@ -11865,7 +11865,7 @@
           <w:tcPr/>
           <w:p>
             <w:pPr>
-              <w:spacing w:before="0" w:after="0" w:line="240" w:lineRule="auto"/>
+              <w:spacing w:before="0" w:after="0" w:line="288" w:lineRule="auto"/>
               <w:jc w:val="left"/>
               <w:rPr/>
             </w:pPr>
@@ -11892,7 +11892,7 @@
           <w:tcPr/>
           <w:p>
             <w:pPr>
-              <w:spacing w:before="0" w:after="0" w:line="240" w:lineRule="auto"/>
+              <w:spacing w:before="0" w:after="0" w:line="288" w:lineRule="auto"/>
               <w:jc w:val="left"/>
               <w:rPr/>
             </w:pPr>
@@ -11919,7 +11919,7 @@
           <w:tcPr/>
           <w:p>
             <w:pPr>
-              <w:spacing w:before="0" w:after="0" w:line="240" w:lineRule="auto"/>
+              <w:spacing w:before="0" w:after="0" w:line="288" w:lineRule="auto"/>
               <w:jc w:val="left"/>
               <w:rPr/>
             </w:pPr>
@@ -11946,7 +11946,7 @@
           <w:tcPr/>
           <w:p>
             <w:pPr>
-              <w:spacing w:before="0" w:after="0" w:line="240" w:lineRule="auto"/>
+              <w:spacing w:before="0" w:after="0" w:line="288" w:lineRule="auto"/>
               <w:jc w:val="left"/>
               <w:rPr/>
             </w:pPr>
@@ -11973,7 +11973,7 @@
     </w:tbl>
     <w:p>
       <w:pPr>
-        <w:spacing w:before="240" w:after="0" w:line="480" w:lineRule="auto"/>
+        <w:spacing w:before="60" w:after="0" w:line="288" w:lineRule="auto"/>
         <w:ind w:firstLine="720"/>
         <w:jc w:val="both"/>
         <w:rPr/>
@@ -12000,7 +12000,7 @@
     </w:p>
     <w:p>
       <w:pPr>
-        <w:spacing w:before="0" w:after="0" w:line="360" w:lineRule="auto"/>
+        <w:spacing w:before="0" w:after="0" w:line="288" w:lineRule="auto"/>
         <w:ind w:firstLine="720"/>
         <w:jc w:val="both"/>
         <w:rPr/>
@@ -12029,7 +12029,7 @@
       <w:pPr>
         <w:keepNext w:val="1"/>
         <w:keepLines w:val="1"/>
-        <w:spacing w:before="120" w:after="0" w:line="360" w:lineRule="auto"/>
+        <w:spacing w:before="120" w:after="0" w:line="288" w:lineRule="auto"/>
         <w:jc w:val="left"/>
         <w:rPr/>
       </w:pPr>
@@ -12101,7 +12101,7 @@
           </w:tcPr>
           <w:p>
             <w:pPr>
-              <w:spacing w:before="0" w:after="0" w:line="240" w:lineRule="auto"/>
+              <w:spacing w:before="0" w:after="0" w:line="288" w:lineRule="auto"/>
               <w:jc w:val="both"/>
               <w:rPr/>
             </w:pPr>
@@ -12135,7 +12135,7 @@
           </w:tcPr>
           <w:p>
             <w:pPr>
-              <w:spacing w:before="0" w:after="0" w:line="240" w:lineRule="auto"/>
+              <w:spacing w:before="0" w:after="0" w:line="288" w:lineRule="auto"/>
               <w:jc w:val="both"/>
               <w:rPr/>
             </w:pPr>
@@ -12169,7 +12169,7 @@
           </w:tcPr>
           <w:p>
             <w:pPr>
-              <w:spacing w:before="0" w:after="0" w:line="240" w:lineRule="auto"/>
+              <w:spacing w:before="0" w:after="0" w:line="288" w:lineRule="auto"/>
               <w:jc w:val="both"/>
               <w:rPr/>
             </w:pPr>
@@ -12203,7 +12203,7 @@
           </w:tcPr>
           <w:p>
             <w:pPr>
-              <w:spacing w:before="0" w:after="0" w:line="240" w:lineRule="auto"/>
+              <w:spacing w:before="0" w:after="0" w:line="288" w:lineRule="auto"/>
               <w:jc w:val="both"/>
               <w:rPr/>
             </w:pPr>
@@ -12237,7 +12237,7 @@
           </w:tcPr>
           <w:p>
             <w:pPr>
-              <w:spacing w:before="0" w:after="0" w:line="240" w:lineRule="auto"/>
+              <w:spacing w:before="0" w:after="0" w:line="288" w:lineRule="auto"/>
               <w:jc w:val="both"/>
               <w:rPr/>
             </w:pPr>
@@ -12271,7 +12271,7 @@
           </w:tcPr>
           <w:p>
             <w:pPr>
-              <w:spacing w:before="0" w:after="0" w:line="240" w:lineRule="auto"/>
+              <w:spacing w:before="0" w:after="0" w:line="288" w:lineRule="auto"/>
               <w:jc w:val="both"/>
               <w:rPr/>
             </w:pPr>
@@ -12306,7 +12306,7 @@
           <w:tcPr/>
           <w:p>
             <w:pPr>
-              <w:spacing w:before="0" w:after="0" w:line="240" w:lineRule="auto"/>
+              <w:spacing w:before="0" w:after="0" w:line="288" w:lineRule="auto"/>
               <w:jc w:val="left"/>
               <w:rPr/>
             </w:pPr>
@@ -12333,7 +12333,7 @@
           <w:tcPr/>
           <w:p>
             <w:pPr>
-              <w:spacing w:before="0" w:after="0" w:line="240" w:lineRule="auto"/>
+              <w:spacing w:before="0" w:after="0" w:line="288" w:lineRule="auto"/>
               <w:jc w:val="left"/>
               <w:rPr/>
             </w:pPr>
@@ -12360,7 +12360,7 @@
           <w:tcPr/>
           <w:p>
             <w:pPr>
-              <w:spacing w:before="0" w:after="0" w:line="240" w:lineRule="auto"/>
+              <w:spacing w:before="0" w:after="0" w:line="288" w:lineRule="auto"/>
               <w:jc w:val="left"/>
               <w:rPr/>
             </w:pPr>
@@ -12387,7 +12387,7 @@
           <w:tcPr/>
           <w:p>
             <w:pPr>
-              <w:spacing w:before="0" w:after="0" w:line="240" w:lineRule="auto"/>
+              <w:spacing w:before="0" w:after="0" w:line="288" w:lineRule="auto"/>
               <w:jc w:val="left"/>
               <w:rPr/>
             </w:pPr>
@@ -12414,7 +12414,7 @@
           <w:tcPr/>
           <w:p>
             <w:pPr>
-              <w:spacing w:before="0" w:after="0" w:line="240" w:lineRule="auto"/>
+              <w:spacing w:before="0" w:after="0" w:line="288" w:lineRule="auto"/>
               <w:jc w:val="left"/>
               <w:rPr/>
             </w:pPr>
@@ -12441,7 +12441,7 @@
           <w:tcPr/>
           <w:p>
             <w:pPr>
-              <w:spacing w:before="0" w:after="0" w:line="240" w:lineRule="auto"/>
+              <w:spacing w:before="0" w:after="0" w:line="288" w:lineRule="auto"/>
               <w:jc w:val="left"/>
               <w:rPr/>
             </w:pPr>
@@ -12469,7 +12469,7 @@
     <w:p>
       <w:pPr>
         <w:keepNext w:val="1"/>
-        <w:spacing w:before="240" w:after="0" w:line="480" w:lineRule="auto"/>
+        <w:spacing w:before="60" w:after="0" w:line="288" w:lineRule="auto"/>
         <w:jc w:val="left"/>
         <w:rPr/>
       </w:pPr>
@@ -12496,7 +12496,7 @@
       <w:pPr>
         <w:keepNext w:val="1"/>
         <w:keepLines w:val="1"/>
-        <w:spacing w:before="0" w:after="0" w:line="360" w:lineRule="auto"/>
+        <w:spacing w:before="0" w:after="0" w:line="288" w:lineRule="auto"/>
         <w:ind w:firstLine="720"/>
         <w:jc w:val="both"/>
         <w:rPr/>
@@ -12569,7 +12569,7 @@
           </w:tcPr>
           <w:p>
             <w:pPr>
-              <w:spacing w:before="0" w:after="0" w:line="240" w:lineRule="auto"/>
+              <w:spacing w:before="0" w:after="0" w:line="288" w:lineRule="auto"/>
               <w:jc w:val="both"/>
               <w:rPr/>
             </w:pPr>
@@ -12603,7 +12603,7 @@
           </w:tcPr>
           <w:p>
             <w:pPr>
-              <w:spacing w:before="0" w:after="0" w:line="240" w:lineRule="auto"/>
+              <w:spacing w:before="0" w:after="0" w:line="288" w:lineRule="auto"/>
               <w:jc w:val="both"/>
               <w:rPr/>
             </w:pPr>
@@ -12637,7 +12637,7 @@
           </w:tcPr>
           <w:p>
             <w:pPr>
-              <w:spacing w:before="0" w:after="0" w:line="240" w:lineRule="auto"/>
+              <w:spacing w:before="0" w:after="0" w:line="288" w:lineRule="auto"/>
               <w:jc w:val="both"/>
               <w:rPr/>
             </w:pPr>
@@ -12671,7 +12671,7 @@
           </w:tcPr>
           <w:p>
             <w:pPr>
-              <w:spacing w:before="0" w:after="0" w:line="240" w:lineRule="auto"/>
+              <w:spacing w:before="0" w:after="0" w:line="288" w:lineRule="auto"/>
               <w:jc w:val="both"/>
               <w:rPr/>
             </w:pPr>
@@ -12705,7 +12705,7 @@
           </w:tcPr>
           <w:p>
             <w:pPr>
-              <w:spacing w:before="0" w:after="0" w:line="240" w:lineRule="auto"/>
+              <w:spacing w:before="0" w:after="0" w:line="288" w:lineRule="auto"/>
               <w:jc w:val="both"/>
               <w:rPr/>
             </w:pPr>
@@ -12739,7 +12739,7 @@
           </w:tcPr>
           <w:p>
             <w:pPr>
-              <w:spacing w:before="0" w:after="0" w:line="240" w:lineRule="auto"/>
+              <w:spacing w:before="0" w:after="0" w:line="288" w:lineRule="auto"/>
               <w:jc w:val="both"/>
               <w:rPr/>
             </w:pPr>
@@ -12774,7 +12774,7 @@
           <w:tcPr/>
           <w:p>
             <w:pPr>
-              <w:spacing w:before="0" w:after="0" w:line="240" w:lineRule="auto"/>
+              <w:spacing w:before="0" w:after="0" w:line="288" w:lineRule="auto"/>
               <w:jc w:val="left"/>
               <w:rPr/>
             </w:pPr>
@@ -12801,7 +12801,7 @@
           <w:tcPr/>
           <w:p>
             <w:pPr>
-              <w:spacing w:before="0" w:after="0" w:line="240" w:lineRule="auto"/>
+              <w:spacing w:before="0" w:after="0" w:line="288" w:lineRule="auto"/>
               <w:jc w:val="left"/>
               <w:rPr/>
             </w:pPr>
@@ -12828,7 +12828,7 @@
           <w:tcPr/>
           <w:p>
             <w:pPr>
-              <w:spacing w:before="0" w:after="0" w:line="240" w:lineRule="auto"/>
+              <w:spacing w:before="0" w:after="0" w:line="288" w:lineRule="auto"/>
               <w:jc w:val="left"/>
               <w:rPr/>
             </w:pPr>
@@ -12855,7 +12855,7 @@
           <w:tcPr/>
           <w:p>
             <w:pPr>
-              <w:spacing w:before="0" w:after="0" w:line="240" w:lineRule="auto"/>
+              <w:spacing w:before="0" w:after="0" w:line="288" w:lineRule="auto"/>
               <w:jc w:val="left"/>
               <w:rPr/>
             </w:pPr>
@@ -12882,7 +12882,7 @@
           <w:tcPr/>
           <w:p>
             <w:pPr>
-              <w:spacing w:before="0" w:after="0" w:line="240" w:lineRule="auto"/>
+              <w:spacing w:before="0" w:after="0" w:line="288" w:lineRule="auto"/>
               <w:jc w:val="left"/>
               <w:rPr/>
             </w:pPr>
@@ -12909,7 +12909,7 @@
           <w:tcPr/>
           <w:p>
             <w:pPr>
-              <w:spacing w:before="0" w:after="0" w:line="240" w:lineRule="auto"/>
+              <w:spacing w:before="0" w:after="0" w:line="288" w:lineRule="auto"/>
               <w:jc w:val="left"/>
               <w:rPr/>
             </w:pPr>
@@ -12935,7 +12935,9 @@
       </w:tr>
     </w:tbl>
     <w:p>
-      <w:pPr/>
+      <w:pPr>
+        <w:spacing w:line="288" w:lineRule="auto"/>
+      </w:pPr>
       <w:r>
         <w:br w:type="page"/>
       </w:r>

</xml_diff>

<commit_message>
Draft_014: Legend/Coding line spacing 1.3 (still fits one page)
Confirmed no spill at 1.3. Full Codebook remains on following page.
</commit_message>
<xml_diff>
--- a/thesis/003_ThesisProposal_Draft_014.docx
+++ b/thesis/003_ThesisProposal_Draft_014.docx
@@ -10464,7 +10464,7 @@
     <w:p>
       <w:pPr>
         <w:keepNext w:val="1"/>
-        <w:spacing w:before="60" w:after="0" w:line="288" w:lineRule="auto"/>
+        <w:spacing w:before="60" w:after="0" w:line="312" w:lineRule="auto"/>
         <w:jc w:val="left"/>
         <w:rPr/>
       </w:pPr>
@@ -10491,7 +10491,7 @@
       <w:pPr>
         <w:keepNext w:val="1"/>
         <w:keepLines w:val="1"/>
-        <w:spacing w:before="0" w:after="0" w:line="288" w:lineRule="auto"/>
+        <w:spacing w:before="0" w:after="0" w:line="312" w:lineRule="auto"/>
         <w:ind w:firstLine="720"/>
         <w:jc w:val="both"/>
         <w:rPr/>
@@ -10556,7 +10556,7 @@
           </w:tcPr>
           <w:p>
             <w:pPr>
-              <w:spacing w:before="0" w:after="0" w:line="288" w:lineRule="auto"/>
+              <w:spacing w:before="0" w:after="0" w:line="312" w:lineRule="auto"/>
               <w:jc w:val="both"/>
               <w:rPr/>
             </w:pPr>
@@ -10590,7 +10590,7 @@
           </w:tcPr>
           <w:p>
             <w:pPr>
-              <w:spacing w:before="0" w:after="0" w:line="288" w:lineRule="auto"/>
+              <w:spacing w:before="0" w:after="0" w:line="312" w:lineRule="auto"/>
               <w:jc w:val="both"/>
               <w:rPr/>
             </w:pPr>
@@ -10625,7 +10625,7 @@
           <w:tcPr/>
           <w:p>
             <w:pPr>
-              <w:spacing w:before="0" w:after="0" w:line="288" w:lineRule="auto"/>
+              <w:spacing w:before="0" w:after="0" w:line="312" w:lineRule="auto"/>
               <w:jc w:val="both"/>
               <w:rPr/>
             </w:pPr>
@@ -10664,7 +10664,7 @@
           </w:p>
           <w:p>
             <w:pPr>
-              <w:spacing w:before="0" w:after="0" w:line="288" w:lineRule="auto"/>
+              <w:spacing w:before="0" w:after="0" w:line="312" w:lineRule="auto"/>
               <w:jc w:val="both"/>
               <w:rPr/>
             </w:pPr>
@@ -10703,7 +10703,7 @@
           </w:p>
           <w:p>
             <w:pPr>
-              <w:spacing w:before="0" w:after="0" w:line="288" w:lineRule="auto"/>
+              <w:spacing w:before="0" w:after="0" w:line="312" w:lineRule="auto"/>
               <w:jc w:val="both"/>
               <w:rPr/>
             </w:pPr>
@@ -10742,7 +10742,7 @@
           </w:p>
           <w:p>
             <w:pPr>
-              <w:spacing w:before="0" w:after="0" w:line="288" w:lineRule="auto"/>
+              <w:spacing w:before="0" w:after="0" w:line="312" w:lineRule="auto"/>
               <w:jc w:val="both"/>
               <w:rPr/>
             </w:pPr>
@@ -10784,7 +10784,7 @@
           <w:tcPr/>
           <w:p>
             <w:pPr>
-              <w:spacing w:before="0" w:after="0" w:line="288" w:lineRule="auto"/>
+              <w:spacing w:before="0" w:after="0" w:line="312" w:lineRule="auto"/>
               <w:jc w:val="both"/>
               <w:rPr/>
             </w:pPr>
@@ -10827,7 +10827,7 @@
           </w:p>
           <w:p>
             <w:pPr>
-              <w:spacing w:before="0" w:after="0" w:line="288" w:lineRule="auto"/>
+              <w:spacing w:before="0" w:after="0" w:line="312" w:lineRule="auto"/>
               <w:jc w:val="both"/>
               <w:rPr/>
             </w:pPr>
@@ -10870,7 +10870,7 @@
           </w:p>
           <w:p>
             <w:pPr>
-              <w:spacing w:before="0" w:after="0" w:line="288" w:lineRule="auto"/>
+              <w:spacing w:before="0" w:after="0" w:line="312" w:lineRule="auto"/>
               <w:jc w:val="both"/>
               <w:rPr/>
             </w:pPr>
@@ -10922,7 +10922,7 @@
           <w:tcPr/>
           <w:p>
             <w:pPr>
-              <w:spacing w:before="0" w:after="0" w:line="288" w:lineRule="auto"/>
+              <w:spacing w:before="0" w:after="0" w:line="312" w:lineRule="auto"/>
               <w:jc w:val="both"/>
               <w:rPr/>
             </w:pPr>
@@ -10951,7 +10951,7 @@
           </w:p>
           <w:p>
             <w:pPr>
-              <w:spacing w:before="0" w:after="0" w:line="288" w:lineRule="auto"/>
+              <w:spacing w:before="0" w:after="0" w:line="312" w:lineRule="auto"/>
               <w:jc w:val="both"/>
               <w:rPr/>
             </w:pPr>
@@ -10993,7 +10993,7 @@
           <w:tcPr/>
           <w:p>
             <w:pPr>
-              <w:spacing w:before="0" w:after="0" w:line="288" w:lineRule="auto"/>
+              <w:spacing w:before="0" w:after="0" w:line="312" w:lineRule="auto"/>
               <w:jc w:val="both"/>
               <w:rPr/>
             </w:pPr>
@@ -11022,7 +11022,7 @@
           </w:p>
           <w:p>
             <w:pPr>
-              <w:spacing w:before="0" w:after="0" w:line="288" w:lineRule="auto"/>
+              <w:spacing w:before="0" w:after="0" w:line="312" w:lineRule="auto"/>
               <w:jc w:val="both"/>
               <w:rPr/>
             </w:pPr>
@@ -11055,7 +11055,7 @@
     <w:p>
       <w:pPr>
         <w:keepNext w:val="1"/>
-        <w:spacing w:before="60" w:after="0" w:line="288" w:lineRule="auto"/>
+        <w:spacing w:before="60" w:after="0" w:line="312" w:lineRule="auto"/>
         <w:jc w:val="left"/>
         <w:rPr/>
       </w:pPr>
@@ -11080,7 +11080,7 @@
     </w:p>
     <w:p>
       <w:pPr>
-        <w:spacing w:before="0" w:after="0" w:line="288" w:lineRule="auto"/>
+        <w:spacing w:before="0" w:after="0" w:line="312" w:lineRule="auto"/>
         <w:ind w:firstLine="720"/>
         <w:jc w:val="both"/>
         <w:rPr/>
@@ -11343,7 +11343,7 @@
     </w:p>
     <w:p>
       <w:pPr>
-        <w:spacing w:before="0" w:after="0" w:line="288" w:lineRule="auto"/>
+        <w:spacing w:before="0" w:after="0" w:line="312" w:lineRule="auto"/>
         <w:ind w:firstLine="720"/>
         <w:jc w:val="both"/>
         <w:rPr/>
@@ -11380,7 +11380,7 @@
     <w:p>
       <w:pPr>
         <w:keepNext w:val="1"/>
-        <w:spacing w:before="120" w:after="0" w:line="288" w:lineRule="auto"/>
+        <w:spacing w:before="120" w:after="0" w:line="312" w:lineRule="auto"/>
         <w:jc w:val="left"/>
         <w:rPr/>
       </w:pPr>
@@ -11407,7 +11407,7 @@
       <w:pPr>
         <w:keepNext w:val="1"/>
         <w:keepLines w:val="1"/>
-        <w:spacing w:before="0" w:after="0" w:line="288" w:lineRule="auto"/>
+        <w:spacing w:before="0" w:after="0" w:line="312" w:lineRule="auto"/>
         <w:ind w:firstLine="720"/>
         <w:jc w:val="both"/>
         <w:rPr/>
@@ -11484,7 +11484,7 @@
           </w:tcPr>
           <w:p>
             <w:pPr>
-              <w:spacing w:before="0" w:after="0" w:line="288" w:lineRule="auto"/>
+              <w:spacing w:before="0" w:after="0" w:line="312" w:lineRule="auto"/>
               <w:jc w:val="both"/>
               <w:rPr/>
             </w:pPr>
@@ -11518,7 +11518,7 @@
           </w:tcPr>
           <w:p>
             <w:pPr>
-              <w:spacing w:before="0" w:after="0" w:line="288" w:lineRule="auto"/>
+              <w:spacing w:before="0" w:after="0" w:line="312" w:lineRule="auto"/>
               <w:jc w:val="both"/>
               <w:rPr/>
             </w:pPr>
@@ -11552,7 +11552,7 @@
           </w:tcPr>
           <w:p>
             <w:pPr>
-              <w:spacing w:before="0" w:after="0" w:line="288" w:lineRule="auto"/>
+              <w:spacing w:before="0" w:after="0" w:line="312" w:lineRule="auto"/>
               <w:jc w:val="both"/>
               <w:rPr/>
             </w:pPr>
@@ -11586,7 +11586,7 @@
           </w:tcPr>
           <w:p>
             <w:pPr>
-              <w:spacing w:before="0" w:after="0" w:line="288" w:lineRule="auto"/>
+              <w:spacing w:before="0" w:after="0" w:line="312" w:lineRule="auto"/>
               <w:jc w:val="both"/>
               <w:rPr/>
             </w:pPr>
@@ -11620,7 +11620,7 @@
           </w:tcPr>
           <w:p>
             <w:pPr>
-              <w:spacing w:before="0" w:after="0" w:line="288" w:lineRule="auto"/>
+              <w:spacing w:before="0" w:after="0" w:line="312" w:lineRule="auto"/>
               <w:jc w:val="both"/>
               <w:rPr/>
             </w:pPr>
@@ -11654,7 +11654,7 @@
           </w:tcPr>
           <w:p>
             <w:pPr>
-              <w:spacing w:before="0" w:after="0" w:line="288" w:lineRule="auto"/>
+              <w:spacing w:before="0" w:after="0" w:line="312" w:lineRule="auto"/>
               <w:jc w:val="both"/>
               <w:rPr/>
             </w:pPr>
@@ -11688,7 +11688,7 @@
           </w:tcPr>
           <w:p>
             <w:pPr>
-              <w:spacing w:before="0" w:after="0" w:line="288" w:lineRule="auto"/>
+              <w:spacing w:before="0" w:after="0" w:line="312" w:lineRule="auto"/>
               <w:jc w:val="both"/>
               <w:rPr/>
             </w:pPr>
@@ -11722,7 +11722,7 @@
           </w:tcPr>
           <w:p>
             <w:pPr>
-              <w:spacing w:before="0" w:after="0" w:line="288" w:lineRule="auto"/>
+              <w:spacing w:before="0" w:after="0" w:line="312" w:lineRule="auto"/>
               <w:jc w:val="both"/>
               <w:rPr/>
             </w:pPr>
@@ -11757,7 +11757,7 @@
           <w:tcPr/>
           <w:p>
             <w:pPr>
-              <w:spacing w:before="0" w:after="0" w:line="288" w:lineRule="auto"/>
+              <w:spacing w:before="0" w:after="0" w:line="312" w:lineRule="auto"/>
               <w:jc w:val="left"/>
               <w:rPr/>
             </w:pPr>
@@ -11784,7 +11784,7 @@
           <w:tcPr/>
           <w:p>
             <w:pPr>
-              <w:spacing w:before="0" w:after="0" w:line="288" w:lineRule="auto"/>
+              <w:spacing w:before="0" w:after="0" w:line="312" w:lineRule="auto"/>
               <w:jc w:val="left"/>
               <w:rPr/>
             </w:pPr>
@@ -11811,7 +11811,7 @@
           <w:tcPr/>
           <w:p>
             <w:pPr>
-              <w:spacing w:before="0" w:after="0" w:line="288" w:lineRule="auto"/>
+              <w:spacing w:before="0" w:after="0" w:line="312" w:lineRule="auto"/>
               <w:jc w:val="left"/>
               <w:rPr/>
             </w:pPr>
@@ -11838,7 +11838,7 @@
           <w:tcPr/>
           <w:p>
             <w:pPr>
-              <w:spacing w:before="0" w:after="0" w:line="288" w:lineRule="auto"/>
+              <w:spacing w:before="0" w:after="0" w:line="312" w:lineRule="auto"/>
               <w:jc w:val="left"/>
               <w:rPr/>
             </w:pPr>
@@ -11865,7 +11865,7 @@
           <w:tcPr/>
           <w:p>
             <w:pPr>
-              <w:spacing w:before="0" w:after="0" w:line="288" w:lineRule="auto"/>
+              <w:spacing w:before="0" w:after="0" w:line="312" w:lineRule="auto"/>
               <w:jc w:val="left"/>
               <w:rPr/>
             </w:pPr>
@@ -11892,7 +11892,7 @@
           <w:tcPr/>
           <w:p>
             <w:pPr>
-              <w:spacing w:before="0" w:after="0" w:line="288" w:lineRule="auto"/>
+              <w:spacing w:before="0" w:after="0" w:line="312" w:lineRule="auto"/>
               <w:jc w:val="left"/>
               <w:rPr/>
             </w:pPr>
@@ -11919,7 +11919,7 @@
           <w:tcPr/>
           <w:p>
             <w:pPr>
-              <w:spacing w:before="0" w:after="0" w:line="288" w:lineRule="auto"/>
+              <w:spacing w:before="0" w:after="0" w:line="312" w:lineRule="auto"/>
               <w:jc w:val="left"/>
               <w:rPr/>
             </w:pPr>
@@ -11946,7 +11946,7 @@
           <w:tcPr/>
           <w:p>
             <w:pPr>
-              <w:spacing w:before="0" w:after="0" w:line="288" w:lineRule="auto"/>
+              <w:spacing w:before="0" w:after="0" w:line="312" w:lineRule="auto"/>
               <w:jc w:val="left"/>
               <w:rPr/>
             </w:pPr>
@@ -11973,7 +11973,7 @@
     </w:tbl>
     <w:p>
       <w:pPr>
-        <w:spacing w:before="60" w:after="0" w:line="288" w:lineRule="auto"/>
+        <w:spacing w:before="60" w:after="0" w:line="312" w:lineRule="auto"/>
         <w:ind w:firstLine="720"/>
         <w:jc w:val="both"/>
         <w:rPr/>
@@ -12000,7 +12000,7 @@
     </w:p>
     <w:p>
       <w:pPr>
-        <w:spacing w:before="0" w:after="0" w:line="288" w:lineRule="auto"/>
+        <w:spacing w:before="0" w:after="0" w:line="312" w:lineRule="auto"/>
         <w:ind w:firstLine="720"/>
         <w:jc w:val="both"/>
         <w:rPr/>
@@ -12029,7 +12029,7 @@
       <w:pPr>
         <w:keepNext w:val="1"/>
         <w:keepLines w:val="1"/>
-        <w:spacing w:before="120" w:after="0" w:line="288" w:lineRule="auto"/>
+        <w:spacing w:before="120" w:after="0" w:line="312" w:lineRule="auto"/>
         <w:jc w:val="left"/>
         <w:rPr/>
       </w:pPr>
@@ -12101,7 +12101,7 @@
           </w:tcPr>
           <w:p>
             <w:pPr>
-              <w:spacing w:before="0" w:after="0" w:line="288" w:lineRule="auto"/>
+              <w:spacing w:before="0" w:after="0" w:line="312" w:lineRule="auto"/>
               <w:jc w:val="both"/>
               <w:rPr/>
             </w:pPr>
@@ -12135,7 +12135,7 @@
           </w:tcPr>
           <w:p>
             <w:pPr>
-              <w:spacing w:before="0" w:after="0" w:line="288" w:lineRule="auto"/>
+              <w:spacing w:before="0" w:after="0" w:line="312" w:lineRule="auto"/>
               <w:jc w:val="both"/>
               <w:rPr/>
             </w:pPr>
@@ -12169,7 +12169,7 @@
           </w:tcPr>
           <w:p>
             <w:pPr>
-              <w:spacing w:before="0" w:after="0" w:line="288" w:lineRule="auto"/>
+              <w:spacing w:before="0" w:after="0" w:line="312" w:lineRule="auto"/>
               <w:jc w:val="both"/>
               <w:rPr/>
             </w:pPr>
@@ -12203,7 +12203,7 @@
           </w:tcPr>
           <w:p>
             <w:pPr>
-              <w:spacing w:before="0" w:after="0" w:line="288" w:lineRule="auto"/>
+              <w:spacing w:before="0" w:after="0" w:line="312" w:lineRule="auto"/>
               <w:jc w:val="both"/>
               <w:rPr/>
             </w:pPr>
@@ -12237,7 +12237,7 @@
           </w:tcPr>
           <w:p>
             <w:pPr>
-              <w:spacing w:before="0" w:after="0" w:line="288" w:lineRule="auto"/>
+              <w:spacing w:before="0" w:after="0" w:line="312" w:lineRule="auto"/>
               <w:jc w:val="both"/>
               <w:rPr/>
             </w:pPr>
@@ -12271,7 +12271,7 @@
           </w:tcPr>
           <w:p>
             <w:pPr>
-              <w:spacing w:before="0" w:after="0" w:line="288" w:lineRule="auto"/>
+              <w:spacing w:before="0" w:after="0" w:line="312" w:lineRule="auto"/>
               <w:jc w:val="both"/>
               <w:rPr/>
             </w:pPr>
@@ -12306,7 +12306,7 @@
           <w:tcPr/>
           <w:p>
             <w:pPr>
-              <w:spacing w:before="0" w:after="0" w:line="288" w:lineRule="auto"/>
+              <w:spacing w:before="0" w:after="0" w:line="312" w:lineRule="auto"/>
               <w:jc w:val="left"/>
               <w:rPr/>
             </w:pPr>
@@ -12333,7 +12333,7 @@
           <w:tcPr/>
           <w:p>
             <w:pPr>
-              <w:spacing w:before="0" w:after="0" w:line="288" w:lineRule="auto"/>
+              <w:spacing w:before="0" w:after="0" w:line="312" w:lineRule="auto"/>
               <w:jc w:val="left"/>
               <w:rPr/>
             </w:pPr>
@@ -12360,7 +12360,7 @@
           <w:tcPr/>
           <w:p>
             <w:pPr>
-              <w:spacing w:before="0" w:after="0" w:line="288" w:lineRule="auto"/>
+              <w:spacing w:before="0" w:after="0" w:line="312" w:lineRule="auto"/>
               <w:jc w:val="left"/>
               <w:rPr/>
             </w:pPr>
@@ -12387,7 +12387,7 @@
           <w:tcPr/>
           <w:p>
             <w:pPr>
-              <w:spacing w:before="0" w:after="0" w:line="288" w:lineRule="auto"/>
+              <w:spacing w:before="0" w:after="0" w:line="312" w:lineRule="auto"/>
               <w:jc w:val="left"/>
               <w:rPr/>
             </w:pPr>
@@ -12414,7 +12414,7 @@
           <w:tcPr/>
           <w:p>
             <w:pPr>
-              <w:spacing w:before="0" w:after="0" w:line="288" w:lineRule="auto"/>
+              <w:spacing w:before="0" w:after="0" w:line="312" w:lineRule="auto"/>
               <w:jc w:val="left"/>
               <w:rPr/>
             </w:pPr>
@@ -12441,7 +12441,7 @@
           <w:tcPr/>
           <w:p>
             <w:pPr>
-              <w:spacing w:before="0" w:after="0" w:line="288" w:lineRule="auto"/>
+              <w:spacing w:before="0" w:after="0" w:line="312" w:lineRule="auto"/>
               <w:jc w:val="left"/>
               <w:rPr/>
             </w:pPr>
@@ -12469,7 +12469,7 @@
     <w:p>
       <w:pPr>
         <w:keepNext w:val="1"/>
-        <w:spacing w:before="60" w:after="0" w:line="288" w:lineRule="auto"/>
+        <w:spacing w:before="60" w:after="0" w:line="312" w:lineRule="auto"/>
         <w:jc w:val="left"/>
         <w:rPr/>
       </w:pPr>
@@ -12496,7 +12496,7 @@
       <w:pPr>
         <w:keepNext w:val="1"/>
         <w:keepLines w:val="1"/>
-        <w:spacing w:before="0" w:after="0" w:line="288" w:lineRule="auto"/>
+        <w:spacing w:before="0" w:after="0" w:line="312" w:lineRule="auto"/>
         <w:ind w:firstLine="720"/>
         <w:jc w:val="both"/>
         <w:rPr/>
@@ -12569,7 +12569,7 @@
           </w:tcPr>
           <w:p>
             <w:pPr>
-              <w:spacing w:before="0" w:after="0" w:line="288" w:lineRule="auto"/>
+              <w:spacing w:before="0" w:after="0" w:line="312" w:lineRule="auto"/>
               <w:jc w:val="both"/>
               <w:rPr/>
             </w:pPr>
@@ -12603,7 +12603,7 @@
           </w:tcPr>
           <w:p>
             <w:pPr>
-              <w:spacing w:before="0" w:after="0" w:line="288" w:lineRule="auto"/>
+              <w:spacing w:before="0" w:after="0" w:line="312" w:lineRule="auto"/>
               <w:jc w:val="both"/>
               <w:rPr/>
             </w:pPr>
@@ -12637,7 +12637,7 @@
           </w:tcPr>
           <w:p>
             <w:pPr>
-              <w:spacing w:before="0" w:after="0" w:line="288" w:lineRule="auto"/>
+              <w:spacing w:before="0" w:after="0" w:line="312" w:lineRule="auto"/>
               <w:jc w:val="both"/>
               <w:rPr/>
             </w:pPr>
@@ -12671,7 +12671,7 @@
           </w:tcPr>
           <w:p>
             <w:pPr>
-              <w:spacing w:before="0" w:after="0" w:line="288" w:lineRule="auto"/>
+              <w:spacing w:before="0" w:after="0" w:line="312" w:lineRule="auto"/>
               <w:jc w:val="both"/>
               <w:rPr/>
             </w:pPr>
@@ -12705,7 +12705,7 @@
           </w:tcPr>
           <w:p>
             <w:pPr>
-              <w:spacing w:before="0" w:after="0" w:line="288" w:lineRule="auto"/>
+              <w:spacing w:before="0" w:after="0" w:line="312" w:lineRule="auto"/>
               <w:jc w:val="both"/>
               <w:rPr/>
             </w:pPr>
@@ -12739,7 +12739,7 @@
           </w:tcPr>
           <w:p>
             <w:pPr>
-              <w:spacing w:before="0" w:after="0" w:line="288" w:lineRule="auto"/>
+              <w:spacing w:before="0" w:after="0" w:line="312" w:lineRule="auto"/>
               <w:jc w:val="both"/>
               <w:rPr/>
             </w:pPr>
@@ -12774,7 +12774,7 @@
           <w:tcPr/>
           <w:p>
             <w:pPr>
-              <w:spacing w:before="0" w:after="0" w:line="288" w:lineRule="auto"/>
+              <w:spacing w:before="0" w:after="0" w:line="312" w:lineRule="auto"/>
               <w:jc w:val="left"/>
               <w:rPr/>
             </w:pPr>
@@ -12801,7 +12801,7 @@
           <w:tcPr/>
           <w:p>
             <w:pPr>
-              <w:spacing w:before="0" w:after="0" w:line="288" w:lineRule="auto"/>
+              <w:spacing w:before="0" w:after="0" w:line="312" w:lineRule="auto"/>
               <w:jc w:val="left"/>
               <w:rPr/>
             </w:pPr>
@@ -12828,7 +12828,7 @@
           <w:tcPr/>
           <w:p>
             <w:pPr>
-              <w:spacing w:before="0" w:after="0" w:line="288" w:lineRule="auto"/>
+              <w:spacing w:before="0" w:after="0" w:line="312" w:lineRule="auto"/>
               <w:jc w:val="left"/>
               <w:rPr/>
             </w:pPr>
@@ -12855,7 +12855,7 @@
           <w:tcPr/>
           <w:p>
             <w:pPr>
-              <w:spacing w:before="0" w:after="0" w:line="288" w:lineRule="auto"/>
+              <w:spacing w:before="0" w:after="0" w:line="312" w:lineRule="auto"/>
               <w:jc w:val="left"/>
               <w:rPr/>
             </w:pPr>
@@ -12882,7 +12882,7 @@
           <w:tcPr/>
           <w:p>
             <w:pPr>
-              <w:spacing w:before="0" w:after="0" w:line="288" w:lineRule="auto"/>
+              <w:spacing w:before="0" w:after="0" w:line="312" w:lineRule="auto"/>
               <w:jc w:val="left"/>
               <w:rPr/>
             </w:pPr>
@@ -12909,7 +12909,7 @@
           <w:tcPr/>
           <w:p>
             <w:pPr>
-              <w:spacing w:before="0" w:after="0" w:line="288" w:lineRule="auto"/>
+              <w:spacing w:before="0" w:after="0" w:line="312" w:lineRule="auto"/>
               <w:jc w:val="left"/>
               <w:rPr/>
             </w:pPr>
@@ -12936,7 +12936,7 @@
     </w:tbl>
     <w:p>
       <w:pPr>
-        <w:spacing w:line="288" w:lineRule="auto"/>
+        <w:spacing w:line="312" w:lineRule="auto"/>
       </w:pPr>
       <w:r>
         <w:br w:type="page"/>

</xml_diff>